<commit_message>
docs: family template C (black/white/red) for RU+EN manuals
</commit_message>
<xml_diff>
--- a/docs/FLOMASTER_Manual_EN.docx
+++ b/docs/FLOMASTER_Manual_EN.docx
@@ -2,68 +2,154 @@
 <file path=word/document.xml><?xml version="1.0" encoding="utf-8"?>
 <w:document xmlns:wpc="http://schemas.microsoft.com/office/word/2010/wordprocessingCanvas" xmlns:mo="http://schemas.microsoft.com/office/mac/office/2008/main" xmlns:mc="http://schemas.openxmlformats.org/markup-compatibility/2006" xmlns:mv="urn:schemas-microsoft-com:mac:vml" xmlns:o="urn:schemas-microsoft-com:office:office" xmlns:r="http://schemas.openxmlformats.org/officeDocument/2006/relationships" xmlns:m="http://schemas.openxmlformats.org/officeDocument/2006/math" xmlns:v="urn:schemas-microsoft-com:vml" xmlns:wp14="http://schemas.microsoft.com/office/word/2010/wordprocessingDrawing" xmlns:wp="http://schemas.openxmlformats.org/drawingml/2006/wordprocessingDrawing" xmlns:w10="urn:schemas-microsoft-com:office:word" xmlns:w="http://schemas.openxmlformats.org/wordprocessingml/2006/main" xmlns:w14="http://schemas.microsoft.com/office/word/2010/wordml" xmlns:wpg="http://schemas.microsoft.com/office/word/2010/wordprocessingGroup" xmlns:wpi="http://schemas.microsoft.com/office/word/2010/wordprocessingInk" xmlns:wne="http://schemas.microsoft.com/office/word/2006/wordml" xmlns:wps="http://schemas.microsoft.com/office/word/2010/wordprocessingShape" mc:Ignorable="w14 wp14">
   <w:body>
+    <w:tbl>
+      <w:tblPr>
+        <w:tblW w:type="auto" w:w="0"/>
+        <w:tblLayout w:type="fixed"/>
+        <w:tblLook w:firstColumn="1" w:firstRow="1" w:lastColumn="0" w:lastRow="0" w:noHBand="0" w:noVBand="1" w:val="04A0"/>
+        <w:tblBorders>
+          <w:top w:val="none"/>
+          <w:left w:val="none"/>
+          <w:bottom w:val="none"/>
+          <w:right w:val="none"/>
+          <w:insideH w:val="none"/>
+          <w:insideV w:val="none"/>
+        </w:tblBorders>
+      </w:tblPr>
+      <w:tblGrid>
+        <w:gridCol w:w="11906"/>
+      </w:tblGrid>
+      <w:tr>
+        <w:trPr>
+          <w:trHeight w:val="16838" w:hRule="exact"/>
+        </w:trPr>
+        <w:tc>
+          <w:tcPr>
+            <w:tcW w:type="dxa" w:w="11906"/>
+            <w:shd w:val="clear" w:color="auto" w:fill="000000"/>
+            <w:vAlign w:val="center"/>
+          </w:tcPr>
+          <w:p/>
+          <w:p>
+            <w:pPr>
+              <w:spacing w:after="0"/>
+            </w:pPr>
+            <w:r>
+              <w:rPr>
+                <w:sz w:val="4"/>
+              </w:rPr>
+              <w:t xml:space="preserve"> </w:t>
+            </w:r>
+          </w:p>
+          <w:p>
+            <w:pPr>
+              <w:spacing w:after="320"/>
+              <w:jc w:val="center"/>
+            </w:pPr>
+            <w:r>
+              <w:rPr>
+                <w:rFonts w:ascii="Century Gothic" w:hAnsi="Century Gothic" w:cs="Century Gothic"/>
+                <w:b/>
+                <w:color w:val="FFFFFF"/>
+                <w:sz w:val="96"/>
+                <w:spacing w:val="60"/>
+              </w:rPr>
+              <w:t>FLOMASTER</w:t>
+            </w:r>
+          </w:p>
+          <w:p>
+            <w:pPr>
+              <w:spacing w:after="320"/>
+              <w:ind w:left="2948" w:right="2948"/>
+              <w:jc w:val="center"/>
+              <w:pBdr>
+                <w:bottom w:val="single" w:sz="18" w:space="1" w:color="C82823"/>
+              </w:pBdr>
+            </w:pPr>
+            <w:r>
+              <w:rPr>
+                <w:rFonts w:ascii="Arial" w:hAnsi="Arial" w:cs="Arial"/>
+                <w:b w:val="0"/>
+                <w:color w:val="1A1A1A"/>
+                <w:sz w:val="19"/>
+              </w:rPr>
+              <w:t xml:space="preserve"> </w:t>
+            </w:r>
+          </w:p>
+          <w:p>
+            <w:pPr>
+              <w:spacing w:after="80"/>
+              <w:jc w:val="center"/>
+            </w:pPr>
+            <w:r>
+              <w:rPr>
+                <w:rFonts w:ascii="Century Gothic" w:hAnsi="Century Gothic" w:cs="Century Gothic"/>
+                <w:b w:val="0"/>
+                <w:color w:val="9E9E9E"/>
+                <w:sz w:val="24"/>
+                <w:spacing w:val="80"/>
+              </w:rPr>
+              <w:t>USER GUIDE</w:t>
+            </w:r>
+          </w:p>
+          <w:p>
+            <w:pPr>
+              <w:jc w:val="center"/>
+            </w:pPr>
+            <w:r>
+              <w:rPr>
+                <w:rFonts w:ascii="Century Gothic" w:hAnsi="Century Gothic" w:cs="Century Gothic"/>
+                <w:b w:val="0"/>
+                <w:color w:val="9E9E9E"/>
+                <w:sz w:val="18"/>
+                <w:spacing w:val="60"/>
+              </w:rPr>
+              <w:t>V2.3  -  WINDOWS 10/11</w:t>
+            </w:r>
+          </w:p>
+          <w:p>
+            <w:pPr>
+              <w:spacing w:before="2200"/>
+            </w:pPr>
+            <w:r>
+              <w:t xml:space="preserve"> </w:t>
+            </w:r>
+          </w:p>
+          <w:p>
+            <w:pPr>
+              <w:jc w:val="center"/>
+            </w:pPr>
+            <w:r>
+              <w:rPr>
+                <w:rFonts w:ascii="Century Gothic" w:hAnsi="Century Gothic" w:cs="Century Gothic"/>
+                <w:b w:val="0"/>
+                <w:color w:val="9E9E9E"/>
+                <w:sz w:val="15"/>
+                <w:spacing w:val="60"/>
+              </w:rPr>
+              <w:t>GITHUB.COM/ABYRVALG379</w:t>
+            </w:r>
+          </w:p>
+        </w:tc>
+      </w:tr>
+    </w:tbl>
     <w:p>
       <w:pPr>
-        <w:spacing w:before="600" w:after="80"/>
-        <w:jc w:val="center"/>
+        <w:sectPr>
+          <w:footerReference w:type="default" r:id="rId9"/>
+          <w:pgSz w:w="11906" w:h="16838"/>
+          <w:pgMar w:top="0" w:right="0" w:bottom="0" w:left="0" w:header="0" w:footer="0" w:gutter="0"/>
+          <w:cols w:space="720"/>
+          <w:docGrid w:linePitch="360"/>
+        </w:sectPr>
       </w:pPr>
-      <w:r>
-        <w:rPr>
-          <w:rFonts w:ascii="Arial" w:hAnsi="Arial"/>
-          <w:b/>
-          <w:color w:val="E87D0D"/>
-          <w:sz w:val="60"/>
-        </w:rPr>
-        <w:t>FLOMASTER</w:t>
-      </w:r>
-    </w:p>
-    <w:p>
-      <w:pPr>
-        <w:spacing w:after="200"/>
-        <w:jc w:val="center"/>
-      </w:pPr>
-      <w:r>
-        <w:rPr>
-          <w:rFonts w:ascii="Arial" w:hAnsi="Arial"/>
-          <w:b/>
-          <w:color w:val="E87D0D"/>
-          <w:sz w:val="36"/>
-        </w:rPr>
-        <w:t>User Guide</w:t>
-      </w:r>
-    </w:p>
-    <w:p>
-      <w:pPr>
-        <w:spacing w:after="80"/>
-        <w:jc w:val="center"/>
-      </w:pPr>
-      <w:r>
-        <w:rPr>
-          <w:rFonts w:ascii="Arial" w:hAnsi="Arial"/>
-          <w:color w:val="555555"/>
-          <w:sz w:val="22"/>
-        </w:rPr>
-        <w:t>A single launch point for DCC applications under one OCIO config</w:t>
-      </w:r>
-    </w:p>
-    <w:p>
-      <w:pPr>
-        <w:spacing w:after="400"/>
-        <w:jc w:val="center"/>
-      </w:pPr>
-      <w:r>
-        <w:rPr>
-          <w:rFonts w:ascii="Arial" w:hAnsi="Arial"/>
-          <w:color w:val="555555"/>
-          <w:sz w:val="21"/>
-        </w:rPr>
-        <w:t>Version 2.3 - Windows 10/11</w:t>
-      </w:r>
     </w:p>
     <w:p>
       <w:r>
         <w:rPr>
           <w:rFonts w:ascii="Arial" w:hAnsi="Arial"/>
+          <w:i w:val="0"/>
+          <w:color w:val="1A1A1A"/>
           <w:sz w:val="19"/>
         </w:rPr>
         <w:t>FLOMASTER is a launcher for 3D graphics applications: one button starts Blender, Maya, Houdini, Nuke, DaVinci Resolve, Unreal Engine or Substance Painter with a predefined OCIO color config. The launcher finds installed applications automatically, keeps launch presets, opens project files and logs every launch. One color config - across all applications, with no manual environment setup.</w:t>
@@ -74,7 +160,7 @@
         <w:rPr>
           <w:rFonts w:ascii="Arial" w:hAnsi="Arial"/>
           <w:i/>
-          <w:color w:val="555555"/>
+          <w:color w:val="6E6E6E"/>
           <w:sz w:val="18"/>
         </w:rPr>
         <w:t>github.com/abyrvalg379/FLOMASTER</w:t>
@@ -83,10 +169,20 @@
     <w:p>
       <w:pPr>
         <w:pStyle w:val="Heading1"/>
+        <w:pBdr>
+          <w:left w:val="single" w:sz="24" w:space="8" w:color="C82823"/>
+        </w:pBdr>
       </w:pPr>
       <w:bookmarkStart w:id="100000" w:name="_Toc100000"/>
       <w:r>
-        <w:t>Contents</w:t>
+        <w:rPr>
+          <w:rFonts w:ascii="Century Gothic" w:hAnsi="Century Gothic"/>
+          <w:b/>
+          <w:color w:val="000000"/>
+          <w:sz w:val="30"/>
+          <w:spacing w:val="20"/>
+        </w:rPr>
+        <w:t>CONTENTS</w:t>
       </w:r>
       <w:bookmarkEnd w:id="100000"/>
     </w:p>
@@ -98,32 +194,15 @@
         </w:tabs>
         <w:spacing w:before="120" w:after="60"/>
       </w:pPr>
-      <w:hyperlink w:anchor="_Toc100001" w:history="1">
-        <w:r>
-          <w:rPr>
-            <w:rStyle w:val="Hyperlink"/>
-          </w:rPr>
-          <w:t>1. About FLOMASTER</w:t>
-        </w:r>
-        <w:r>
-          <w:tab/>
-        </w:r>
-        <w:r>
-          <w:fldChar w:fldCharType="begin"/>
-        </w:r>
-        <w:r>
-          <w:instrText xml:space="preserve"> PAGEREF _Toc100001 \h </w:instrText>
-        </w:r>
-        <w:r>
-          <w:fldChar w:fldCharType="separate"/>
-        </w:r>
-        <w:r>
-          <w:t>2</w:t>
-        </w:r>
-        <w:r>
-          <w:fldChar w:fldCharType="end"/>
-        </w:r>
-      </w:hyperlink>
+      <w:r>
+        <w:t>1. About FLOMASTER</w:t>
+      </w:r>
+      <w:r>
+        <w:tab/>
+      </w:r>
+      <w:r>
+        <w:t>3</w:t>
+      </w:r>
     </w:p>
     <w:p>
       <w:pPr>
@@ -133,32 +212,15 @@
         </w:tabs>
         <w:spacing w:before="120" w:after="60"/>
       </w:pPr>
-      <w:hyperlink w:anchor="_Toc100002" w:history="1">
-        <w:r>
-          <w:rPr>
-            <w:rStyle w:val="Hyperlink"/>
-          </w:rPr>
-          <w:t>2. Installation</w:t>
-        </w:r>
-        <w:r>
-          <w:tab/>
-        </w:r>
-        <w:r>
-          <w:fldChar w:fldCharType="begin"/>
-        </w:r>
-        <w:r>
-          <w:instrText xml:space="preserve"> PAGEREF _Toc100002 \h </w:instrText>
-        </w:r>
-        <w:r>
-          <w:fldChar w:fldCharType="separate"/>
-        </w:r>
-        <w:r>
-          <w:t>2</w:t>
-        </w:r>
-        <w:r>
-          <w:fldChar w:fldCharType="end"/>
-        </w:r>
-      </w:hyperlink>
+      <w:r>
+        <w:t>2. Installation</w:t>
+      </w:r>
+      <w:r>
+        <w:tab/>
+      </w:r>
+      <w:r>
+        <w:t>3</w:t>
+      </w:r>
     </w:p>
     <w:p>
       <w:pPr>
@@ -168,32 +230,15 @@
         </w:tabs>
         <w:spacing w:before="120" w:after="60"/>
       </w:pPr>
-      <w:hyperlink w:anchor="_Toc100003" w:history="1">
-        <w:r>
-          <w:rPr>
-            <w:rStyle w:val="Hyperlink"/>
-          </w:rPr>
-          <w:t>3. Quick start</w:t>
-        </w:r>
-        <w:r>
-          <w:tab/>
-        </w:r>
-        <w:r>
-          <w:fldChar w:fldCharType="begin"/>
-        </w:r>
-        <w:r>
-          <w:instrText xml:space="preserve"> PAGEREF _Toc100003 \h </w:instrText>
-        </w:r>
-        <w:r>
-          <w:fldChar w:fldCharType="separate"/>
-        </w:r>
-        <w:r>
-          <w:t>2</w:t>
-        </w:r>
-        <w:r>
-          <w:fldChar w:fldCharType="end"/>
-        </w:r>
-      </w:hyperlink>
+      <w:r>
+        <w:t>3. Quick start</w:t>
+      </w:r>
+      <w:r>
+        <w:tab/>
+      </w:r>
+      <w:r>
+        <w:t>3</w:t>
+      </w:r>
     </w:p>
     <w:p>
       <w:pPr>
@@ -203,32 +248,15 @@
         </w:tabs>
         <w:spacing w:before="120" w:after="60"/>
       </w:pPr>
-      <w:hyperlink w:anchor="_Toc100004" w:history="1">
-        <w:r>
-          <w:rPr>
-            <w:rStyle w:val="Hyperlink"/>
-          </w:rPr>
-          <w:t>4. Presets and auto-scan</w:t>
-        </w:r>
-        <w:r>
-          <w:tab/>
-        </w:r>
-        <w:r>
-          <w:fldChar w:fldCharType="begin"/>
-        </w:r>
-        <w:r>
-          <w:instrText xml:space="preserve"> PAGEREF _Toc100004 \h </w:instrText>
-        </w:r>
-        <w:r>
-          <w:fldChar w:fldCharType="separate"/>
-        </w:r>
-        <w:r>
-          <w:t>2</w:t>
-        </w:r>
-        <w:r>
-          <w:fldChar w:fldCharType="end"/>
-        </w:r>
-      </w:hyperlink>
+      <w:r>
+        <w:t>4. Presets and auto-scan</w:t>
+      </w:r>
+      <w:r>
+        <w:tab/>
+      </w:r>
+      <w:r>
+        <w:t>3</w:t>
+      </w:r>
     </w:p>
     <w:p>
       <w:pPr>
@@ -238,32 +266,15 @@
         </w:tabs>
         <w:spacing w:before="120" w:after="60"/>
       </w:pPr>
-      <w:hyperlink w:anchor="_Toc100007" w:history="1">
-        <w:r>
-          <w:rPr>
-            <w:rStyle w:val="Hyperlink"/>
-          </w:rPr>
-          <w:t>5. Project files</w:t>
-        </w:r>
-        <w:r>
-          <w:tab/>
-        </w:r>
-        <w:r>
-          <w:fldChar w:fldCharType="begin"/>
-        </w:r>
-        <w:r>
-          <w:instrText xml:space="preserve"> PAGEREF _Toc100007 \h </w:instrText>
-        </w:r>
-        <w:r>
-          <w:fldChar w:fldCharType="separate"/>
-        </w:r>
-        <w:r>
-          <w:t>3</w:t>
-        </w:r>
-        <w:r>
-          <w:fldChar w:fldCharType="end"/>
-        </w:r>
-      </w:hyperlink>
+      <w:r>
+        <w:t>5. Project files</w:t>
+      </w:r>
+      <w:r>
+        <w:tab/>
+      </w:r>
+      <w:r>
+        <w:t>4</w:t>
+      </w:r>
     </w:p>
     <w:p>
       <w:pPr>
@@ -273,32 +284,15 @@
         </w:tabs>
         <w:spacing w:before="120" w:after="60"/>
       </w:pPr>
-      <w:hyperlink w:anchor="_Toc100008" w:history="1">
-        <w:r>
-          <w:rPr>
-            <w:rStyle w:val="Hyperlink"/>
-          </w:rPr>
-          <w:t>6. How OCIO support works</w:t>
-        </w:r>
-        <w:r>
-          <w:tab/>
-        </w:r>
-        <w:r>
-          <w:fldChar w:fldCharType="begin"/>
-        </w:r>
-        <w:r>
-          <w:instrText xml:space="preserve"> PAGEREF _Toc100008 \h </w:instrText>
-        </w:r>
-        <w:r>
-          <w:fldChar w:fldCharType="separate"/>
-        </w:r>
-        <w:r>
-          <w:t>3</w:t>
-        </w:r>
-        <w:r>
-          <w:fldChar w:fldCharType="end"/>
-        </w:r>
-      </w:hyperlink>
+      <w:r>
+        <w:t>6. How OCIO support works</w:t>
+      </w:r>
+      <w:r>
+        <w:tab/>
+      </w:r>
+      <w:r>
+        <w:t>4</w:t>
+      </w:r>
     </w:p>
     <w:p>
       <w:pPr>
@@ -308,32 +302,15 @@
         </w:tabs>
         <w:spacing w:before="120" w:after="60"/>
       </w:pPr>
-      <w:hyperlink w:anchor="_Toc100009" w:history="1">
-        <w:r>
-          <w:rPr>
-            <w:rStyle w:val="Hyperlink"/>
-          </w:rPr>
-          <w:t>7. Themes</w:t>
-        </w:r>
-        <w:r>
-          <w:tab/>
-        </w:r>
-        <w:r>
-          <w:fldChar w:fldCharType="begin"/>
-        </w:r>
-        <w:r>
-          <w:instrText xml:space="preserve"> PAGEREF _Toc100009 \h </w:instrText>
-        </w:r>
-        <w:r>
-          <w:fldChar w:fldCharType="separate"/>
-        </w:r>
-        <w:r>
-          <w:t>3</w:t>
-        </w:r>
-        <w:r>
-          <w:fldChar w:fldCharType="end"/>
-        </w:r>
-      </w:hyperlink>
+      <w:r>
+        <w:t>7. Themes</w:t>
+      </w:r>
+      <w:r>
+        <w:tab/>
+      </w:r>
+      <w:r>
+        <w:t>4</w:t>
+      </w:r>
     </w:p>
     <w:p>
       <w:pPr>
@@ -343,32 +320,15 @@
         </w:tabs>
         <w:spacing w:before="120" w:after="60"/>
       </w:pPr>
-      <w:hyperlink w:anchor="_Toc100010" w:history="1">
-        <w:r>
-          <w:rPr>
-            <w:rStyle w:val="Hyperlink"/>
-          </w:rPr>
-          <w:t>8. Settings</w:t>
-        </w:r>
-        <w:r>
-          <w:tab/>
-        </w:r>
-        <w:r>
-          <w:fldChar w:fldCharType="begin"/>
-        </w:r>
-        <w:r>
-          <w:instrText xml:space="preserve"> PAGEREF _Toc100010 \h </w:instrText>
-        </w:r>
-        <w:r>
-          <w:fldChar w:fldCharType="separate"/>
-        </w:r>
-        <w:r>
-          <w:t>4</w:t>
-        </w:r>
-        <w:r>
-          <w:fldChar w:fldCharType="end"/>
-        </w:r>
-      </w:hyperlink>
+      <w:r>
+        <w:t>8. Settings</w:t>
+      </w:r>
+      <w:r>
+        <w:tab/>
+      </w:r>
+      <w:r>
+        <w:t>5</w:t>
+      </w:r>
     </w:p>
     <w:p>
       <w:pPr>
@@ -378,32 +338,15 @@
         </w:tabs>
         <w:spacing w:before="120" w:after="60"/>
       </w:pPr>
-      <w:hyperlink w:anchor="_Toc100011" w:history="1">
-        <w:r>
-          <w:rPr>
-            <w:rStyle w:val="Hyperlink"/>
-          </w:rPr>
-          <w:t>9. Tray and log</w:t>
-        </w:r>
-        <w:r>
-          <w:tab/>
-        </w:r>
-        <w:r>
-          <w:fldChar w:fldCharType="begin"/>
-        </w:r>
-        <w:r>
-          <w:instrText xml:space="preserve"> PAGEREF _Toc100011 \h </w:instrText>
-        </w:r>
-        <w:r>
-          <w:fldChar w:fldCharType="separate"/>
-        </w:r>
-        <w:r>
-          <w:t>4</w:t>
-        </w:r>
-        <w:r>
-          <w:fldChar w:fldCharType="end"/>
-        </w:r>
-      </w:hyperlink>
+      <w:r>
+        <w:t>9. Tray and log</w:t>
+      </w:r>
+      <w:r>
+        <w:tab/>
+      </w:r>
+      <w:r>
+        <w:t>5</w:t>
+      </w:r>
     </w:p>
     <w:p>
       <w:pPr>
@@ -413,32 +356,15 @@
         </w:tabs>
         <w:spacing w:before="120" w:after="60"/>
       </w:pPr>
-      <w:hyperlink w:anchor="_Toc100012" w:history="1">
-        <w:r>
-          <w:rPr>
-            <w:rStyle w:val="Hyperlink"/>
-          </w:rPr>
-          <w:t>10. Files and folders</w:t>
-        </w:r>
-        <w:r>
-          <w:tab/>
-        </w:r>
-        <w:r>
-          <w:fldChar w:fldCharType="begin"/>
-        </w:r>
-        <w:r>
-          <w:instrText xml:space="preserve"> PAGEREF _Toc100012 \h </w:instrText>
-        </w:r>
-        <w:r>
-          <w:fldChar w:fldCharType="separate"/>
-        </w:r>
-        <w:r>
-          <w:t>4</w:t>
-        </w:r>
-        <w:r>
-          <w:fldChar w:fldCharType="end"/>
-        </w:r>
-      </w:hyperlink>
+      <w:r>
+        <w:t>10. Files and folders</w:t>
+      </w:r>
+      <w:r>
+        <w:tab/>
+      </w:r>
+      <w:r>
+        <w:t>5</w:t>
+      </w:r>
     </w:p>
     <w:p>
       <w:pPr>
@@ -448,32 +374,15 @@
         </w:tabs>
         <w:spacing w:before="120" w:after="60"/>
       </w:pPr>
-      <w:hyperlink w:anchor="_Toc100013" w:history="1">
-        <w:r>
-          <w:rPr>
-            <w:rStyle w:val="Hyperlink"/>
-          </w:rPr>
-          <w:t>11. Workflows</w:t>
-        </w:r>
-        <w:r>
-          <w:tab/>
-        </w:r>
-        <w:r>
-          <w:fldChar w:fldCharType="begin"/>
-        </w:r>
-        <w:r>
-          <w:instrText xml:space="preserve"> PAGEREF _Toc100013 \h </w:instrText>
-        </w:r>
-        <w:r>
-          <w:fldChar w:fldCharType="separate"/>
-        </w:r>
-        <w:r>
-          <w:t>4</w:t>
-        </w:r>
-        <w:r>
-          <w:fldChar w:fldCharType="end"/>
-        </w:r>
-      </w:hyperlink>
+      <w:r>
+        <w:t>11. Workflows</w:t>
+      </w:r>
+      <w:r>
+        <w:tab/>
+      </w:r>
+      <w:r>
+        <w:t>5</w:t>
+      </w:r>
     </w:p>
     <w:p>
       <w:pPr>
@@ -483,32 +392,15 @@
         </w:tabs>
         <w:spacing w:before="120" w:after="60"/>
       </w:pPr>
-      <w:hyperlink w:anchor="_Toc100018" w:history="1">
-        <w:r>
-          <w:rPr>
-            <w:rStyle w:val="Hyperlink"/>
-          </w:rPr>
-          <w:t>12. Troubleshooting</w:t>
-        </w:r>
-        <w:r>
-          <w:tab/>
-        </w:r>
-        <w:r>
-          <w:fldChar w:fldCharType="begin"/>
-        </w:r>
-        <w:r>
-          <w:instrText xml:space="preserve"> PAGEREF _Toc100018 \h </w:instrText>
-        </w:r>
-        <w:r>
-          <w:fldChar w:fldCharType="separate"/>
-        </w:r>
-        <w:r>
-          <w:t>5</w:t>
-        </w:r>
-        <w:r>
-          <w:fldChar w:fldCharType="end"/>
-        </w:r>
-      </w:hyperlink>
+      <w:r>
+        <w:t>12. Troubleshooting</w:t>
+      </w:r>
+      <w:r>
+        <w:tab/>
+      </w:r>
+      <w:r>
+        <w:t>6</w:t>
+      </w:r>
     </w:p>
     <w:p>
       <w:r>
@@ -528,10 +420,29 @@
     <w:p>
       <w:pPr>
         <w:pStyle w:val="Heading1"/>
+        <w:pBdr>
+          <w:left w:val="single" w:sz="24" w:space="8" w:color="C82823"/>
+        </w:pBdr>
       </w:pPr>
       <w:bookmarkStart w:id="100001" w:name="_Toc100001"/>
       <w:r>
-        <w:t>1. About FLOMASTER</w:t>
+        <w:rPr>
+          <w:rFonts w:ascii="Century Gothic" w:hAnsi="Century Gothic"/>
+          <w:b/>
+          <w:color w:val="000000"/>
+          <w:sz w:val="30"/>
+        </w:rPr>
+        <w:t xml:space="preserve">1. </w:t>
+      </w:r>
+      <w:r>
+        <w:rPr>
+          <w:rFonts w:ascii="Century Gothic" w:hAnsi="Century Gothic"/>
+          <w:b/>
+          <w:color w:val="000000"/>
+          <w:sz w:val="30"/>
+          <w:spacing w:val="20"/>
+        </w:rPr>
+        <w:t>ABOUT FLOMASTER</w:t>
       </w:r>
       <w:bookmarkEnd w:id="100001"/>
     </w:p>
@@ -539,6 +450,8 @@
       <w:r>
         <w:rPr>
           <w:rFonts w:ascii="Arial" w:hAnsi="Arial"/>
+          <w:i w:val="0"/>
+          <w:color w:val="1A1A1A"/>
           <w:sz w:val="19"/>
         </w:rPr>
         <w:t>Key features:</w:t>
@@ -551,6 +464,8 @@
       <w:r>
         <w:rPr>
           <w:rFonts w:ascii="Arial" w:hAnsi="Arial"/>
+          <w:i w:val="0"/>
+          <w:color w:val="1A1A1A"/>
           <w:sz w:val="19"/>
         </w:rPr>
         <w:t>auto-scan of installed applications: Blender, K-Cycles, Maya, Houdini, Nuke, DaVinci Resolve, Unreal Engine, Substance Painter;</w:t>
@@ -563,6 +478,8 @@
       <w:r>
         <w:rPr>
           <w:rFonts w:ascii="Arial" w:hAnsi="Arial"/>
+          <w:i w:val="0"/>
+          <w:color w:val="1A1A1A"/>
           <w:sz w:val="19"/>
         </w:rPr>
         <w:t>launch presets: your own name, exe and launch arguments;</w:t>
@@ -575,6 +492,8 @@
       <w:r>
         <w:rPr>
           <w:rFonts w:ascii="Arial" w:hAnsi="Arial"/>
+          <w:i w:val="0"/>
+          <w:color w:val="1A1A1A"/>
           <w:sz w:val="19"/>
         </w:rPr>
         <w:t>project file opening (.blend, .spp, .ma, .mb, .hip, .hipl, .hipnc, .nk) with OCIO applied;</w:t>
@@ -587,6 +506,8 @@
       <w:r>
         <w:rPr>
           <w:rFonts w:ascii="Arial" w:hAnsi="Arial"/>
+          <w:i w:val="0"/>
+          <w:color w:val="1A1A1A"/>
           <w:sz w:val="19"/>
         </w:rPr>
         <w:t>7 color themes styled after the applications they launch;</w:t>
@@ -599,6 +520,8 @@
       <w:r>
         <w:rPr>
           <w:rFonts w:ascii="Arial" w:hAnsi="Arial"/>
+          <w:i w:val="0"/>
+          <w:color w:val="1A1A1A"/>
           <w:sz w:val="19"/>
         </w:rPr>
         <w:t>drag and drop: an exe becomes a preset, a project file opens in the chosen application;</w:t>
@@ -611,6 +534,8 @@
       <w:r>
         <w:rPr>
           <w:rFonts w:ascii="Arial" w:hAnsi="Arial"/>
+          <w:i w:val="0"/>
+          <w:color w:val="1A1A1A"/>
           <w:sz w:val="19"/>
         </w:rPr>
         <w:t>system tray with quick launch under the default config;</w:t>
@@ -623,6 +548,8 @@
       <w:r>
         <w:rPr>
           <w:rFonts w:ascii="Arial" w:hAnsi="Arial"/>
+          <w:i w:val="0"/>
+          <w:color w:val="1A1A1A"/>
           <w:sz w:val="19"/>
         </w:rPr>
         <w:t>launch log: timestamp, user, application, config, exit code;</w:t>
@@ -635,6 +562,8 @@
       <w:r>
         <w:rPr>
           <w:rFonts w:ascii="Arial" w:hAnsi="Arial"/>
+          <w:i w:val="0"/>
+          <w:color w:val="1A1A1A"/>
           <w:sz w:val="19"/>
         </w:rPr>
         <w:t>bundled ACES 1.2 OCIO config with lowercase acescg / raw aliases.</w:t>
@@ -643,10 +572,29 @@
     <w:p>
       <w:pPr>
         <w:pStyle w:val="Heading1"/>
+        <w:pBdr>
+          <w:left w:val="single" w:sz="24" w:space="8" w:color="C82823"/>
+        </w:pBdr>
       </w:pPr>
       <w:bookmarkStart w:id="100002" w:name="_Toc100002"/>
       <w:r>
-        <w:t>2. Installation</w:t>
+        <w:rPr>
+          <w:rFonts w:ascii="Century Gothic" w:hAnsi="Century Gothic"/>
+          <w:b/>
+          <w:color w:val="000000"/>
+          <w:sz w:val="30"/>
+        </w:rPr>
+        <w:t xml:space="preserve">2. </w:t>
+      </w:r>
+      <w:r>
+        <w:rPr>
+          <w:rFonts w:ascii="Century Gothic" w:hAnsi="Century Gothic"/>
+          <w:b/>
+          <w:color w:val="000000"/>
+          <w:sz w:val="30"/>
+          <w:spacing w:val="20"/>
+        </w:rPr>
+        <w:t>INSTALLATION</w:t>
       </w:r>
       <w:bookmarkEnd w:id="100002"/>
     </w:p>
@@ -657,6 +605,8 @@
       <w:r>
         <w:rPr>
           <w:rFonts w:ascii="Arial" w:hAnsi="Arial"/>
+          <w:i w:val="0"/>
+          <w:color w:val="1A1A1A"/>
           <w:sz w:val="19"/>
         </w:rPr>
         <w:t>Download the latest release: github.com/abyrvalg379/FLOMASTER → Releases → Latest.</w:t>
@@ -669,6 +619,8 @@
       <w:r>
         <w:rPr>
           <w:rFonts w:ascii="Arial" w:hAnsi="Arial"/>
+          <w:i w:val="0"/>
+          <w:color w:val="1A1A1A"/>
           <w:sz w:val="19"/>
         </w:rPr>
         <w:t>Extract the archive to a folder of your choice (e.g. C:\Program Files\FLOMASTER).</w:t>
@@ -681,6 +633,8 @@
       <w:r>
         <w:rPr>
           <w:rFonts w:ascii="Arial" w:hAnsi="Arial"/>
+          <w:i w:val="0"/>
+          <w:color w:val="1A1A1A"/>
           <w:sz w:val="19"/>
         </w:rPr>
         <w:t>Run FLOMASTER.exe. The build is self-contained: .NET 8 is bundled, nothing else to install.</w:t>
@@ -693,6 +647,8 @@
       <w:r>
         <w:rPr>
           <w:rFonts w:ascii="Arial" w:hAnsi="Arial"/>
+          <w:i w:val="0"/>
+          <w:color w:val="1A1A1A"/>
           <w:sz w:val="19"/>
         </w:rPr>
         <w:t>The window opens in the top-right corner of the screen. User data (settings and the log) is created in %APPDATA%\FLOMASTER\.</w:t>
@@ -705,6 +661,8 @@
       <w:r>
         <w:rPr>
           <w:rFonts w:ascii="Arial" w:hAnsi="Arial"/>
+          <w:i w:val="0"/>
+          <w:color w:val="1A1A1A"/>
           <w:sz w:val="19"/>
         </w:rPr>
         <w:t>Updating: close the launcher (including the tray), replace the files, start it again. Settings and the log live apart from the program and survive updates.</w:t>
@@ -713,10 +671,29 @@
     <w:p>
       <w:pPr>
         <w:pStyle w:val="Heading1"/>
+        <w:pBdr>
+          <w:left w:val="single" w:sz="24" w:space="8" w:color="C82823"/>
+        </w:pBdr>
       </w:pPr>
       <w:bookmarkStart w:id="100003" w:name="_Toc100003"/>
       <w:r>
-        <w:t>3. Quick start</w:t>
+        <w:rPr>
+          <w:rFonts w:ascii="Century Gothic" w:hAnsi="Century Gothic"/>
+          <w:b/>
+          <w:color w:val="000000"/>
+          <w:sz w:val="30"/>
+        </w:rPr>
+        <w:t xml:space="preserve">3. </w:t>
+      </w:r>
+      <w:r>
+        <w:rPr>
+          <w:rFonts w:ascii="Century Gothic" w:hAnsi="Century Gothic"/>
+          <w:b/>
+          <w:color w:val="000000"/>
+          <w:sz w:val="30"/>
+          <w:spacing w:val="20"/>
+        </w:rPr>
+        <w:t>QUICK START</w:t>
       </w:r>
       <w:bookmarkEnd w:id="100003"/>
     </w:p>
@@ -727,6 +704,8 @@
       <w:r>
         <w:rPr>
           <w:rFonts w:ascii="Arial" w:hAnsi="Arial"/>
+          <w:i w:val="0"/>
+          <w:color w:val="1A1A1A"/>
           <w:sz w:val="19"/>
         </w:rPr>
         <w:t>Start FLOMASTER - the auto-scan finds installed applications and their cards appear in the window.</w:t>
@@ -739,6 +718,8 @@
       <w:r>
         <w:rPr>
           <w:rFonts w:ascii="Arial" w:hAnsi="Arial"/>
+          <w:i w:val="0"/>
+          <w:color w:val="1A1A1A"/>
           <w:sz w:val="19"/>
         </w:rPr>
         <w:t>Click Launch on a card - the application starts with the launcher OCIO config.</w:t>
@@ -751,6 +732,8 @@
       <w:r>
         <w:rPr>
           <w:rFonts w:ascii="Arial" w:hAnsi="Arial"/>
+          <w:i w:val="0"/>
+          <w:color w:val="1A1A1A"/>
           <w:sz w:val="19"/>
         </w:rPr>
         <w:t>Check the color spaces in the application (in Blender - the Color Management tab in scene properties).</w:t>
@@ -763,6 +746,8 @@
       <w:r>
         <w:rPr>
           <w:rFonts w:ascii="Arial" w:hAnsi="Arial"/>
+          <w:i w:val="0"/>
+          <w:color w:val="1A1A1A"/>
           <w:sz w:val="19"/>
         </w:rPr>
         <w:t>Drag a project file (.blend, .ma, .hip...) onto a card - it opens in that application under the same config.</w:t>
@@ -775,6 +760,8 @@
       <w:r>
         <w:rPr>
           <w:rFonts w:ascii="Arial" w:hAnsi="Arial"/>
+          <w:i w:val="0"/>
+          <w:color w:val="1A1A1A"/>
           <w:sz w:val="19"/>
         </w:rPr>
         <w:t>Make it yours: theme and scan paths are in Settings, the default tray config is there too.</w:t>
@@ -783,10 +770,29 @@
     <w:p>
       <w:pPr>
         <w:pStyle w:val="Heading1"/>
+        <w:pBdr>
+          <w:left w:val="single" w:sz="24" w:space="8" w:color="C82823"/>
+        </w:pBdr>
       </w:pPr>
       <w:bookmarkStart w:id="100004" w:name="_Toc100004"/>
       <w:r>
-        <w:t>4. Presets and auto-scan</w:t>
+        <w:rPr>
+          <w:rFonts w:ascii="Century Gothic" w:hAnsi="Century Gothic"/>
+          <w:b/>
+          <w:color w:val="000000"/>
+          <w:sz w:val="30"/>
+        </w:rPr>
+        <w:t xml:space="preserve">4. </w:t>
+      </w:r>
+      <w:r>
+        <w:rPr>
+          <w:rFonts w:ascii="Century Gothic" w:hAnsi="Century Gothic"/>
+          <w:b/>
+          <w:color w:val="000000"/>
+          <w:sz w:val="30"/>
+          <w:spacing w:val="20"/>
+        </w:rPr>
+        <w:t>PRESETS AND AUTO-SCAN</w:t>
       </w:r>
       <w:bookmarkEnd w:id="100004"/>
     </w:p>
@@ -804,6 +810,8 @@
       <w:r>
         <w:rPr>
           <w:rFonts w:ascii="Arial" w:hAnsi="Arial"/>
+          <w:i w:val="0"/>
+          <w:color w:val="1A1A1A"/>
           <w:sz w:val="19"/>
         </w:rPr>
         <w:t>On start the launcher looks for installed applications in standard locations. Something installed in a non-standard folder (portable builds, custom versions)? Add the folder in Settings → Scan paths and the card appears on the next scan.</w:t>
@@ -823,6 +831,8 @@
       <w:r>
         <w:rPr>
           <w:rFonts w:ascii="Arial" w:hAnsi="Arial"/>
+          <w:i w:val="0"/>
+          <w:color w:val="1A1A1A"/>
           <w:sz w:val="19"/>
         </w:rPr>
         <w:t>A preset is a pair of "name + path to exe". Two ways to create one:</w:t>
@@ -835,6 +845,8 @@
       <w:r>
         <w:rPr>
           <w:rFonts w:ascii="Arial" w:hAnsi="Arial"/>
+          <w:i w:val="0"/>
+          <w:color w:val="1A1A1A"/>
           <w:sz w:val="19"/>
         </w:rPr>
         <w:t>drag the application exe right into the launcher window - you will be asked for a name;</w:t>
@@ -847,6 +859,8 @@
       <w:r>
         <w:rPr>
           <w:rFonts w:ascii="Arial" w:hAnsi="Arial"/>
+          <w:i w:val="0"/>
+          <w:color w:val="1A1A1A"/>
           <w:sz w:val="19"/>
         </w:rPr>
         <w:t>create a preset manually and point it to the exe.</w:t>
@@ -856,6 +870,8 @@
       <w:r>
         <w:rPr>
           <w:rFonts w:ascii="Arial" w:hAnsi="Arial"/>
+          <w:i w:val="0"/>
+          <w:color w:val="1A1A1A"/>
           <w:sz w:val="19"/>
         </w:rPr>
         <w:t>Each preset carries its own launch arguments (the Quick Commands menu on the card) - that is how you keep several versions of one application or special launch keys.</w:t>
@@ -864,10 +880,29 @@
     <w:p>
       <w:pPr>
         <w:pStyle w:val="Heading1"/>
+        <w:pBdr>
+          <w:left w:val="single" w:sz="24" w:space="8" w:color="C82823"/>
+        </w:pBdr>
       </w:pPr>
       <w:bookmarkStart w:id="100007" w:name="_Toc100007"/>
       <w:r>
-        <w:t>5. Project files</w:t>
+        <w:rPr>
+          <w:rFonts w:ascii="Century Gothic" w:hAnsi="Century Gothic"/>
+          <w:b/>
+          <w:color w:val="000000"/>
+          <w:sz w:val="30"/>
+        </w:rPr>
+        <w:t xml:space="preserve">5. </w:t>
+      </w:r>
+      <w:r>
+        <w:rPr>
+          <w:rFonts w:ascii="Century Gothic" w:hAnsi="Century Gothic"/>
+          <w:b/>
+          <w:color w:val="000000"/>
+          <w:sz w:val="30"/>
+          <w:spacing w:val="20"/>
+        </w:rPr>
+        <w:t>PROJECT FILES</w:t>
       </w:r>
       <w:bookmarkEnd w:id="100007"/>
     </w:p>
@@ -875,6 +910,8 @@
       <w:r>
         <w:rPr>
           <w:rFonts w:ascii="Arial" w:hAnsi="Arial"/>
+          <w:i w:val="0"/>
+          <w:color w:val="1A1A1A"/>
           <w:sz w:val="19"/>
         </w:rPr>
         <w:t>Drag a project file onto an application card - it opens there with the OCIO config applied. Supported: .blend, .spp, .ma, .mb, .hip, .hipl, .hipnc, .nk. Recently opened files are available in the Recent list. The Windows context menu entry "Open in FLOMASTER" (right-click on a project file) works the same way.</w:t>
@@ -883,10 +920,29 @@
     <w:p>
       <w:pPr>
         <w:pStyle w:val="Heading1"/>
+        <w:pBdr>
+          <w:left w:val="single" w:sz="24" w:space="8" w:color="C82823"/>
+        </w:pBdr>
       </w:pPr>
       <w:bookmarkStart w:id="100008" w:name="_Toc100008"/>
       <w:r>
-        <w:t>6. How OCIO support works</w:t>
+        <w:rPr>
+          <w:rFonts w:ascii="Century Gothic" w:hAnsi="Century Gothic"/>
+          <w:b/>
+          <w:color w:val="000000"/>
+          <w:sz w:val="30"/>
+        </w:rPr>
+        <w:t xml:space="preserve">6. </w:t>
+      </w:r>
+      <w:r>
+        <w:rPr>
+          <w:rFonts w:ascii="Century Gothic" w:hAnsi="Century Gothic"/>
+          <w:b/>
+          <w:color w:val="000000"/>
+          <w:sz w:val="30"/>
+          <w:spacing w:val="20"/>
+        </w:rPr>
+        <w:t>HOW OCIO SUPPORT WORKS</w:t>
       </w:r>
       <w:bookmarkEnd w:id="100008"/>
     </w:p>
@@ -894,6 +950,8 @@
       <w:r>
         <w:rPr>
           <w:rFonts w:ascii="Arial" w:hAnsi="Arial"/>
+          <w:i w:val="0"/>
+          <w:color w:val="1A1A1A"/>
           <w:sz w:val="19"/>
         </w:rPr>
         <w:t>Most applications read the config path from the OCIO environment variable - the launcher sets it on launch. Unreal Engine ignores the variable: it receives the path as a -ocio="path" argument - the launcher does that for you.</w:t>
@@ -901,7 +959,6 @@
     </w:p>
     <w:tbl>
       <w:tblPr>
-        <w:tblStyle w:val="TableGrid"/>
         <w:tblW w:type="auto" w:w="0"/>
         <w:tblLayout w:type="fixed"/>
         <w:tblLook w:firstColumn="1" w:firstRow="1" w:lastColumn="0" w:lastRow="0" w:noHBand="0" w:noVBand="1" w:val="04A0"/>
@@ -913,25 +970,20 @@
         </w:tblCellMar>
       </w:tblPr>
       <w:tblGrid>
-        <w:gridCol w:w="4680"/>
-        <w:gridCol w:w="4680"/>
+        <w:gridCol w:w="4706"/>
+        <w:gridCol w:w="4706"/>
       </w:tblGrid>
       <w:tr>
         <w:trPr>
           <w:cantSplit/>
-          <w:tblHeader/>
         </w:trPr>
         <w:tc>
           <w:tcPr>
             <w:tcW w:type="dxa" w:w="5443"/>
+            <w:vAlign w:val="top"/>
             <w:tcBorders>
-              <w:top w:val="single" w:sz="4" w:space="0" w:color="CCCCCC"/>
-              <w:left w:val="single" w:sz="4" w:space="0" w:color="CCCCCC"/>
-              <w:bottom w:val="single" w:sz="4" w:space="0" w:color="CCCCCC"/>
-              <w:right w:val="single" w:sz="4" w:space="0" w:color="CCCCCC"/>
+              <w:bottom w:val="single" w:sz="12" w:space="4" w:color="C82823"/>
             </w:tcBorders>
-            <w:vAlign w:val="top"/>
-            <w:shd w:val="clear" w:color="auto" w:fill="E87D0D"/>
           </w:tcPr>
           <w:p>
             <w:pPr>
@@ -940,26 +992,23 @@
             </w:pPr>
             <w:r>
               <w:rPr>
-                <w:rFonts w:ascii="Arial" w:hAnsi="Arial"/>
+                <w:rFonts w:ascii="Century Gothic" w:hAnsi="Century Gothic"/>
                 <w:b/>
-                <w:color w:val="FFFFFF"/>
-                <w:sz w:val="18"/>
+                <w:color w:val="000000"/>
+                <w:sz w:val="17"/>
+                <w:spacing w:val="20"/>
               </w:rPr>
-              <w:t>Application</w:t>
+              <w:t>APPLICATION</w:t>
             </w:r>
           </w:p>
         </w:tc>
         <w:tc>
           <w:tcPr>
             <w:tcW w:type="dxa" w:w="4195"/>
+            <w:vAlign w:val="top"/>
             <w:tcBorders>
-              <w:top w:val="single" w:sz="4" w:space="0" w:color="CCCCCC"/>
-              <w:left w:val="single" w:sz="4" w:space="0" w:color="CCCCCC"/>
-              <w:bottom w:val="single" w:sz="4" w:space="0" w:color="CCCCCC"/>
-              <w:right w:val="single" w:sz="4" w:space="0" w:color="CCCCCC"/>
+              <w:bottom w:val="single" w:sz="12" w:space="4" w:color="C82823"/>
             </w:tcBorders>
-            <w:vAlign w:val="top"/>
-            <w:shd w:val="clear" w:color="auto" w:fill="E87D0D"/>
           </w:tcPr>
           <w:p>
             <w:pPr>
@@ -968,12 +1017,13 @@
             </w:pPr>
             <w:r>
               <w:rPr>
-                <w:rFonts w:ascii="Arial" w:hAnsi="Arial"/>
+                <w:rFonts w:ascii="Century Gothic" w:hAnsi="Century Gothic"/>
                 <w:b/>
-                <w:color w:val="FFFFFF"/>
-                <w:sz w:val="18"/>
+                <w:color w:val="000000"/>
+                <w:sz w:val="17"/>
+                <w:spacing w:val="20"/>
               </w:rPr>
-              <w:t>Method</w:t>
+              <w:t>METHOD</w:t>
             </w:r>
           </w:p>
         </w:tc>
@@ -985,13 +1035,10 @@
         <w:tc>
           <w:tcPr>
             <w:tcW w:type="dxa" w:w="5443"/>
+            <w:vAlign w:val="top"/>
             <w:tcBorders>
-              <w:top w:val="single" w:sz="4" w:space="0" w:color="CCCCCC"/>
-              <w:left w:val="single" w:sz="4" w:space="0" w:color="CCCCCC"/>
-              <w:bottom w:val="single" w:sz="4" w:space="0" w:color="CCCCCC"/>
-              <w:right w:val="single" w:sz="4" w:space="0" w:color="CCCCCC"/>
+              <w:bottom w:val="single" w:sz="4" w:space="4" w:color="E0E0E0"/>
             </w:tcBorders>
-            <w:vAlign w:val="top"/>
           </w:tcPr>
           <w:p>
             <w:pPr>
@@ -1002,6 +1049,7 @@
               <w:rPr>
                 <w:rFonts w:ascii="Arial" w:hAnsi="Arial"/>
                 <w:b/>
+                <w:color w:val="1A1A1A"/>
                 <w:sz w:val="18"/>
               </w:rPr>
               <w:t>Blender, Maya, Houdini, Nuke, DaVinci Resolve, Substance Painter</w:t>
@@ -1011,13 +1059,10 @@
         <w:tc>
           <w:tcPr>
             <w:tcW w:type="dxa" w:w="4195"/>
+            <w:vAlign w:val="top"/>
             <w:tcBorders>
-              <w:top w:val="single" w:sz="4" w:space="0" w:color="CCCCCC"/>
-              <w:left w:val="single" w:sz="4" w:space="0" w:color="CCCCCC"/>
-              <w:bottom w:val="single" w:sz="4" w:space="0" w:color="CCCCCC"/>
-              <w:right w:val="single" w:sz="4" w:space="0" w:color="CCCCCC"/>
+              <w:bottom w:val="single" w:sz="4" w:space="4" w:color="E0E0E0"/>
             </w:tcBorders>
-            <w:vAlign w:val="top"/>
           </w:tcPr>
           <w:p>
             <w:pPr>
@@ -1028,6 +1073,7 @@
               <w:rPr>
                 <w:rFonts w:ascii="Arial" w:hAnsi="Arial"/>
                 <w:b w:val="0"/>
+                <w:color w:val="1A1A1A"/>
                 <w:sz w:val="18"/>
               </w:rPr>
               <w:t>OCIO environment variable</w:t>
@@ -1042,14 +1088,10 @@
         <w:tc>
           <w:tcPr>
             <w:tcW w:type="dxa" w:w="5443"/>
+            <w:vAlign w:val="top"/>
             <w:tcBorders>
-              <w:top w:val="single" w:sz="4" w:space="0" w:color="CCCCCC"/>
-              <w:left w:val="single" w:sz="4" w:space="0" w:color="CCCCCC"/>
-              <w:bottom w:val="single" w:sz="4" w:space="0" w:color="CCCCCC"/>
-              <w:right w:val="single" w:sz="4" w:space="0" w:color="CCCCCC"/>
+              <w:bottom w:val="single" w:sz="8" w:space="4" w:color="000000"/>
             </w:tcBorders>
-            <w:vAlign w:val="top"/>
-            <w:shd w:val="clear" w:color="auto" w:fill="FDF4EA"/>
           </w:tcPr>
           <w:p>
             <w:pPr>
@@ -1059,6 +1101,7 @@
               <w:rPr>
                 <w:rFonts w:ascii="Arial" w:hAnsi="Arial"/>
                 <w:b/>
+                <w:color w:val="1A1A1A"/>
                 <w:sz w:val="18"/>
               </w:rPr>
               <w:t>Unreal Engine</w:t>
@@ -1068,14 +1111,10 @@
         <w:tc>
           <w:tcPr>
             <w:tcW w:type="dxa" w:w="4195"/>
+            <w:vAlign w:val="top"/>
             <w:tcBorders>
-              <w:top w:val="single" w:sz="4" w:space="0" w:color="CCCCCC"/>
-              <w:left w:val="single" w:sz="4" w:space="0" w:color="CCCCCC"/>
-              <w:bottom w:val="single" w:sz="4" w:space="0" w:color="CCCCCC"/>
-              <w:right w:val="single" w:sz="4" w:space="0" w:color="CCCCCC"/>
+              <w:bottom w:val="single" w:sz="8" w:space="4" w:color="000000"/>
             </w:tcBorders>
-            <w:vAlign w:val="top"/>
-            <w:shd w:val="clear" w:color="auto" w:fill="FDF4EA"/>
           </w:tcPr>
           <w:p>
             <w:pPr>
@@ -1085,6 +1124,7 @@
               <w:rPr>
                 <w:rFonts w:ascii="Arial" w:hAnsi="Arial"/>
                 <w:b w:val="0"/>
+                <w:color w:val="1A1A1A"/>
                 <w:sz w:val="18"/>
               </w:rPr>
               <w:t>-ocio= argument</w:t>
@@ -1095,13 +1135,15 @@
     </w:tbl>
     <w:p>
       <w:pPr>
-        <w:spacing w:after="80" w:before="0" w:line="240" w:lineRule="auto"/>
+        <w:spacing w:after="80" w:line="240" w:lineRule="auto"/>
       </w:pPr>
     </w:p>
     <w:p>
       <w:r>
         <w:rPr>
           <w:rFonts w:ascii="Arial" w:hAnsi="Arial"/>
+          <w:i w:val="0"/>
+          <w:color w:val="1A1A1A"/>
           <w:sz w:val="19"/>
         </w:rPr>
         <w:t>The bundled ACES 1.2 config (the ocio/ folder next to the exe) defines lowercase aliases acescg and raw: interchange ACES names identical across applications and configs. Scripts and presets that set a colorspace by the acescg or raw string survive config changes - long names like "ACES - ACEScg" are unique to one config. The transforms behind an alias and its long name are identical.</w:t>
@@ -1111,6 +1153,8 @@
       <w:r>
         <w:rPr>
           <w:rFonts w:ascii="Arial" w:hAnsi="Arial"/>
+          <w:i w:val="0"/>
+          <w:color w:val="1A1A1A"/>
           <w:sz w:val="19"/>
         </w:rPr>
         <w:t>Default roles in the bundled config are tuned for a typical texture cycle: 8-bit images open as raw, float images (EXR) - as acescg.</w:t>
@@ -1119,10 +1163,29 @@
     <w:p>
       <w:pPr>
         <w:pStyle w:val="Heading1"/>
+        <w:pBdr>
+          <w:left w:val="single" w:sz="24" w:space="8" w:color="C82823"/>
+        </w:pBdr>
       </w:pPr>
       <w:bookmarkStart w:id="100009" w:name="_Toc100009"/>
       <w:r>
-        <w:t>7. Themes</w:t>
+        <w:rPr>
+          <w:rFonts w:ascii="Century Gothic" w:hAnsi="Century Gothic"/>
+          <w:b/>
+          <w:color w:val="000000"/>
+          <w:sz w:val="30"/>
+        </w:rPr>
+        <w:t xml:space="preserve">7. </w:t>
+      </w:r>
+      <w:r>
+        <w:rPr>
+          <w:rFonts w:ascii="Century Gothic" w:hAnsi="Century Gothic"/>
+          <w:b/>
+          <w:color w:val="000000"/>
+          <w:sz w:val="30"/>
+          <w:spacing w:val="20"/>
+        </w:rPr>
+        <w:t>THEMES</w:t>
       </w:r>
       <w:bookmarkEnd w:id="100009"/>
     </w:p>
@@ -1130,6 +1193,8 @@
       <w:r>
         <w:rPr>
           <w:rFonts w:ascii="Arial" w:hAnsi="Arial"/>
+          <w:i w:val="0"/>
+          <w:color w:val="1A1A1A"/>
           <w:sz w:val="19"/>
         </w:rPr>
         <w:t>Seven color schemes - one per application in the pipeline. Switch the theme in Settings; the entire interface follows: buttons, checkboxes, the scrollbar, dropdown menus and the Launch button hover state.</w:t>
@@ -1137,7 +1202,6 @@
     </w:p>
     <w:tbl>
       <w:tblPr>
-        <w:tblStyle w:val="TableGrid"/>
         <w:tblW w:type="auto" w:w="0"/>
         <w:tblLayout w:type="fixed"/>
         <w:tblLook w:firstColumn="1" w:firstRow="1" w:lastColumn="0" w:lastRow="0" w:noHBand="0" w:noVBand="1" w:val="04A0"/>
@@ -1149,26 +1213,21 @@
         </w:tblCellMar>
       </w:tblPr>
       <w:tblGrid>
-        <w:gridCol w:w="3120"/>
-        <w:gridCol w:w="3120"/>
-        <w:gridCol w:w="3120"/>
+        <w:gridCol w:w="3137"/>
+        <w:gridCol w:w="3137"/>
+        <w:gridCol w:w="3137"/>
       </w:tblGrid>
       <w:tr>
         <w:trPr>
           <w:cantSplit/>
-          <w:tblHeader/>
         </w:trPr>
         <w:tc>
           <w:tcPr>
             <w:tcW w:type="dxa" w:w="2608"/>
+            <w:vAlign w:val="top"/>
             <w:tcBorders>
-              <w:top w:val="single" w:sz="4" w:space="0" w:color="CCCCCC"/>
-              <w:left w:val="single" w:sz="4" w:space="0" w:color="CCCCCC"/>
-              <w:bottom w:val="single" w:sz="4" w:space="0" w:color="CCCCCC"/>
-              <w:right w:val="single" w:sz="4" w:space="0" w:color="CCCCCC"/>
+              <w:bottom w:val="single" w:sz="12" w:space="4" w:color="C82823"/>
             </w:tcBorders>
-            <w:vAlign w:val="top"/>
-            <w:shd w:val="clear" w:color="auto" w:fill="E87D0D"/>
           </w:tcPr>
           <w:p>
             <w:pPr>
@@ -1177,26 +1236,23 @@
             </w:pPr>
             <w:r>
               <w:rPr>
-                <w:rFonts w:ascii="Arial" w:hAnsi="Arial"/>
+                <w:rFonts w:ascii="Century Gothic" w:hAnsi="Century Gothic"/>
                 <w:b/>
-                <w:color w:val="FFFFFF"/>
-                <w:sz w:val="18"/>
+                <w:color w:val="000000"/>
+                <w:sz w:val="17"/>
+                <w:spacing w:val="20"/>
               </w:rPr>
-              <w:t>Theme</w:t>
+              <w:t>THEME</w:t>
             </w:r>
           </w:p>
         </w:tc>
         <w:tc>
           <w:tcPr>
             <w:tcW w:type="dxa" w:w="3175"/>
+            <w:vAlign w:val="top"/>
             <w:tcBorders>
-              <w:top w:val="single" w:sz="4" w:space="0" w:color="CCCCCC"/>
-              <w:left w:val="single" w:sz="4" w:space="0" w:color="CCCCCC"/>
-              <w:bottom w:val="single" w:sz="4" w:space="0" w:color="CCCCCC"/>
-              <w:right w:val="single" w:sz="4" w:space="0" w:color="CCCCCC"/>
+              <w:bottom w:val="single" w:sz="12" w:space="4" w:color="C82823"/>
             </w:tcBorders>
-            <w:vAlign w:val="top"/>
-            <w:shd w:val="clear" w:color="auto" w:fill="E87D0D"/>
           </w:tcPr>
           <w:p>
             <w:pPr>
@@ -1205,26 +1261,23 @@
             </w:pPr>
             <w:r>
               <w:rPr>
-                <w:rFonts w:ascii="Arial" w:hAnsi="Arial"/>
+                <w:rFonts w:ascii="Century Gothic" w:hAnsi="Century Gothic"/>
                 <w:b/>
-                <w:color w:val="FFFFFF"/>
-                <w:sz w:val="18"/>
+                <w:color w:val="000000"/>
+                <w:sz w:val="17"/>
+                <w:spacing w:val="20"/>
               </w:rPr>
-              <w:t>Accent</w:t>
+              <w:t>ACCENT</w:t>
             </w:r>
           </w:p>
         </w:tc>
         <w:tc>
           <w:tcPr>
             <w:tcW w:type="dxa" w:w="3855"/>
+            <w:vAlign w:val="top"/>
             <w:tcBorders>
-              <w:top w:val="single" w:sz="4" w:space="0" w:color="CCCCCC"/>
-              <w:left w:val="single" w:sz="4" w:space="0" w:color="CCCCCC"/>
-              <w:bottom w:val="single" w:sz="4" w:space="0" w:color="CCCCCC"/>
-              <w:right w:val="single" w:sz="4" w:space="0" w:color="CCCCCC"/>
+              <w:bottom w:val="single" w:sz="12" w:space="4" w:color="C82823"/>
             </w:tcBorders>
-            <w:vAlign w:val="top"/>
-            <w:shd w:val="clear" w:color="auto" w:fill="E87D0D"/>
           </w:tcPr>
           <w:p>
             <w:pPr>
@@ -1233,12 +1286,13 @@
             </w:pPr>
             <w:r>
               <w:rPr>
-                <w:rFonts w:ascii="Arial" w:hAnsi="Arial"/>
+                <w:rFonts w:ascii="Century Gothic" w:hAnsi="Century Gothic"/>
                 <w:b/>
-                <w:color w:val="FFFFFF"/>
-                <w:sz w:val="18"/>
+                <w:color w:val="000000"/>
+                <w:sz w:val="17"/>
+                <w:spacing w:val="20"/>
               </w:rPr>
-              <w:t>Base</w:t>
+              <w:t>BASE</w:t>
             </w:r>
           </w:p>
         </w:tc>
@@ -1250,13 +1304,10 @@
         <w:tc>
           <w:tcPr>
             <w:tcW w:type="dxa" w:w="2608"/>
+            <w:vAlign w:val="top"/>
             <w:tcBorders>
-              <w:top w:val="single" w:sz="4" w:space="0" w:color="CCCCCC"/>
-              <w:left w:val="single" w:sz="4" w:space="0" w:color="CCCCCC"/>
-              <w:bottom w:val="single" w:sz="4" w:space="0" w:color="CCCCCC"/>
-              <w:right w:val="single" w:sz="4" w:space="0" w:color="CCCCCC"/>
+              <w:bottom w:val="single" w:sz="4" w:space="4" w:color="E0E0E0"/>
             </w:tcBorders>
-            <w:vAlign w:val="top"/>
           </w:tcPr>
           <w:p>
             <w:pPr>
@@ -1267,6 +1318,7 @@
               <w:rPr>
                 <w:rFonts w:ascii="Arial" w:hAnsi="Arial"/>
                 <w:b/>
+                <w:color w:val="1A1A1A"/>
                 <w:sz w:val="18"/>
               </w:rPr>
               <w:t>Blender</w:t>
@@ -1276,13 +1328,10 @@
         <w:tc>
           <w:tcPr>
             <w:tcW w:type="dxa" w:w="3175"/>
+            <w:vAlign w:val="top"/>
             <w:tcBorders>
-              <w:top w:val="single" w:sz="4" w:space="0" w:color="CCCCCC"/>
-              <w:left w:val="single" w:sz="4" w:space="0" w:color="CCCCCC"/>
-              <w:bottom w:val="single" w:sz="4" w:space="0" w:color="CCCCCC"/>
-              <w:right w:val="single" w:sz="4" w:space="0" w:color="CCCCCC"/>
+              <w:bottom w:val="single" w:sz="4" w:space="4" w:color="E0E0E0"/>
             </w:tcBorders>
-            <w:vAlign w:val="top"/>
           </w:tcPr>
           <w:p>
             <w:pPr>
@@ -1293,6 +1342,7 @@
               <w:rPr>
                 <w:rFonts w:ascii="Arial" w:hAnsi="Arial"/>
                 <w:b w:val="0"/>
+                <w:color w:val="1A1A1A"/>
                 <w:sz w:val="18"/>
               </w:rPr>
               <w:t>orange</w:t>
@@ -1302,13 +1352,10 @@
         <w:tc>
           <w:tcPr>
             <w:tcW w:type="dxa" w:w="3855"/>
+            <w:vAlign w:val="top"/>
             <w:tcBorders>
-              <w:top w:val="single" w:sz="4" w:space="0" w:color="CCCCCC"/>
-              <w:left w:val="single" w:sz="4" w:space="0" w:color="CCCCCC"/>
-              <w:bottom w:val="single" w:sz="4" w:space="0" w:color="CCCCCC"/>
-              <w:right w:val="single" w:sz="4" w:space="0" w:color="CCCCCC"/>
+              <w:bottom w:val="single" w:sz="4" w:space="4" w:color="E0E0E0"/>
             </w:tcBorders>
-            <w:vAlign w:val="top"/>
           </w:tcPr>
           <w:p>
             <w:pPr>
@@ -1319,6 +1366,7 @@
               <w:rPr>
                 <w:rFonts w:ascii="Arial" w:hAnsi="Arial"/>
                 <w:b w:val="0"/>
+                <w:color w:val="1A1A1A"/>
                 <w:sz w:val="18"/>
               </w:rPr>
               <w:t>dark graphite</w:t>
@@ -1333,14 +1381,10 @@
         <w:tc>
           <w:tcPr>
             <w:tcW w:type="dxa" w:w="2608"/>
+            <w:vAlign w:val="top"/>
             <w:tcBorders>
-              <w:top w:val="single" w:sz="4" w:space="0" w:color="CCCCCC"/>
-              <w:left w:val="single" w:sz="4" w:space="0" w:color="CCCCCC"/>
-              <w:bottom w:val="single" w:sz="4" w:space="0" w:color="CCCCCC"/>
-              <w:right w:val="single" w:sz="4" w:space="0" w:color="CCCCCC"/>
+              <w:bottom w:val="single" w:sz="4" w:space="4" w:color="E0E0E0"/>
             </w:tcBorders>
-            <w:vAlign w:val="top"/>
-            <w:shd w:val="clear" w:color="auto" w:fill="FDF4EA"/>
           </w:tcPr>
           <w:p>
             <w:pPr>
@@ -1351,6 +1395,7 @@
               <w:rPr>
                 <w:rFonts w:ascii="Arial" w:hAnsi="Arial"/>
                 <w:b/>
+                <w:color w:val="1A1A1A"/>
                 <w:sz w:val="18"/>
               </w:rPr>
               <w:t>Maya</w:t>
@@ -1360,14 +1405,10 @@
         <w:tc>
           <w:tcPr>
             <w:tcW w:type="dxa" w:w="3175"/>
+            <w:vAlign w:val="top"/>
             <w:tcBorders>
-              <w:top w:val="single" w:sz="4" w:space="0" w:color="CCCCCC"/>
-              <w:left w:val="single" w:sz="4" w:space="0" w:color="CCCCCC"/>
-              <w:bottom w:val="single" w:sz="4" w:space="0" w:color="CCCCCC"/>
-              <w:right w:val="single" w:sz="4" w:space="0" w:color="CCCCCC"/>
+              <w:bottom w:val="single" w:sz="4" w:space="4" w:color="E0E0E0"/>
             </w:tcBorders>
-            <w:vAlign w:val="top"/>
-            <w:shd w:val="clear" w:color="auto" w:fill="FDF4EA"/>
           </w:tcPr>
           <w:p>
             <w:pPr>
@@ -1378,6 +1419,7 @@
               <w:rPr>
                 <w:rFonts w:ascii="Arial" w:hAnsi="Arial"/>
                 <w:b w:val="0"/>
+                <w:color w:val="1A1A1A"/>
                 <w:sz w:val="18"/>
               </w:rPr>
               <w:t>cyan</w:t>
@@ -1387,14 +1429,10 @@
         <w:tc>
           <w:tcPr>
             <w:tcW w:type="dxa" w:w="3855"/>
+            <w:vAlign w:val="top"/>
             <w:tcBorders>
-              <w:top w:val="single" w:sz="4" w:space="0" w:color="CCCCCC"/>
-              <w:left w:val="single" w:sz="4" w:space="0" w:color="CCCCCC"/>
-              <w:bottom w:val="single" w:sz="4" w:space="0" w:color="CCCCCC"/>
-              <w:right w:val="single" w:sz="4" w:space="0" w:color="CCCCCC"/>
+              <w:bottom w:val="single" w:sz="4" w:space="4" w:color="E0E0E0"/>
             </w:tcBorders>
-            <w:vAlign w:val="top"/>
-            <w:shd w:val="clear" w:color="auto" w:fill="FDF4EA"/>
           </w:tcPr>
           <w:p>
             <w:pPr>
@@ -1405,6 +1443,7 @@
               <w:rPr>
                 <w:rFonts w:ascii="Arial" w:hAnsi="Arial"/>
                 <w:b w:val="0"/>
+                <w:color w:val="1A1A1A"/>
                 <w:sz w:val="18"/>
               </w:rPr>
               <w:t>blue-gray</w:t>
@@ -1419,13 +1458,10 @@
         <w:tc>
           <w:tcPr>
             <w:tcW w:type="dxa" w:w="2608"/>
+            <w:vAlign w:val="top"/>
             <w:tcBorders>
-              <w:top w:val="single" w:sz="4" w:space="0" w:color="CCCCCC"/>
-              <w:left w:val="single" w:sz="4" w:space="0" w:color="CCCCCC"/>
-              <w:bottom w:val="single" w:sz="4" w:space="0" w:color="CCCCCC"/>
-              <w:right w:val="single" w:sz="4" w:space="0" w:color="CCCCCC"/>
+              <w:bottom w:val="single" w:sz="4" w:space="4" w:color="E0E0E0"/>
             </w:tcBorders>
-            <w:vAlign w:val="top"/>
           </w:tcPr>
           <w:p>
             <w:pPr>
@@ -1436,6 +1472,7 @@
               <w:rPr>
                 <w:rFonts w:ascii="Arial" w:hAnsi="Arial"/>
                 <w:b/>
+                <w:color w:val="1A1A1A"/>
                 <w:sz w:val="18"/>
               </w:rPr>
               <w:t>Houdini</w:t>
@@ -1445,13 +1482,10 @@
         <w:tc>
           <w:tcPr>
             <w:tcW w:type="dxa" w:w="3175"/>
+            <w:vAlign w:val="top"/>
             <w:tcBorders>
-              <w:top w:val="single" w:sz="4" w:space="0" w:color="CCCCCC"/>
-              <w:left w:val="single" w:sz="4" w:space="0" w:color="CCCCCC"/>
-              <w:bottom w:val="single" w:sz="4" w:space="0" w:color="CCCCCC"/>
-              <w:right w:val="single" w:sz="4" w:space="0" w:color="CCCCCC"/>
+              <w:bottom w:val="single" w:sz="4" w:space="4" w:color="E0E0E0"/>
             </w:tcBorders>
-            <w:vAlign w:val="top"/>
           </w:tcPr>
           <w:p>
             <w:pPr>
@@ -1462,6 +1496,7 @@
               <w:rPr>
                 <w:rFonts w:ascii="Arial" w:hAnsi="Arial"/>
                 <w:b w:val="0"/>
+                <w:color w:val="1A1A1A"/>
                 <w:sz w:val="18"/>
               </w:rPr>
               <w:t>red-orange</w:t>
@@ -1471,13 +1506,10 @@
         <w:tc>
           <w:tcPr>
             <w:tcW w:type="dxa" w:w="3855"/>
+            <w:vAlign w:val="top"/>
             <w:tcBorders>
-              <w:top w:val="single" w:sz="4" w:space="0" w:color="CCCCCC"/>
-              <w:left w:val="single" w:sz="4" w:space="0" w:color="CCCCCC"/>
-              <w:bottom w:val="single" w:sz="4" w:space="0" w:color="CCCCCC"/>
-              <w:right w:val="single" w:sz="4" w:space="0" w:color="CCCCCC"/>
+              <w:bottom w:val="single" w:sz="4" w:space="4" w:color="E0E0E0"/>
             </w:tcBorders>
-            <w:vAlign w:val="top"/>
           </w:tcPr>
           <w:p>
             <w:pPr>
@@ -1488,6 +1520,7 @@
               <w:rPr>
                 <w:rFonts w:ascii="Arial" w:hAnsi="Arial"/>
                 <w:b w:val="0"/>
+                <w:color w:val="1A1A1A"/>
                 <w:sz w:val="18"/>
               </w:rPr>
               <w:t>dark (sampled from the real UI)</w:t>
@@ -1502,14 +1535,10 @@
         <w:tc>
           <w:tcPr>
             <w:tcW w:type="dxa" w:w="2608"/>
+            <w:vAlign w:val="top"/>
             <w:tcBorders>
-              <w:top w:val="single" w:sz="4" w:space="0" w:color="CCCCCC"/>
-              <w:left w:val="single" w:sz="4" w:space="0" w:color="CCCCCC"/>
-              <w:bottom w:val="single" w:sz="4" w:space="0" w:color="CCCCCC"/>
-              <w:right w:val="single" w:sz="4" w:space="0" w:color="CCCCCC"/>
+              <w:bottom w:val="single" w:sz="4" w:space="4" w:color="E0E0E0"/>
             </w:tcBorders>
-            <w:vAlign w:val="top"/>
-            <w:shd w:val="clear" w:color="auto" w:fill="FDF4EA"/>
           </w:tcPr>
           <w:p>
             <w:pPr>
@@ -1520,6 +1549,7 @@
               <w:rPr>
                 <w:rFonts w:ascii="Arial" w:hAnsi="Arial"/>
                 <w:b/>
+                <w:color w:val="1A1A1A"/>
                 <w:sz w:val="18"/>
               </w:rPr>
               <w:t>Nuke</w:t>
@@ -1529,14 +1559,10 @@
         <w:tc>
           <w:tcPr>
             <w:tcW w:type="dxa" w:w="3175"/>
+            <w:vAlign w:val="top"/>
             <w:tcBorders>
-              <w:top w:val="single" w:sz="4" w:space="0" w:color="CCCCCC"/>
-              <w:left w:val="single" w:sz="4" w:space="0" w:color="CCCCCC"/>
-              <w:bottom w:val="single" w:sz="4" w:space="0" w:color="CCCCCC"/>
-              <w:right w:val="single" w:sz="4" w:space="0" w:color="CCCCCC"/>
+              <w:bottom w:val="single" w:sz="4" w:space="4" w:color="E0E0E0"/>
             </w:tcBorders>
-            <w:vAlign w:val="top"/>
-            <w:shd w:val="clear" w:color="auto" w:fill="FDF4EA"/>
           </w:tcPr>
           <w:p>
             <w:pPr>
@@ -1547,6 +1573,7 @@
               <w:rPr>
                 <w:rFonts w:ascii="Arial" w:hAnsi="Arial"/>
                 <w:b w:val="0"/>
+                <w:color w:val="1A1A1A"/>
                 <w:sz w:val="18"/>
               </w:rPr>
               <w:t>light gray</w:t>
@@ -1556,14 +1583,10 @@
         <w:tc>
           <w:tcPr>
             <w:tcW w:type="dxa" w:w="3855"/>
+            <w:vAlign w:val="top"/>
             <w:tcBorders>
-              <w:top w:val="single" w:sz="4" w:space="0" w:color="CCCCCC"/>
-              <w:left w:val="single" w:sz="4" w:space="0" w:color="CCCCCC"/>
-              <w:bottom w:val="single" w:sz="4" w:space="0" w:color="CCCCCC"/>
-              <w:right w:val="single" w:sz="4" w:space="0" w:color="CCCCCC"/>
+              <w:bottom w:val="single" w:sz="4" w:space="4" w:color="E0E0E0"/>
             </w:tcBorders>
-            <w:vAlign w:val="top"/>
-            <w:shd w:val="clear" w:color="auto" w:fill="FDF4EA"/>
           </w:tcPr>
           <w:p>
             <w:pPr>
@@ -1574,6 +1597,7 @@
               <w:rPr>
                 <w:rFonts w:ascii="Arial" w:hAnsi="Arial"/>
                 <w:b w:val="0"/>
+                <w:color w:val="1A1A1A"/>
                 <w:sz w:val="18"/>
               </w:rPr>
               <w:t>graphite, monochrome</w:t>
@@ -1588,13 +1612,10 @@
         <w:tc>
           <w:tcPr>
             <w:tcW w:type="dxa" w:w="2608"/>
+            <w:vAlign w:val="top"/>
             <w:tcBorders>
-              <w:top w:val="single" w:sz="4" w:space="0" w:color="CCCCCC"/>
-              <w:left w:val="single" w:sz="4" w:space="0" w:color="CCCCCC"/>
-              <w:bottom w:val="single" w:sz="4" w:space="0" w:color="CCCCCC"/>
-              <w:right w:val="single" w:sz="4" w:space="0" w:color="CCCCCC"/>
+              <w:bottom w:val="single" w:sz="4" w:space="4" w:color="E0E0E0"/>
             </w:tcBorders>
-            <w:vAlign w:val="top"/>
           </w:tcPr>
           <w:p>
             <w:pPr>
@@ -1605,6 +1626,7 @@
               <w:rPr>
                 <w:rFonts w:ascii="Arial" w:hAnsi="Arial"/>
                 <w:b/>
+                <w:color w:val="1A1A1A"/>
                 <w:sz w:val="18"/>
               </w:rPr>
               <w:t>DaVinci</w:t>
@@ -1614,13 +1636,10 @@
         <w:tc>
           <w:tcPr>
             <w:tcW w:type="dxa" w:w="3175"/>
+            <w:vAlign w:val="top"/>
             <w:tcBorders>
-              <w:top w:val="single" w:sz="4" w:space="0" w:color="CCCCCC"/>
-              <w:left w:val="single" w:sz="4" w:space="0" w:color="CCCCCC"/>
-              <w:bottom w:val="single" w:sz="4" w:space="0" w:color="CCCCCC"/>
-              <w:right w:val="single" w:sz="4" w:space="0" w:color="CCCCCC"/>
+              <w:bottom w:val="single" w:sz="4" w:space="4" w:color="E0E0E0"/>
             </w:tcBorders>
-            <w:vAlign w:val="top"/>
           </w:tcPr>
           <w:p>
             <w:pPr>
@@ -1631,6 +1650,7 @@
               <w:rPr>
                 <w:rFonts w:ascii="Arial" w:hAnsi="Arial"/>
                 <w:b w:val="0"/>
+                <w:color w:val="1A1A1A"/>
                 <w:sz w:val="18"/>
               </w:rPr>
               <w:t>pink-red</w:t>
@@ -1640,13 +1660,10 @@
         <w:tc>
           <w:tcPr>
             <w:tcW w:type="dxa" w:w="3855"/>
+            <w:vAlign w:val="top"/>
             <w:tcBorders>
-              <w:top w:val="single" w:sz="4" w:space="0" w:color="CCCCCC"/>
-              <w:left w:val="single" w:sz="4" w:space="0" w:color="CCCCCC"/>
-              <w:bottom w:val="single" w:sz="4" w:space="0" w:color="CCCCCC"/>
-              <w:right w:val="single" w:sz="4" w:space="0" w:color="CCCCCC"/>
+              <w:bottom w:val="single" w:sz="4" w:space="4" w:color="E0E0E0"/>
             </w:tcBorders>
-            <w:vAlign w:val="top"/>
           </w:tcPr>
           <w:p>
             <w:pPr>
@@ -1657,6 +1674,7 @@
               <w:rPr>
                 <w:rFonts w:ascii="Arial" w:hAnsi="Arial"/>
                 <w:b w:val="0"/>
+                <w:color w:val="1A1A1A"/>
                 <w:sz w:val="18"/>
               </w:rPr>
               <w:t>purple-navy</w:t>
@@ -1671,14 +1689,10 @@
         <w:tc>
           <w:tcPr>
             <w:tcW w:type="dxa" w:w="2608"/>
+            <w:vAlign w:val="top"/>
             <w:tcBorders>
-              <w:top w:val="single" w:sz="4" w:space="0" w:color="CCCCCC"/>
-              <w:left w:val="single" w:sz="4" w:space="0" w:color="CCCCCC"/>
-              <w:bottom w:val="single" w:sz="4" w:space="0" w:color="CCCCCC"/>
-              <w:right w:val="single" w:sz="4" w:space="0" w:color="CCCCCC"/>
+              <w:bottom w:val="single" w:sz="4" w:space="4" w:color="E0E0E0"/>
             </w:tcBorders>
-            <w:vAlign w:val="top"/>
-            <w:shd w:val="clear" w:color="auto" w:fill="FDF4EA"/>
           </w:tcPr>
           <w:p>
             <w:pPr>
@@ -1689,6 +1703,7 @@
               <w:rPr>
                 <w:rFonts w:ascii="Arial" w:hAnsi="Arial"/>
                 <w:b/>
+                <w:color w:val="1A1A1A"/>
                 <w:sz w:val="18"/>
               </w:rPr>
               <w:t>Unreal</w:t>
@@ -1698,14 +1713,10 @@
         <w:tc>
           <w:tcPr>
             <w:tcW w:type="dxa" w:w="3175"/>
+            <w:vAlign w:val="top"/>
             <w:tcBorders>
-              <w:top w:val="single" w:sz="4" w:space="0" w:color="CCCCCC"/>
-              <w:left w:val="single" w:sz="4" w:space="0" w:color="CCCCCC"/>
-              <w:bottom w:val="single" w:sz="4" w:space="0" w:color="CCCCCC"/>
-              <w:right w:val="single" w:sz="4" w:space="0" w:color="CCCCCC"/>
+              <w:bottom w:val="single" w:sz="4" w:space="4" w:color="E0E0E0"/>
             </w:tcBorders>
-            <w:vAlign w:val="top"/>
-            <w:shd w:val="clear" w:color="auto" w:fill="FDF4EA"/>
           </w:tcPr>
           <w:p>
             <w:pPr>
@@ -1716,6 +1727,7 @@
               <w:rPr>
                 <w:rFonts w:ascii="Arial" w:hAnsi="Arial"/>
                 <w:b w:val="0"/>
+                <w:color w:val="1A1A1A"/>
                 <w:sz w:val="18"/>
               </w:rPr>
               <w:t>blue</w:t>
@@ -1725,14 +1737,10 @@
         <w:tc>
           <w:tcPr>
             <w:tcW w:type="dxa" w:w="3855"/>
+            <w:vAlign w:val="top"/>
             <w:tcBorders>
-              <w:top w:val="single" w:sz="4" w:space="0" w:color="CCCCCC"/>
-              <w:left w:val="single" w:sz="4" w:space="0" w:color="CCCCCC"/>
-              <w:bottom w:val="single" w:sz="4" w:space="0" w:color="CCCCCC"/>
-              <w:right w:val="single" w:sz="4" w:space="0" w:color="CCCCCC"/>
+              <w:bottom w:val="single" w:sz="4" w:space="4" w:color="E0E0E0"/>
             </w:tcBorders>
-            <w:vAlign w:val="top"/>
-            <w:shd w:val="clear" w:color="auto" w:fill="FDF4EA"/>
           </w:tcPr>
           <w:p>
             <w:pPr>
@@ -1743,6 +1751,7 @@
               <w:rPr>
                 <w:rFonts w:ascii="Arial" w:hAnsi="Arial"/>
                 <w:b w:val="0"/>
+                <w:color w:val="1A1A1A"/>
                 <w:sz w:val="18"/>
               </w:rPr>
               <w:t>cool graphite</w:t>
@@ -1757,13 +1766,10 @@
         <w:tc>
           <w:tcPr>
             <w:tcW w:type="dxa" w:w="2608"/>
+            <w:vAlign w:val="top"/>
             <w:tcBorders>
-              <w:top w:val="single" w:sz="4" w:space="0" w:color="CCCCCC"/>
-              <w:left w:val="single" w:sz="4" w:space="0" w:color="CCCCCC"/>
-              <w:bottom w:val="single" w:sz="4" w:space="0" w:color="CCCCCC"/>
-              <w:right w:val="single" w:sz="4" w:space="0" w:color="CCCCCC"/>
+              <w:bottom w:val="single" w:sz="8" w:space="4" w:color="000000"/>
             </w:tcBorders>
-            <w:vAlign w:val="top"/>
           </w:tcPr>
           <w:p>
             <w:pPr>
@@ -1773,6 +1779,7 @@
               <w:rPr>
                 <w:rFonts w:ascii="Arial" w:hAnsi="Arial"/>
                 <w:b/>
+                <w:color w:val="1A1A1A"/>
                 <w:sz w:val="18"/>
               </w:rPr>
               <w:t>Substance</w:t>
@@ -1782,13 +1789,10 @@
         <w:tc>
           <w:tcPr>
             <w:tcW w:type="dxa" w:w="3175"/>
+            <w:vAlign w:val="top"/>
             <w:tcBorders>
-              <w:top w:val="single" w:sz="4" w:space="0" w:color="CCCCCC"/>
-              <w:left w:val="single" w:sz="4" w:space="0" w:color="CCCCCC"/>
-              <w:bottom w:val="single" w:sz="4" w:space="0" w:color="CCCCCC"/>
-              <w:right w:val="single" w:sz="4" w:space="0" w:color="CCCCCC"/>
+              <w:bottom w:val="single" w:sz="8" w:space="4" w:color="000000"/>
             </w:tcBorders>
-            <w:vAlign w:val="top"/>
           </w:tcPr>
           <w:p>
             <w:pPr>
@@ -1798,6 +1802,7 @@
               <w:rPr>
                 <w:rFonts w:ascii="Arial" w:hAnsi="Arial"/>
                 <w:b w:val="0"/>
+                <w:color w:val="1A1A1A"/>
                 <w:sz w:val="18"/>
               </w:rPr>
               <w:t>green</w:t>
@@ -1807,13 +1812,10 @@
         <w:tc>
           <w:tcPr>
             <w:tcW w:type="dxa" w:w="3855"/>
+            <w:vAlign w:val="top"/>
             <w:tcBorders>
-              <w:top w:val="single" w:sz="4" w:space="0" w:color="CCCCCC"/>
-              <w:left w:val="single" w:sz="4" w:space="0" w:color="CCCCCC"/>
-              <w:bottom w:val="single" w:sz="4" w:space="0" w:color="CCCCCC"/>
-              <w:right w:val="single" w:sz="4" w:space="0" w:color="CCCCCC"/>
+              <w:bottom w:val="single" w:sz="8" w:space="4" w:color="000000"/>
             </w:tcBorders>
-            <w:vAlign w:val="top"/>
           </w:tcPr>
           <w:p>
             <w:pPr>
@@ -1823,6 +1825,7 @@
               <w:rPr>
                 <w:rFonts w:ascii="Arial" w:hAnsi="Arial"/>
                 <w:b w:val="0"/>
+                <w:color w:val="1A1A1A"/>
                 <w:sz w:val="18"/>
               </w:rPr>
               <w:t>black</w:t>
@@ -1833,22 +1836,40 @@
     </w:tbl>
     <w:p>
       <w:pPr>
-        <w:spacing w:after="80" w:before="0" w:line="240" w:lineRule="auto"/>
+        <w:spacing w:after="80" w:line="240" w:lineRule="auto"/>
       </w:pPr>
     </w:p>
     <w:p>
       <w:pPr>
         <w:pStyle w:val="Heading1"/>
+        <w:pBdr>
+          <w:left w:val="single" w:sz="24" w:space="8" w:color="C82823"/>
+        </w:pBdr>
       </w:pPr>
       <w:bookmarkStart w:id="100010" w:name="_Toc100010"/>
       <w:r>
-        <w:t>8. Settings</w:t>
+        <w:rPr>
+          <w:rFonts w:ascii="Century Gothic" w:hAnsi="Century Gothic"/>
+          <w:b/>
+          <w:color w:val="000000"/>
+          <w:sz w:val="30"/>
+        </w:rPr>
+        <w:t xml:space="preserve">8. </w:t>
+      </w:r>
+      <w:r>
+        <w:rPr>
+          <w:rFonts w:ascii="Century Gothic" w:hAnsi="Century Gothic"/>
+          <w:b/>
+          <w:color w:val="000000"/>
+          <w:sz w:val="30"/>
+          <w:spacing w:val="20"/>
+        </w:rPr>
+        <w:t>SETTINGS</w:t>
       </w:r>
       <w:bookmarkEnd w:id="100010"/>
     </w:p>
     <w:tbl>
       <w:tblPr>
-        <w:tblStyle w:val="TableGrid"/>
         <w:tblW w:type="auto" w:w="0"/>
         <w:tblLayout w:type="fixed"/>
         <w:tblLook w:firstColumn="1" w:firstRow="1" w:lastColumn="0" w:lastRow="0" w:noHBand="0" w:noVBand="1" w:val="04A0"/>
@@ -1860,25 +1881,20 @@
         </w:tblCellMar>
       </w:tblPr>
       <w:tblGrid>
-        <w:gridCol w:w="4680"/>
-        <w:gridCol w:w="4680"/>
+        <w:gridCol w:w="4706"/>
+        <w:gridCol w:w="4706"/>
       </w:tblGrid>
       <w:tr>
         <w:trPr>
           <w:cantSplit/>
-          <w:tblHeader/>
         </w:trPr>
         <w:tc>
           <w:tcPr>
             <w:tcW w:type="dxa" w:w="3402"/>
+            <w:vAlign w:val="top"/>
             <w:tcBorders>
-              <w:top w:val="single" w:sz="4" w:space="0" w:color="CCCCCC"/>
-              <w:left w:val="single" w:sz="4" w:space="0" w:color="CCCCCC"/>
-              <w:bottom w:val="single" w:sz="4" w:space="0" w:color="CCCCCC"/>
-              <w:right w:val="single" w:sz="4" w:space="0" w:color="CCCCCC"/>
+              <w:bottom w:val="single" w:sz="12" w:space="4" w:color="C82823"/>
             </w:tcBorders>
-            <w:vAlign w:val="top"/>
-            <w:shd w:val="clear" w:color="auto" w:fill="E87D0D"/>
           </w:tcPr>
           <w:p>
             <w:pPr>
@@ -1887,26 +1903,23 @@
             </w:pPr>
             <w:r>
               <w:rPr>
-                <w:rFonts w:ascii="Arial" w:hAnsi="Arial"/>
+                <w:rFonts w:ascii="Century Gothic" w:hAnsi="Century Gothic"/>
                 <w:b/>
-                <w:color w:val="FFFFFF"/>
-                <w:sz w:val="18"/>
+                <w:color w:val="000000"/>
+                <w:sz w:val="17"/>
+                <w:spacing w:val="20"/>
               </w:rPr>
-              <w:t>Setting</w:t>
+              <w:t>SETTING</w:t>
             </w:r>
           </w:p>
         </w:tc>
         <w:tc>
           <w:tcPr>
             <w:tcW w:type="dxa" w:w="6236"/>
+            <w:vAlign w:val="top"/>
             <w:tcBorders>
-              <w:top w:val="single" w:sz="4" w:space="0" w:color="CCCCCC"/>
-              <w:left w:val="single" w:sz="4" w:space="0" w:color="CCCCCC"/>
-              <w:bottom w:val="single" w:sz="4" w:space="0" w:color="CCCCCC"/>
-              <w:right w:val="single" w:sz="4" w:space="0" w:color="CCCCCC"/>
+              <w:bottom w:val="single" w:sz="12" w:space="4" w:color="C82823"/>
             </w:tcBorders>
-            <w:vAlign w:val="top"/>
-            <w:shd w:val="clear" w:color="auto" w:fill="E87D0D"/>
           </w:tcPr>
           <w:p>
             <w:pPr>
@@ -1915,12 +1928,13 @@
             </w:pPr>
             <w:r>
               <w:rPr>
-                <w:rFonts w:ascii="Arial" w:hAnsi="Arial"/>
+                <w:rFonts w:ascii="Century Gothic" w:hAnsi="Century Gothic"/>
                 <w:b/>
-                <w:color w:val="FFFFFF"/>
-                <w:sz w:val="18"/>
+                <w:color w:val="000000"/>
+                <w:sz w:val="17"/>
+                <w:spacing w:val="20"/>
               </w:rPr>
-              <w:t>What it does</w:t>
+              <w:t>WHAT IT DOES</w:t>
             </w:r>
           </w:p>
         </w:tc>
@@ -1932,13 +1946,10 @@
         <w:tc>
           <w:tcPr>
             <w:tcW w:type="dxa" w:w="3402"/>
+            <w:vAlign w:val="top"/>
             <w:tcBorders>
-              <w:top w:val="single" w:sz="4" w:space="0" w:color="CCCCCC"/>
-              <w:left w:val="single" w:sz="4" w:space="0" w:color="CCCCCC"/>
-              <w:bottom w:val="single" w:sz="4" w:space="0" w:color="CCCCCC"/>
-              <w:right w:val="single" w:sz="4" w:space="0" w:color="CCCCCC"/>
+              <w:bottom w:val="single" w:sz="4" w:space="4" w:color="E0E0E0"/>
             </w:tcBorders>
-            <w:vAlign w:val="top"/>
           </w:tcPr>
           <w:p>
             <w:pPr>
@@ -1949,6 +1960,7 @@
               <w:rPr>
                 <w:rFonts w:ascii="Arial" w:hAnsi="Arial"/>
                 <w:b/>
+                <w:color w:val="1A1A1A"/>
                 <w:sz w:val="18"/>
               </w:rPr>
               <w:t>Theme</w:t>
@@ -1958,13 +1970,10 @@
         <w:tc>
           <w:tcPr>
             <w:tcW w:type="dxa" w:w="6236"/>
+            <w:vAlign w:val="top"/>
             <w:tcBorders>
-              <w:top w:val="single" w:sz="4" w:space="0" w:color="CCCCCC"/>
-              <w:left w:val="single" w:sz="4" w:space="0" w:color="CCCCCC"/>
-              <w:bottom w:val="single" w:sz="4" w:space="0" w:color="CCCCCC"/>
-              <w:right w:val="single" w:sz="4" w:space="0" w:color="CCCCCC"/>
+              <w:bottom w:val="single" w:sz="4" w:space="4" w:color="E0E0E0"/>
             </w:tcBorders>
-            <w:vAlign w:val="top"/>
           </w:tcPr>
           <w:p>
             <w:pPr>
@@ -1975,6 +1984,7 @@
               <w:rPr>
                 <w:rFonts w:ascii="Arial" w:hAnsi="Arial"/>
                 <w:b w:val="0"/>
+                <w:color w:val="1A1A1A"/>
                 <w:sz w:val="18"/>
               </w:rPr>
               <w:t>interface color theme</w:t>
@@ -1989,14 +1999,10 @@
         <w:tc>
           <w:tcPr>
             <w:tcW w:type="dxa" w:w="3402"/>
+            <w:vAlign w:val="top"/>
             <w:tcBorders>
-              <w:top w:val="single" w:sz="4" w:space="0" w:color="CCCCCC"/>
-              <w:left w:val="single" w:sz="4" w:space="0" w:color="CCCCCC"/>
-              <w:bottom w:val="single" w:sz="4" w:space="0" w:color="CCCCCC"/>
-              <w:right w:val="single" w:sz="4" w:space="0" w:color="CCCCCC"/>
+              <w:bottom w:val="single" w:sz="4" w:space="4" w:color="E0E0E0"/>
             </w:tcBorders>
-            <w:vAlign w:val="top"/>
-            <w:shd w:val="clear" w:color="auto" w:fill="FDF4EA"/>
           </w:tcPr>
           <w:p>
             <w:pPr>
@@ -2007,6 +2013,7 @@
               <w:rPr>
                 <w:rFonts w:ascii="Arial" w:hAnsi="Arial"/>
                 <w:b/>
+                <w:color w:val="1A1A1A"/>
                 <w:sz w:val="18"/>
               </w:rPr>
               <w:t>Start with Windows</w:t>
@@ -2016,14 +2023,10 @@
         <w:tc>
           <w:tcPr>
             <w:tcW w:type="dxa" w:w="6236"/>
+            <w:vAlign w:val="top"/>
             <w:tcBorders>
-              <w:top w:val="single" w:sz="4" w:space="0" w:color="CCCCCC"/>
-              <w:left w:val="single" w:sz="4" w:space="0" w:color="CCCCCC"/>
-              <w:bottom w:val="single" w:sz="4" w:space="0" w:color="CCCCCC"/>
-              <w:right w:val="single" w:sz="4" w:space="0" w:color="CCCCCC"/>
+              <w:bottom w:val="single" w:sz="4" w:space="4" w:color="E0E0E0"/>
             </w:tcBorders>
-            <w:vAlign w:val="top"/>
-            <w:shd w:val="clear" w:color="auto" w:fill="FDF4EA"/>
           </w:tcPr>
           <w:p>
             <w:pPr>
@@ -2034,6 +2037,7 @@
               <w:rPr>
                 <w:rFonts w:ascii="Arial" w:hAnsi="Arial"/>
                 <w:b w:val="0"/>
+                <w:color w:val="1A1A1A"/>
                 <w:sz w:val="18"/>
               </w:rPr>
               <w:t>auto-start minimized to tray with Windows</w:t>
@@ -2048,13 +2052,10 @@
         <w:tc>
           <w:tcPr>
             <w:tcW w:type="dxa" w:w="3402"/>
+            <w:vAlign w:val="top"/>
             <w:tcBorders>
-              <w:top w:val="single" w:sz="4" w:space="0" w:color="CCCCCC"/>
-              <w:left w:val="single" w:sz="4" w:space="0" w:color="CCCCCC"/>
-              <w:bottom w:val="single" w:sz="4" w:space="0" w:color="CCCCCC"/>
-              <w:right w:val="single" w:sz="4" w:space="0" w:color="CCCCCC"/>
+              <w:bottom w:val="single" w:sz="4" w:space="4" w:color="E0E0E0"/>
             </w:tcBorders>
-            <w:vAlign w:val="top"/>
           </w:tcPr>
           <w:p>
             <w:pPr>
@@ -2065,6 +2066,7 @@
               <w:rPr>
                 <w:rFonts w:ascii="Arial" w:hAnsi="Arial"/>
                 <w:b/>
+                <w:color w:val="1A1A1A"/>
                 <w:sz w:val="18"/>
               </w:rPr>
               <w:t>Always on top</w:t>
@@ -2074,13 +2076,10 @@
         <w:tc>
           <w:tcPr>
             <w:tcW w:type="dxa" w:w="6236"/>
+            <w:vAlign w:val="top"/>
             <w:tcBorders>
-              <w:top w:val="single" w:sz="4" w:space="0" w:color="CCCCCC"/>
-              <w:left w:val="single" w:sz="4" w:space="0" w:color="CCCCCC"/>
-              <w:bottom w:val="single" w:sz="4" w:space="0" w:color="CCCCCC"/>
-              <w:right w:val="single" w:sz="4" w:space="0" w:color="CCCCCC"/>
+              <w:bottom w:val="single" w:sz="4" w:space="4" w:color="E0E0E0"/>
             </w:tcBorders>
-            <w:vAlign w:val="top"/>
           </w:tcPr>
           <w:p>
             <w:pPr>
@@ -2091,6 +2090,7 @@
               <w:rPr>
                 <w:rFonts w:ascii="Arial" w:hAnsi="Arial"/>
                 <w:b w:val="0"/>
+                <w:color w:val="1A1A1A"/>
                 <w:sz w:val="18"/>
               </w:rPr>
               <w:t>window above all others</w:t>
@@ -2105,14 +2105,10 @@
         <w:tc>
           <w:tcPr>
             <w:tcW w:type="dxa" w:w="3402"/>
+            <w:vAlign w:val="top"/>
             <w:tcBorders>
-              <w:top w:val="single" w:sz="4" w:space="0" w:color="CCCCCC"/>
-              <w:left w:val="single" w:sz="4" w:space="0" w:color="CCCCCC"/>
-              <w:bottom w:val="single" w:sz="4" w:space="0" w:color="CCCCCC"/>
-              <w:right w:val="single" w:sz="4" w:space="0" w:color="CCCCCC"/>
+              <w:bottom w:val="single" w:sz="4" w:space="4" w:color="E0E0E0"/>
             </w:tcBorders>
-            <w:vAlign w:val="top"/>
-            <w:shd w:val="clear" w:color="auto" w:fill="FDF4EA"/>
           </w:tcPr>
           <w:p>
             <w:pPr>
@@ -2123,6 +2119,7 @@
               <w:rPr>
                 <w:rFonts w:ascii="Arial" w:hAnsi="Arial"/>
                 <w:b/>
+                <w:color w:val="1A1A1A"/>
                 <w:sz w:val="18"/>
               </w:rPr>
               <w:t>Smooth animation</w:t>
@@ -2132,14 +2129,10 @@
         <w:tc>
           <w:tcPr>
             <w:tcW w:type="dxa" w:w="6236"/>
+            <w:vAlign w:val="top"/>
             <w:tcBorders>
-              <w:top w:val="single" w:sz="4" w:space="0" w:color="CCCCCC"/>
-              <w:left w:val="single" w:sz="4" w:space="0" w:color="CCCCCC"/>
-              <w:bottom w:val="single" w:sz="4" w:space="0" w:color="CCCCCC"/>
-              <w:right w:val="single" w:sz="4" w:space="0" w:color="CCCCCC"/>
+              <w:bottom w:val="single" w:sz="4" w:space="4" w:color="E0E0E0"/>
             </w:tcBorders>
-            <w:vAlign w:val="top"/>
-            <w:shd w:val="clear" w:color="auto" w:fill="FDF4EA"/>
           </w:tcPr>
           <w:p>
             <w:pPr>
@@ -2150,6 +2143,7 @@
               <w:rPr>
                 <w:rFonts w:ascii="Arial" w:hAnsi="Arial"/>
                 <w:b w:val="0"/>
+                <w:color w:val="1A1A1A"/>
                 <w:sz w:val="18"/>
               </w:rPr>
               <w:t>enable/disable panel animation</w:t>
@@ -2164,13 +2158,10 @@
         <w:tc>
           <w:tcPr>
             <w:tcW w:type="dxa" w:w="3402"/>
+            <w:vAlign w:val="top"/>
             <w:tcBorders>
-              <w:top w:val="single" w:sz="4" w:space="0" w:color="CCCCCC"/>
-              <w:left w:val="single" w:sz="4" w:space="0" w:color="CCCCCC"/>
-              <w:bottom w:val="single" w:sz="4" w:space="0" w:color="CCCCCC"/>
-              <w:right w:val="single" w:sz="4" w:space="0" w:color="CCCCCC"/>
+              <w:bottom w:val="single" w:sz="4" w:space="4" w:color="E0E0E0"/>
             </w:tcBorders>
-            <w:vAlign w:val="top"/>
           </w:tcPr>
           <w:p>
             <w:pPr>
@@ -2181,6 +2172,7 @@
               <w:rPr>
                 <w:rFonts w:ascii="Arial" w:hAnsi="Arial"/>
                 <w:b/>
+                <w:color w:val="1A1A1A"/>
                 <w:sz w:val="18"/>
               </w:rPr>
               <w:t>Default OCIO</w:t>
@@ -2190,13 +2182,10 @@
         <w:tc>
           <w:tcPr>
             <w:tcW w:type="dxa" w:w="6236"/>
+            <w:vAlign w:val="top"/>
             <w:tcBorders>
-              <w:top w:val="single" w:sz="4" w:space="0" w:color="CCCCCC"/>
-              <w:left w:val="single" w:sz="4" w:space="0" w:color="CCCCCC"/>
-              <w:bottom w:val="single" w:sz="4" w:space="0" w:color="CCCCCC"/>
-              <w:right w:val="single" w:sz="4" w:space="0" w:color="CCCCCC"/>
+              <w:bottom w:val="single" w:sz="4" w:space="4" w:color="E0E0E0"/>
             </w:tcBorders>
-            <w:vAlign w:val="top"/>
           </w:tcPr>
           <w:p>
             <w:pPr>
@@ -2207,6 +2196,7 @@
               <w:rPr>
                 <w:rFonts w:ascii="Arial" w:hAnsi="Arial"/>
                 <w:b w:val="0"/>
+                <w:color w:val="1A1A1A"/>
                 <w:sz w:val="18"/>
               </w:rPr>
               <w:t>default config for tray launches</w:t>
@@ -2221,14 +2211,10 @@
         <w:tc>
           <w:tcPr>
             <w:tcW w:type="dxa" w:w="3402"/>
+            <w:vAlign w:val="top"/>
             <w:tcBorders>
-              <w:top w:val="single" w:sz="4" w:space="0" w:color="CCCCCC"/>
-              <w:left w:val="single" w:sz="4" w:space="0" w:color="CCCCCC"/>
-              <w:bottom w:val="single" w:sz="4" w:space="0" w:color="CCCCCC"/>
-              <w:right w:val="single" w:sz="4" w:space="0" w:color="CCCCCC"/>
+              <w:bottom w:val="single" w:sz="4" w:space="4" w:color="E0E0E0"/>
             </w:tcBorders>
-            <w:vAlign w:val="top"/>
-            <w:shd w:val="clear" w:color="auto" w:fill="FDF4EA"/>
           </w:tcPr>
           <w:p>
             <w:pPr>
@@ -2239,6 +2225,7 @@
               <w:rPr>
                 <w:rFonts w:ascii="Arial" w:hAnsi="Arial"/>
                 <w:b/>
+                <w:color w:val="1A1A1A"/>
                 <w:sz w:val="18"/>
               </w:rPr>
               <w:t>Scan paths</w:t>
@@ -2248,14 +2235,10 @@
         <w:tc>
           <w:tcPr>
             <w:tcW w:type="dxa" w:w="6236"/>
+            <w:vAlign w:val="top"/>
             <w:tcBorders>
-              <w:top w:val="single" w:sz="4" w:space="0" w:color="CCCCCC"/>
-              <w:left w:val="single" w:sz="4" w:space="0" w:color="CCCCCC"/>
-              <w:bottom w:val="single" w:sz="4" w:space="0" w:color="CCCCCC"/>
-              <w:right w:val="single" w:sz="4" w:space="0" w:color="CCCCCC"/>
+              <w:bottom w:val="single" w:sz="4" w:space="4" w:color="E0E0E0"/>
             </w:tcBorders>
-            <w:vAlign w:val="top"/>
-            <w:shd w:val="clear" w:color="auto" w:fill="FDF4EA"/>
           </w:tcPr>
           <w:p>
             <w:pPr>
@@ -2266,6 +2249,7 @@
               <w:rPr>
                 <w:rFonts w:ascii="Arial" w:hAnsi="Arial"/>
                 <w:b w:val="0"/>
+                <w:color w:val="1A1A1A"/>
                 <w:sz w:val="18"/>
               </w:rPr>
               <w:t>extra folders for the auto-scan</w:t>
@@ -2280,13 +2264,10 @@
         <w:tc>
           <w:tcPr>
             <w:tcW w:type="dxa" w:w="3402"/>
+            <w:vAlign w:val="top"/>
             <w:tcBorders>
-              <w:top w:val="single" w:sz="4" w:space="0" w:color="CCCCCC"/>
-              <w:left w:val="single" w:sz="4" w:space="0" w:color="CCCCCC"/>
-              <w:bottom w:val="single" w:sz="4" w:space="0" w:color="CCCCCC"/>
-              <w:right w:val="single" w:sz="4" w:space="0" w:color="CCCCCC"/>
+              <w:bottom w:val="single" w:sz="8" w:space="4" w:color="000000"/>
             </w:tcBorders>
-            <w:vAlign w:val="top"/>
           </w:tcPr>
           <w:p>
             <w:pPr>
@@ -2296,6 +2277,7 @@
               <w:rPr>
                 <w:rFonts w:ascii="Arial" w:hAnsi="Arial"/>
                 <w:b/>
+                <w:color w:val="1A1A1A"/>
                 <w:sz w:val="18"/>
               </w:rPr>
               <w:t>Shortcuts</w:t>
@@ -2305,13 +2287,10 @@
         <w:tc>
           <w:tcPr>
             <w:tcW w:type="dxa" w:w="6236"/>
+            <w:vAlign w:val="top"/>
             <w:tcBorders>
-              <w:top w:val="single" w:sz="4" w:space="0" w:color="CCCCCC"/>
-              <w:left w:val="single" w:sz="4" w:space="0" w:color="CCCCCC"/>
-              <w:bottom w:val="single" w:sz="4" w:space="0" w:color="CCCCCC"/>
-              <w:right w:val="single" w:sz="4" w:space="0" w:color="CCCCCC"/>
+              <w:bottom w:val="single" w:sz="8" w:space="4" w:color="000000"/>
             </w:tcBorders>
-            <w:vAlign w:val="top"/>
           </w:tcPr>
           <w:p>
             <w:pPr>
@@ -2321,6 +2300,7 @@
               <w:rPr>
                 <w:rFonts w:ascii="Arial" w:hAnsi="Arial"/>
                 <w:b w:val="0"/>
+                <w:color w:val="1A1A1A"/>
                 <w:sz w:val="18"/>
               </w:rPr>
               <w:t>Start Menu and desktop shortcuts</w:t>
@@ -2331,16 +2311,35 @@
     </w:tbl>
     <w:p>
       <w:pPr>
-        <w:spacing w:after="80" w:before="0" w:line="240" w:lineRule="auto"/>
+        <w:spacing w:after="80" w:line="240" w:lineRule="auto"/>
       </w:pPr>
     </w:p>
     <w:p>
       <w:pPr>
         <w:pStyle w:val="Heading1"/>
+        <w:pBdr>
+          <w:left w:val="single" w:sz="24" w:space="8" w:color="C82823"/>
+        </w:pBdr>
       </w:pPr>
       <w:bookmarkStart w:id="100011" w:name="_Toc100011"/>
       <w:r>
-        <w:t>9. Tray and log</w:t>
+        <w:rPr>
+          <w:rFonts w:ascii="Century Gothic" w:hAnsi="Century Gothic"/>
+          <w:b/>
+          <w:color w:val="000000"/>
+          <w:sz w:val="30"/>
+        </w:rPr>
+        <w:t xml:space="preserve">9. </w:t>
+      </w:r>
+      <w:r>
+        <w:rPr>
+          <w:rFonts w:ascii="Century Gothic" w:hAnsi="Century Gothic"/>
+          <w:b/>
+          <w:color w:val="000000"/>
+          <w:sz w:val="30"/>
+          <w:spacing w:val="20"/>
+        </w:rPr>
+        <w:t>TRAY AND LOG</w:t>
       </w:r>
       <w:bookmarkEnd w:id="100011"/>
     </w:p>
@@ -2348,6 +2347,8 @@
       <w:r>
         <w:rPr>
           <w:rFonts w:ascii="Arial" w:hAnsi="Arial"/>
+          <w:i w:val="0"/>
+          <w:color w:val="1A1A1A"/>
           <w:sz w:val="19"/>
         </w:rPr>
         <w:t>Closing the window minimizes the launcher to the system tray - it keeps running. The tray menu offers quick launch of applications under the default config.</w:t>
@@ -2357,6 +2358,8 @@
       <w:r>
         <w:rPr>
           <w:rFonts w:ascii="Arial" w:hAnsi="Arial"/>
+          <w:i w:val="0"/>
+          <w:color w:val="1A1A1A"/>
           <w:sz w:val="19"/>
         </w:rPr>
         <w:t>The Log button opens the log window beside the launcher (same height, to the left or right - wherever it fits). Every launch is logged: timestamp, user, application, OCIO config, exit code. A "Set OCIO=..." line marks that the config was actually passed. The log file lives at %APPDATA%\FLOMASTER\flomaster.log.</w:t>
@@ -2365,16 +2368,34 @@
     <w:p>
       <w:pPr>
         <w:pStyle w:val="Heading1"/>
+        <w:pBdr>
+          <w:left w:val="single" w:sz="24" w:space="8" w:color="C82823"/>
+        </w:pBdr>
       </w:pPr>
       <w:bookmarkStart w:id="100012" w:name="_Toc100012"/>
       <w:r>
-        <w:t>10. Files and folders</w:t>
+        <w:rPr>
+          <w:rFonts w:ascii="Century Gothic" w:hAnsi="Century Gothic"/>
+          <w:b/>
+          <w:color w:val="000000"/>
+          <w:sz w:val="30"/>
+        </w:rPr>
+        <w:t xml:space="preserve">10. </w:t>
+      </w:r>
+      <w:r>
+        <w:rPr>
+          <w:rFonts w:ascii="Century Gothic" w:hAnsi="Century Gothic"/>
+          <w:b/>
+          <w:color w:val="000000"/>
+          <w:sz w:val="30"/>
+          <w:spacing w:val="20"/>
+        </w:rPr>
+        <w:t>FILES AND FOLDERS</w:t>
       </w:r>
       <w:bookmarkEnd w:id="100012"/>
     </w:p>
     <w:tbl>
       <w:tblPr>
-        <w:tblStyle w:val="TableGrid"/>
         <w:tblW w:type="auto" w:w="0"/>
         <w:tblLayout w:type="fixed"/>
         <w:tblLook w:firstColumn="1" w:firstRow="1" w:lastColumn="0" w:lastRow="0" w:noHBand="0" w:noVBand="1" w:val="04A0"/>
@@ -2386,25 +2407,20 @@
         </w:tblCellMar>
       </w:tblPr>
       <w:tblGrid>
-        <w:gridCol w:w="4680"/>
-        <w:gridCol w:w="4680"/>
+        <w:gridCol w:w="4706"/>
+        <w:gridCol w:w="4706"/>
       </w:tblGrid>
       <w:tr>
         <w:trPr>
           <w:cantSplit/>
-          <w:tblHeader/>
         </w:trPr>
         <w:tc>
           <w:tcPr>
             <w:tcW w:type="dxa" w:w="3175"/>
+            <w:vAlign w:val="top"/>
             <w:tcBorders>
-              <w:top w:val="single" w:sz="4" w:space="0" w:color="CCCCCC"/>
-              <w:left w:val="single" w:sz="4" w:space="0" w:color="CCCCCC"/>
-              <w:bottom w:val="single" w:sz="4" w:space="0" w:color="CCCCCC"/>
-              <w:right w:val="single" w:sz="4" w:space="0" w:color="CCCCCC"/>
+              <w:bottom w:val="single" w:sz="12" w:space="4" w:color="C82823"/>
             </w:tcBorders>
-            <w:vAlign w:val="top"/>
-            <w:shd w:val="clear" w:color="auto" w:fill="E87D0D"/>
           </w:tcPr>
           <w:p>
             <w:pPr>
@@ -2413,26 +2429,23 @@
             </w:pPr>
             <w:r>
               <w:rPr>
-                <w:rFonts w:ascii="Arial" w:hAnsi="Arial"/>
+                <w:rFonts w:ascii="Century Gothic" w:hAnsi="Century Gothic"/>
                 <w:b/>
-                <w:color w:val="FFFFFF"/>
-                <w:sz w:val="18"/>
+                <w:color w:val="000000"/>
+                <w:sz w:val="17"/>
+                <w:spacing w:val="20"/>
               </w:rPr>
-              <w:t>Path</w:t>
+              <w:t>PATH</w:t>
             </w:r>
           </w:p>
         </w:tc>
         <w:tc>
           <w:tcPr>
             <w:tcW w:type="dxa" w:w="6463"/>
+            <w:vAlign w:val="top"/>
             <w:tcBorders>
-              <w:top w:val="single" w:sz="4" w:space="0" w:color="CCCCCC"/>
-              <w:left w:val="single" w:sz="4" w:space="0" w:color="CCCCCC"/>
-              <w:bottom w:val="single" w:sz="4" w:space="0" w:color="CCCCCC"/>
-              <w:right w:val="single" w:sz="4" w:space="0" w:color="CCCCCC"/>
+              <w:bottom w:val="single" w:sz="12" w:space="4" w:color="C82823"/>
             </w:tcBorders>
-            <w:vAlign w:val="top"/>
-            <w:shd w:val="clear" w:color="auto" w:fill="E87D0D"/>
           </w:tcPr>
           <w:p>
             <w:pPr>
@@ -2441,12 +2454,13 @@
             </w:pPr>
             <w:r>
               <w:rPr>
-                <w:rFonts w:ascii="Arial" w:hAnsi="Arial"/>
+                <w:rFonts w:ascii="Century Gothic" w:hAnsi="Century Gothic"/>
                 <w:b/>
-                <w:color w:val="FFFFFF"/>
-                <w:sz w:val="18"/>
+                <w:color w:val="000000"/>
+                <w:sz w:val="17"/>
+                <w:spacing w:val="20"/>
               </w:rPr>
-              <w:t>Contents</w:t>
+              <w:t>CONTENTS</w:t>
             </w:r>
           </w:p>
         </w:tc>
@@ -2458,13 +2472,10 @@
         <w:tc>
           <w:tcPr>
             <w:tcW w:type="dxa" w:w="3175"/>
+            <w:vAlign w:val="top"/>
             <w:tcBorders>
-              <w:top w:val="single" w:sz="4" w:space="0" w:color="CCCCCC"/>
-              <w:left w:val="single" w:sz="4" w:space="0" w:color="CCCCCC"/>
-              <w:bottom w:val="single" w:sz="4" w:space="0" w:color="CCCCCC"/>
-              <w:right w:val="single" w:sz="4" w:space="0" w:color="CCCCCC"/>
+              <w:bottom w:val="single" w:sz="4" w:space="4" w:color="E0E0E0"/>
             </w:tcBorders>
-            <w:vAlign w:val="top"/>
           </w:tcPr>
           <w:p>
             <w:pPr>
@@ -2475,6 +2486,7 @@
               <w:rPr>
                 <w:rFonts w:ascii="Arial" w:hAnsi="Arial"/>
                 <w:b/>
+                <w:color w:val="1A1A1A"/>
                 <w:sz w:val="18"/>
               </w:rPr>
               <w:t>installation folder</w:t>
@@ -2484,13 +2496,10 @@
         <w:tc>
           <w:tcPr>
             <w:tcW w:type="dxa" w:w="6463"/>
+            <w:vAlign w:val="top"/>
             <w:tcBorders>
-              <w:top w:val="single" w:sz="4" w:space="0" w:color="CCCCCC"/>
-              <w:left w:val="single" w:sz="4" w:space="0" w:color="CCCCCC"/>
-              <w:bottom w:val="single" w:sz="4" w:space="0" w:color="CCCCCC"/>
-              <w:right w:val="single" w:sz="4" w:space="0" w:color="CCCCCC"/>
+              <w:bottom w:val="single" w:sz="4" w:space="4" w:color="E0E0E0"/>
             </w:tcBorders>
-            <w:vAlign w:val="top"/>
           </w:tcPr>
           <w:p>
             <w:pPr>
@@ -2501,6 +2510,7 @@
               <w:rPr>
                 <w:rFonts w:ascii="Arial" w:hAnsi="Arial"/>
                 <w:b w:val="0"/>
+                <w:color w:val="1A1A1A"/>
                 <w:sz w:val="18"/>
               </w:rPr>
               <w:t>FLOMASTER.exe, flomaster.ico, ocio/ (ACES 1.2 config + luts/), LICENSE.txt</w:t>
@@ -2515,14 +2525,10 @@
         <w:tc>
           <w:tcPr>
             <w:tcW w:type="dxa" w:w="3175"/>
+            <w:vAlign w:val="top"/>
             <w:tcBorders>
-              <w:top w:val="single" w:sz="4" w:space="0" w:color="CCCCCC"/>
-              <w:left w:val="single" w:sz="4" w:space="0" w:color="CCCCCC"/>
-              <w:bottom w:val="single" w:sz="4" w:space="0" w:color="CCCCCC"/>
-              <w:right w:val="single" w:sz="4" w:space="0" w:color="CCCCCC"/>
+              <w:bottom w:val="single" w:sz="8" w:space="4" w:color="000000"/>
             </w:tcBorders>
-            <w:vAlign w:val="top"/>
-            <w:shd w:val="clear" w:color="auto" w:fill="FDF4EA"/>
           </w:tcPr>
           <w:p>
             <w:pPr>
@@ -2532,6 +2538,7 @@
               <w:rPr>
                 <w:rFonts w:ascii="Arial" w:hAnsi="Arial"/>
                 <w:b/>
+                <w:color w:val="1A1A1A"/>
                 <w:sz w:val="18"/>
               </w:rPr>
               <w:t>%APPDATA%\FLOMASTER\</w:t>
@@ -2541,14 +2548,10 @@
         <w:tc>
           <w:tcPr>
             <w:tcW w:type="dxa" w:w="6463"/>
+            <w:vAlign w:val="top"/>
             <w:tcBorders>
-              <w:top w:val="single" w:sz="4" w:space="0" w:color="CCCCCC"/>
-              <w:left w:val="single" w:sz="4" w:space="0" w:color="CCCCCC"/>
-              <w:bottom w:val="single" w:sz="4" w:space="0" w:color="CCCCCC"/>
-              <w:right w:val="single" w:sz="4" w:space="0" w:color="CCCCCC"/>
+              <w:bottom w:val="single" w:sz="8" w:space="4" w:color="000000"/>
             </w:tcBorders>
-            <w:vAlign w:val="top"/>
-            <w:shd w:val="clear" w:color="auto" w:fill="FDF4EA"/>
           </w:tcPr>
           <w:p>
             <w:pPr>
@@ -2558,6 +2561,7 @@
               <w:rPr>
                 <w:rFonts w:ascii="Arial" w:hAnsi="Arial"/>
                 <w:b w:val="0"/>
+                <w:color w:val="1A1A1A"/>
                 <w:sz w:val="18"/>
               </w:rPr>
               <w:t>launcher_config.json (settings), flomaster.log (log)</w:t>
@@ -2568,13 +2572,15 @@
     </w:tbl>
     <w:p>
       <w:pPr>
-        <w:spacing w:after="80" w:before="0" w:line="240" w:lineRule="auto"/>
+        <w:spacing w:after="80" w:line="240" w:lineRule="auto"/>
       </w:pPr>
     </w:p>
     <w:p>
       <w:r>
         <w:rPr>
           <w:rFonts w:ascii="Arial" w:hAnsi="Arial"/>
+          <w:i w:val="0"/>
+          <w:color w:val="1A1A1A"/>
           <w:sz w:val="19"/>
         </w:rPr>
         <w:t>The program and user data are deliberately separated: reinstalling and updating never touch settings, presets or the log.</w:t>
@@ -2583,10 +2589,29 @@
     <w:p>
       <w:pPr>
         <w:pStyle w:val="Heading1"/>
+        <w:pBdr>
+          <w:left w:val="single" w:sz="24" w:space="8" w:color="C82823"/>
+        </w:pBdr>
       </w:pPr>
       <w:bookmarkStart w:id="100013" w:name="_Toc100013"/>
       <w:r>
-        <w:t>11. Workflows</w:t>
+        <w:rPr>
+          <w:rFonts w:ascii="Century Gothic" w:hAnsi="Century Gothic"/>
+          <w:b/>
+          <w:color w:val="000000"/>
+          <w:sz w:val="30"/>
+        </w:rPr>
+        <w:t xml:space="preserve">11. </w:t>
+      </w:r>
+      <w:r>
+        <w:rPr>
+          <w:rFonts w:ascii="Century Gothic" w:hAnsi="Century Gothic"/>
+          <w:b/>
+          <w:color w:val="000000"/>
+          <w:sz w:val="30"/>
+          <w:spacing w:val="20"/>
+        </w:rPr>
+        <w:t>WORKFLOWS</w:t>
       </w:r>
       <w:bookmarkEnd w:id="100013"/>
     </w:p>
@@ -2604,6 +2629,8 @@
       <w:r>
         <w:rPr>
           <w:rFonts w:ascii="Arial" w:hAnsi="Arial"/>
+          <w:i w:val="0"/>
+          <w:color w:val="1A1A1A"/>
           <w:sz w:val="19"/>
         </w:rPr>
         <w:t>Launcher window → Launch on the application you need. Everything you start that day runs on the same config - files travel between applications without color surprises.</w:t>
@@ -2623,6 +2650,8 @@
       <w:r>
         <w:rPr>
           <w:rFonts w:ascii="Arial" w:hAnsi="Arial"/>
+          <w:i w:val="0"/>
+          <w:color w:val="1A1A1A"/>
           <w:sz w:val="19"/>
         </w:rPr>
         <w:t>Float images (EXR) open as acescg - the color cycle is correct right away. 8-bit images open as raw: the right default for data maps (normals, masks, roughness) with no manual clicks. Assign a colorspace manually to a color 8-bit map if it opened as raw.</w:t>
@@ -2642,6 +2671,8 @@
       <w:r>
         <w:rPr>
           <w:rFonts w:ascii="Arial" w:hAnsi="Arial"/>
+          <w:i w:val="0"/>
+          <w:color w:val="1A1A1A"/>
           <w:sz w:val="19"/>
         </w:rPr>
         <w:t>Drag the scene file onto the application card - or use Recent to reopen the last file without hunting for it in the file manager.</w:t>
@@ -2661,6 +2692,8 @@
       <w:r>
         <w:rPr>
           <w:rFonts w:ascii="Arial" w:hAnsi="Arial"/>
+          <w:i w:val="0"/>
+          <w:color w:val="1A1A1A"/>
           <w:sz w:val="19"/>
         </w:rPr>
         <w:t>Create one preset per version (drag the exe + name) and start the one you need with a click; the version arguments live in the preset Quick Commands.</w:t>
@@ -2669,16 +2702,34 @@
     <w:p>
       <w:pPr>
         <w:pStyle w:val="Heading1"/>
+        <w:pBdr>
+          <w:left w:val="single" w:sz="24" w:space="8" w:color="C82823"/>
+        </w:pBdr>
       </w:pPr>
       <w:bookmarkStart w:id="100018" w:name="_Toc100018"/>
       <w:r>
-        <w:t>12. Troubleshooting</w:t>
+        <w:rPr>
+          <w:rFonts w:ascii="Century Gothic" w:hAnsi="Century Gothic"/>
+          <w:b/>
+          <w:color w:val="000000"/>
+          <w:sz w:val="30"/>
+        </w:rPr>
+        <w:t xml:space="preserve">12. </w:t>
+      </w:r>
+      <w:r>
+        <w:rPr>
+          <w:rFonts w:ascii="Century Gothic" w:hAnsi="Century Gothic"/>
+          <w:b/>
+          <w:color w:val="000000"/>
+          <w:sz w:val="30"/>
+          <w:spacing w:val="20"/>
+        </w:rPr>
+        <w:t>TROUBLESHOOTING</w:t>
       </w:r>
       <w:bookmarkEnd w:id="100018"/>
     </w:p>
     <w:tbl>
       <w:tblPr>
-        <w:tblStyle w:val="TableGrid"/>
         <w:tblW w:type="auto" w:w="0"/>
         <w:tblLayout w:type="fixed"/>
         <w:tblLook w:firstColumn="1" w:firstRow="1" w:lastColumn="0" w:lastRow="0" w:noHBand="0" w:noVBand="1" w:val="04A0"/>
@@ -2690,26 +2741,21 @@
         </w:tblCellMar>
       </w:tblPr>
       <w:tblGrid>
-        <w:gridCol w:w="3120"/>
-        <w:gridCol w:w="3120"/>
-        <w:gridCol w:w="3120"/>
+        <w:gridCol w:w="3137"/>
+        <w:gridCol w:w="3137"/>
+        <w:gridCol w:w="3137"/>
       </w:tblGrid>
       <w:tr>
         <w:trPr>
           <w:cantSplit/>
-          <w:tblHeader/>
         </w:trPr>
         <w:tc>
           <w:tcPr>
             <w:tcW w:type="dxa" w:w="2608"/>
+            <w:vAlign w:val="top"/>
             <w:tcBorders>
-              <w:top w:val="single" w:sz="4" w:space="0" w:color="CCCCCC"/>
-              <w:left w:val="single" w:sz="4" w:space="0" w:color="CCCCCC"/>
-              <w:bottom w:val="single" w:sz="4" w:space="0" w:color="CCCCCC"/>
-              <w:right w:val="single" w:sz="4" w:space="0" w:color="CCCCCC"/>
+              <w:bottom w:val="single" w:sz="12" w:space="4" w:color="C82823"/>
             </w:tcBorders>
-            <w:vAlign w:val="top"/>
-            <w:shd w:val="clear" w:color="auto" w:fill="E87D0D"/>
           </w:tcPr>
           <w:p>
             <w:pPr>
@@ -2718,26 +2764,23 @@
             </w:pPr>
             <w:r>
               <w:rPr>
-                <w:rFonts w:ascii="Arial" w:hAnsi="Arial"/>
+                <w:rFonts w:ascii="Century Gothic" w:hAnsi="Century Gothic"/>
                 <w:b/>
-                <w:color w:val="FFFFFF"/>
-                <w:sz w:val="18"/>
+                <w:color w:val="000000"/>
+                <w:sz w:val="17"/>
+                <w:spacing w:val="20"/>
               </w:rPr>
-              <w:t>Symptom</w:t>
+              <w:t>SYMPTOM</w:t>
             </w:r>
           </w:p>
         </w:tc>
         <w:tc>
           <w:tcPr>
             <w:tcW w:type="dxa" w:w="3061"/>
+            <w:vAlign w:val="top"/>
             <w:tcBorders>
-              <w:top w:val="single" w:sz="4" w:space="0" w:color="CCCCCC"/>
-              <w:left w:val="single" w:sz="4" w:space="0" w:color="CCCCCC"/>
-              <w:bottom w:val="single" w:sz="4" w:space="0" w:color="CCCCCC"/>
-              <w:right w:val="single" w:sz="4" w:space="0" w:color="CCCCCC"/>
+              <w:bottom w:val="single" w:sz="12" w:space="4" w:color="C82823"/>
             </w:tcBorders>
-            <w:vAlign w:val="top"/>
-            <w:shd w:val="clear" w:color="auto" w:fill="E87D0D"/>
           </w:tcPr>
           <w:p>
             <w:pPr>
@@ -2746,26 +2789,23 @@
             </w:pPr>
             <w:r>
               <w:rPr>
-                <w:rFonts w:ascii="Arial" w:hAnsi="Arial"/>
+                <w:rFonts w:ascii="Century Gothic" w:hAnsi="Century Gothic"/>
                 <w:b/>
-                <w:color w:val="FFFFFF"/>
-                <w:sz w:val="18"/>
+                <w:color w:val="000000"/>
+                <w:sz w:val="17"/>
+                <w:spacing w:val="20"/>
               </w:rPr>
-              <w:t>Cause</w:t>
+              <w:t>CAUSE</w:t>
             </w:r>
           </w:p>
         </w:tc>
         <w:tc>
           <w:tcPr>
             <w:tcW w:type="dxa" w:w="3969"/>
+            <w:vAlign w:val="top"/>
             <w:tcBorders>
-              <w:top w:val="single" w:sz="4" w:space="0" w:color="CCCCCC"/>
-              <w:left w:val="single" w:sz="4" w:space="0" w:color="CCCCCC"/>
-              <w:bottom w:val="single" w:sz="4" w:space="0" w:color="CCCCCC"/>
-              <w:right w:val="single" w:sz="4" w:space="0" w:color="CCCCCC"/>
+              <w:bottom w:val="single" w:sz="12" w:space="4" w:color="C82823"/>
             </w:tcBorders>
-            <w:vAlign w:val="top"/>
-            <w:shd w:val="clear" w:color="auto" w:fill="E87D0D"/>
           </w:tcPr>
           <w:p>
             <w:pPr>
@@ -2774,12 +2814,13 @@
             </w:pPr>
             <w:r>
               <w:rPr>
-                <w:rFonts w:ascii="Arial" w:hAnsi="Arial"/>
+                <w:rFonts w:ascii="Century Gothic" w:hAnsi="Century Gothic"/>
                 <w:b/>
-                <w:color w:val="FFFFFF"/>
-                <w:sz w:val="18"/>
+                <w:color w:val="000000"/>
+                <w:sz w:val="17"/>
+                <w:spacing w:val="20"/>
               </w:rPr>
-              <w:t>What to do</w:t>
+              <w:t>WHAT TO DO</w:t>
             </w:r>
           </w:p>
         </w:tc>
@@ -2791,13 +2832,10 @@
         <w:tc>
           <w:tcPr>
             <w:tcW w:type="dxa" w:w="2608"/>
+            <w:vAlign w:val="top"/>
             <w:tcBorders>
-              <w:top w:val="single" w:sz="4" w:space="0" w:color="CCCCCC"/>
-              <w:left w:val="single" w:sz="4" w:space="0" w:color="CCCCCC"/>
-              <w:bottom w:val="single" w:sz="4" w:space="0" w:color="CCCCCC"/>
-              <w:right w:val="single" w:sz="4" w:space="0" w:color="CCCCCC"/>
+              <w:bottom w:val="single" w:sz="4" w:space="4" w:color="E0E0E0"/>
             </w:tcBorders>
-            <w:vAlign w:val="top"/>
           </w:tcPr>
           <w:p>
             <w:pPr>
@@ -2808,6 +2846,7 @@
               <w:rPr>
                 <w:rFonts w:ascii="Arial" w:hAnsi="Arial"/>
                 <w:b/>
+                <w:color w:val="1A1A1A"/>
                 <w:sz w:val="18"/>
               </w:rPr>
               <w:t>Application missing after installation</w:t>
@@ -2817,13 +2856,10 @@
         <w:tc>
           <w:tcPr>
             <w:tcW w:type="dxa" w:w="3061"/>
+            <w:vAlign w:val="top"/>
             <w:tcBorders>
-              <w:top w:val="single" w:sz="4" w:space="0" w:color="CCCCCC"/>
-              <w:left w:val="single" w:sz="4" w:space="0" w:color="CCCCCC"/>
-              <w:bottom w:val="single" w:sz="4" w:space="0" w:color="CCCCCC"/>
-              <w:right w:val="single" w:sz="4" w:space="0" w:color="CCCCCC"/>
+              <w:bottom w:val="single" w:sz="4" w:space="4" w:color="E0E0E0"/>
             </w:tcBorders>
-            <w:vAlign w:val="top"/>
           </w:tcPr>
           <w:p>
             <w:pPr>
@@ -2834,6 +2870,7 @@
               <w:rPr>
                 <w:rFonts w:ascii="Arial" w:hAnsi="Arial"/>
                 <w:b w:val="0"/>
+                <w:color w:val="1A1A1A"/>
                 <w:sz w:val="18"/>
               </w:rPr>
               <w:t>non-standard install folder</w:t>
@@ -2843,13 +2880,10 @@
         <w:tc>
           <w:tcPr>
             <w:tcW w:type="dxa" w:w="3969"/>
+            <w:vAlign w:val="top"/>
             <w:tcBorders>
-              <w:top w:val="single" w:sz="4" w:space="0" w:color="CCCCCC"/>
-              <w:left w:val="single" w:sz="4" w:space="0" w:color="CCCCCC"/>
-              <w:bottom w:val="single" w:sz="4" w:space="0" w:color="CCCCCC"/>
-              <w:right w:val="single" w:sz="4" w:space="0" w:color="CCCCCC"/>
+              <w:bottom w:val="single" w:sz="4" w:space="4" w:color="E0E0E0"/>
             </w:tcBorders>
-            <w:vAlign w:val="top"/>
           </w:tcPr>
           <w:p>
             <w:pPr>
@@ -2860,6 +2894,7 @@
               <w:rPr>
                 <w:rFonts w:ascii="Arial" w:hAnsi="Arial"/>
                 <w:b w:val="0"/>
+                <w:color w:val="1A1A1A"/>
                 <w:sz w:val="18"/>
               </w:rPr>
               <w:t>add the folder in Settings → Scan paths or create a preset by dragging the exe</w:t>
@@ -2874,14 +2909,10 @@
         <w:tc>
           <w:tcPr>
             <w:tcW w:type="dxa" w:w="2608"/>
+            <w:vAlign w:val="top"/>
             <w:tcBorders>
-              <w:top w:val="single" w:sz="4" w:space="0" w:color="CCCCCC"/>
-              <w:left w:val="single" w:sz="4" w:space="0" w:color="CCCCCC"/>
-              <w:bottom w:val="single" w:sz="4" w:space="0" w:color="CCCCCC"/>
-              <w:right w:val="single" w:sz="4" w:space="0" w:color="CCCCCC"/>
+              <w:bottom w:val="single" w:sz="4" w:space="4" w:color="E0E0E0"/>
             </w:tcBorders>
-            <w:vAlign w:val="top"/>
-            <w:shd w:val="clear" w:color="auto" w:fill="FDF4EA"/>
           </w:tcPr>
           <w:p>
             <w:pPr>
@@ -2892,6 +2923,7 @@
               <w:rPr>
                 <w:rFonts w:ascii="Arial" w:hAnsi="Arial"/>
                 <w:b/>
+                <w:color w:val="1A1A1A"/>
                 <w:sz w:val="18"/>
               </w:rPr>
               <w:t>Unreal started with the wrong color</w:t>
@@ -2901,14 +2933,10 @@
         <w:tc>
           <w:tcPr>
             <w:tcW w:type="dxa" w:w="3061"/>
+            <w:vAlign w:val="top"/>
             <w:tcBorders>
-              <w:top w:val="single" w:sz="4" w:space="0" w:color="CCCCCC"/>
-              <w:left w:val="single" w:sz="4" w:space="0" w:color="CCCCCC"/>
-              <w:bottom w:val="single" w:sz="4" w:space="0" w:color="CCCCCC"/>
-              <w:right w:val="single" w:sz="4" w:space="0" w:color="CCCCCC"/>
+              <w:bottom w:val="single" w:sz="4" w:space="4" w:color="E0E0E0"/>
             </w:tcBorders>
-            <w:vAlign w:val="top"/>
-            <w:shd w:val="clear" w:color="auto" w:fill="FDF4EA"/>
           </w:tcPr>
           <w:p>
             <w:pPr>
@@ -2919,6 +2947,7 @@
               <w:rPr>
                 <w:rFonts w:ascii="Arial" w:hAnsi="Arial"/>
                 <w:b w:val="0"/>
+                <w:color w:val="1A1A1A"/>
                 <w:sz w:val="18"/>
               </w:rPr>
               <w:t>Unreal does not read the OCIO variable</w:t>
@@ -2928,14 +2957,10 @@
         <w:tc>
           <w:tcPr>
             <w:tcW w:type="dxa" w:w="3969"/>
+            <w:vAlign w:val="top"/>
             <w:tcBorders>
-              <w:top w:val="single" w:sz="4" w:space="0" w:color="CCCCCC"/>
-              <w:left w:val="single" w:sz="4" w:space="0" w:color="CCCCCC"/>
-              <w:bottom w:val="single" w:sz="4" w:space="0" w:color="CCCCCC"/>
-              <w:right w:val="single" w:sz="4" w:space="0" w:color="CCCCCC"/>
+              <w:bottom w:val="single" w:sz="4" w:space="4" w:color="E0E0E0"/>
             </w:tcBorders>
-            <w:vAlign w:val="top"/>
-            <w:shd w:val="clear" w:color="auto" w:fill="FDF4EA"/>
           </w:tcPr>
           <w:p>
             <w:pPr>
@@ -2946,6 +2971,7 @@
               <w:rPr>
                 <w:rFonts w:ascii="Arial" w:hAnsi="Arial"/>
                 <w:b w:val="0"/>
+                <w:color w:val="1A1A1A"/>
                 <w:sz w:val="18"/>
               </w:rPr>
               <w:t>keep the -ocio= argument in the preset arguments - that is how the launcher passes the config</w:t>
@@ -2960,13 +2986,10 @@
         <w:tc>
           <w:tcPr>
             <w:tcW w:type="dxa" w:w="2608"/>
+            <w:vAlign w:val="top"/>
             <w:tcBorders>
-              <w:top w:val="single" w:sz="4" w:space="0" w:color="CCCCCC"/>
-              <w:left w:val="single" w:sz="4" w:space="0" w:color="CCCCCC"/>
-              <w:bottom w:val="single" w:sz="4" w:space="0" w:color="CCCCCC"/>
-              <w:right w:val="single" w:sz="4" w:space="0" w:color="CCCCCC"/>
+              <w:bottom w:val="single" w:sz="4" w:space="4" w:color="E0E0E0"/>
             </w:tcBorders>
-            <w:vAlign w:val="top"/>
           </w:tcPr>
           <w:p>
             <w:pPr>
@@ -2977,6 +3000,7 @@
               <w:rPr>
                 <w:rFonts w:ascii="Arial" w:hAnsi="Arial"/>
                 <w:b/>
+                <w:color w:val="1A1A1A"/>
                 <w:sz w:val="18"/>
               </w:rPr>
               <w:t>Error «enum "Non-Color" not found» on import</w:t>
@@ -2986,13 +3010,10 @@
         <w:tc>
           <w:tcPr>
             <w:tcW w:type="dxa" w:w="3061"/>
+            <w:vAlign w:val="top"/>
             <w:tcBorders>
-              <w:top w:val="single" w:sz="4" w:space="0" w:color="CCCCCC"/>
-              <w:left w:val="single" w:sz="4" w:space="0" w:color="CCCCCC"/>
-              <w:bottom w:val="single" w:sz="4" w:space="0" w:color="CCCCCC"/>
-              <w:right w:val="single" w:sz="4" w:space="0" w:color="CCCCCC"/>
+              <w:bottom w:val="single" w:sz="4" w:space="4" w:color="E0E0E0"/>
             </w:tcBorders>
-            <w:vAlign w:val="top"/>
           </w:tcPr>
           <w:p>
             <w:pPr>
@@ -3003,6 +3024,7 @@
               <w:rPr>
                 <w:rFonts w:ascii="Arial" w:hAnsi="Arial"/>
                 <w:b w:val="0"/>
+                <w:color w:val="1A1A1A"/>
                 <w:sz w:val="18"/>
               </w:rPr>
               <w:t>the bundled config has no colorspace named Non-Color (the raw alias exists)</w:t>
@@ -3012,13 +3034,10 @@
         <w:tc>
           <w:tcPr>
             <w:tcW w:type="dxa" w:w="3969"/>
+            <w:vAlign w:val="top"/>
             <w:tcBorders>
-              <w:top w:val="single" w:sz="4" w:space="0" w:color="CCCCCC"/>
-              <w:left w:val="single" w:sz="4" w:space="0" w:color="CCCCCC"/>
-              <w:bottom w:val="single" w:sz="4" w:space="0" w:color="CCCCCC"/>
-              <w:right w:val="single" w:sz="4" w:space="0" w:color="CCCCCC"/>
+              <w:bottom w:val="single" w:sz="4" w:space="4" w:color="E0E0E0"/>
             </w:tcBorders>
-            <w:vAlign w:val="top"/>
           </w:tcPr>
           <w:p>
             <w:pPr>
@@ -3029,6 +3048,7 @@
               <w:rPr>
                 <w:rFonts w:ascii="Arial" w:hAnsi="Arial"/>
                 <w:b w:val="0"/>
+                <w:color w:val="1A1A1A"/>
                 <w:sz w:val="18"/>
               </w:rPr>
               <w:t>import outside this OCIO config, or add a colorspace/alias with that name to the config</w:t>
@@ -3043,14 +3063,10 @@
         <w:tc>
           <w:tcPr>
             <w:tcW w:type="dxa" w:w="2608"/>
+            <w:vAlign w:val="top"/>
             <w:tcBorders>
-              <w:top w:val="single" w:sz="4" w:space="0" w:color="CCCCCC"/>
-              <w:left w:val="single" w:sz="4" w:space="0" w:color="CCCCCC"/>
-              <w:bottom w:val="single" w:sz="4" w:space="0" w:color="CCCCCC"/>
-              <w:right w:val="single" w:sz="4" w:space="0" w:color="CCCCCC"/>
+              <w:bottom w:val="single" w:sz="4" w:space="4" w:color="E0E0E0"/>
             </w:tcBorders>
-            <w:vAlign w:val="top"/>
-            <w:shd w:val="clear" w:color="auto" w:fill="FDF4EA"/>
           </w:tcPr>
           <w:p>
             <w:pPr>
@@ -3061,6 +3077,7 @@
               <w:rPr>
                 <w:rFonts w:ascii="Arial" w:hAnsi="Arial"/>
                 <w:b/>
+                <w:color w:val="1A1A1A"/>
                 <w:sz w:val="18"/>
               </w:rPr>
               <w:t>A color 8-bit map opened as raw</w:t>
@@ -3070,14 +3087,10 @@
         <w:tc>
           <w:tcPr>
             <w:tcW w:type="dxa" w:w="3061"/>
+            <w:vAlign w:val="top"/>
             <w:tcBorders>
-              <w:top w:val="single" w:sz="4" w:space="0" w:color="CCCCCC"/>
-              <w:left w:val="single" w:sz="4" w:space="0" w:color="CCCCCC"/>
-              <w:bottom w:val="single" w:sz="4" w:space="0" w:color="CCCCCC"/>
-              <w:right w:val="single" w:sz="4" w:space="0" w:color="CCCCCC"/>
+              <w:bottom w:val="single" w:sz="4" w:space="4" w:color="E0E0E0"/>
             </w:tcBorders>
-            <w:vAlign w:val="top"/>
-            <w:shd w:val="clear" w:color="auto" w:fill="FDF4EA"/>
           </w:tcPr>
           <w:p>
             <w:pPr>
@@ -3088,6 +3101,7 @@
               <w:rPr>
                 <w:rFonts w:ascii="Arial" w:hAnsi="Arial"/>
                 <w:b w:val="0"/>
+                <w:color w:val="1A1A1A"/>
                 <w:sz w:val="18"/>
               </w:rPr>
               <w:t>the default_byte role in the config is raw (the default for data maps)</w:t>
@@ -3097,14 +3111,10 @@
         <w:tc>
           <w:tcPr>
             <w:tcW w:type="dxa" w:w="3969"/>
+            <w:vAlign w:val="top"/>
             <w:tcBorders>
-              <w:top w:val="single" w:sz="4" w:space="0" w:color="CCCCCC"/>
-              <w:left w:val="single" w:sz="4" w:space="0" w:color="CCCCCC"/>
-              <w:bottom w:val="single" w:sz="4" w:space="0" w:color="CCCCCC"/>
-              <w:right w:val="single" w:sz="4" w:space="0" w:color="CCCCCC"/>
+              <w:bottom w:val="single" w:sz="4" w:space="4" w:color="E0E0E0"/>
             </w:tcBorders>
-            <w:vAlign w:val="top"/>
-            <w:shd w:val="clear" w:color="auto" w:fill="FDF4EA"/>
           </w:tcPr>
           <w:p>
             <w:pPr>
@@ -3115,6 +3125,7 @@
               <w:rPr>
                 <w:rFonts w:ascii="Arial" w:hAnsi="Arial"/>
                 <w:b w:val="0"/>
+                <w:color w:val="1A1A1A"/>
                 <w:sz w:val="18"/>
               </w:rPr>
               <w:t>assign a colorspace manually to that map: sRGB space for 8-bit color, acescg for float</w:t>
@@ -3129,13 +3140,10 @@
         <w:tc>
           <w:tcPr>
             <w:tcW w:type="dxa" w:w="2608"/>
+            <w:vAlign w:val="top"/>
             <w:tcBorders>
-              <w:top w:val="single" w:sz="4" w:space="0" w:color="CCCCCC"/>
-              <w:left w:val="single" w:sz="4" w:space="0" w:color="CCCCCC"/>
-              <w:bottom w:val="single" w:sz="4" w:space="0" w:color="CCCCCC"/>
-              <w:right w:val="single" w:sz="4" w:space="0" w:color="CCCCCC"/>
+              <w:bottom w:val="single" w:sz="4" w:space="4" w:color="E0E0E0"/>
             </w:tcBorders>
-            <w:vAlign w:val="top"/>
           </w:tcPr>
           <w:p>
             <w:pPr>
@@ -3146,6 +3154,7 @@
               <w:rPr>
                 <w:rFonts w:ascii="Arial" w:hAnsi="Arial"/>
                 <w:b/>
+                <w:color w:val="1A1A1A"/>
                 <w:sz w:val="18"/>
               </w:rPr>
               <w:t>Log window is nowhere to be seen</w:t>
@@ -3155,13 +3164,10 @@
         <w:tc>
           <w:tcPr>
             <w:tcW w:type="dxa" w:w="3061"/>
+            <w:vAlign w:val="top"/>
             <w:tcBorders>
-              <w:top w:val="single" w:sz="4" w:space="0" w:color="CCCCCC"/>
-              <w:left w:val="single" w:sz="4" w:space="0" w:color="CCCCCC"/>
-              <w:bottom w:val="single" w:sz="4" w:space="0" w:color="CCCCCC"/>
-              <w:right w:val="single" w:sz="4" w:space="0" w:color="CCCCCC"/>
+              <w:bottom w:val="single" w:sz="4" w:space="4" w:color="E0E0E0"/>
             </w:tcBorders>
-            <w:vAlign w:val="top"/>
           </w:tcPr>
           <w:p>
             <w:pPr>
@@ -3172,6 +3178,7 @@
               <w:rPr>
                 <w:rFonts w:ascii="Arial" w:hAnsi="Arial"/>
                 <w:b w:val="0"/>
+                <w:color w:val="1A1A1A"/>
                 <w:sz w:val="18"/>
               </w:rPr>
               <w:t>it opens beside the launcher, at the same height</w:t>
@@ -3181,13 +3188,10 @@
         <w:tc>
           <w:tcPr>
             <w:tcW w:type="dxa" w:w="3969"/>
+            <w:vAlign w:val="top"/>
             <w:tcBorders>
-              <w:top w:val="single" w:sz="4" w:space="0" w:color="CCCCCC"/>
-              <w:left w:val="single" w:sz="4" w:space="0" w:color="CCCCCC"/>
-              <w:bottom w:val="single" w:sz="4" w:space="0" w:color="CCCCCC"/>
-              <w:right w:val="single" w:sz="4" w:space="0" w:color="CCCCCC"/>
+              <w:bottom w:val="single" w:sz="4" w:space="4" w:color="E0E0E0"/>
             </w:tcBorders>
-            <w:vAlign w:val="top"/>
           </w:tcPr>
           <w:p>
             <w:pPr>
@@ -3198,6 +3202,7 @@
               <w:rPr>
                 <w:rFonts w:ascii="Arial" w:hAnsi="Arial"/>
                 <w:b w:val="0"/>
+                <w:color w:val="1A1A1A"/>
                 <w:sz w:val="18"/>
               </w:rPr>
               <w:t>look to the left/right of the launcher window</w:t>
@@ -3212,14 +3217,10 @@
         <w:tc>
           <w:tcPr>
             <w:tcW w:type="dxa" w:w="2608"/>
+            <w:vAlign w:val="top"/>
             <w:tcBorders>
-              <w:top w:val="single" w:sz="4" w:space="0" w:color="CCCCCC"/>
-              <w:left w:val="single" w:sz="4" w:space="0" w:color="CCCCCC"/>
-              <w:bottom w:val="single" w:sz="4" w:space="0" w:color="CCCCCC"/>
-              <w:right w:val="single" w:sz="4" w:space="0" w:color="CCCCCC"/>
+              <w:bottom w:val="single" w:sz="4" w:space="4" w:color="E0E0E0"/>
             </w:tcBorders>
-            <w:vAlign w:val="top"/>
-            <w:shd w:val="clear" w:color="auto" w:fill="FDF4EA"/>
           </w:tcPr>
           <w:p>
             <w:pPr>
@@ -3230,6 +3231,7 @@
               <w:rPr>
                 <w:rFonts w:ascii="Arial" w:hAnsi="Arial"/>
                 <w:b/>
+                <w:color w:val="1A1A1A"/>
                 <w:sz w:val="18"/>
               </w:rPr>
               <w:t>Settings and log "disappeared" after reinstall</w:t>
@@ -3239,14 +3241,10 @@
         <w:tc>
           <w:tcPr>
             <w:tcW w:type="dxa" w:w="3061"/>
+            <w:vAlign w:val="top"/>
             <w:tcBorders>
-              <w:top w:val="single" w:sz="4" w:space="0" w:color="CCCCCC"/>
-              <w:left w:val="single" w:sz="4" w:space="0" w:color="CCCCCC"/>
-              <w:bottom w:val="single" w:sz="4" w:space="0" w:color="CCCCCC"/>
-              <w:right w:val="single" w:sz="4" w:space="0" w:color="CCCCCC"/>
+              <w:bottom w:val="single" w:sz="4" w:space="4" w:color="E0E0E0"/>
             </w:tcBorders>
-            <w:vAlign w:val="top"/>
-            <w:shd w:val="clear" w:color="auto" w:fill="FDF4EA"/>
           </w:tcPr>
           <w:p>
             <w:pPr>
@@ -3257,6 +3255,7 @@
               <w:rPr>
                 <w:rFonts w:ascii="Arial" w:hAnsi="Arial"/>
                 <w:b w:val="0"/>
+                <w:color w:val="1A1A1A"/>
                 <w:sz w:val="18"/>
               </w:rPr>
               <w:t>they do not live in the program folder</w:t>
@@ -3266,14 +3265,10 @@
         <w:tc>
           <w:tcPr>
             <w:tcW w:type="dxa" w:w="3969"/>
+            <w:vAlign w:val="top"/>
             <w:tcBorders>
-              <w:top w:val="single" w:sz="4" w:space="0" w:color="CCCCCC"/>
-              <w:left w:val="single" w:sz="4" w:space="0" w:color="CCCCCC"/>
-              <w:bottom w:val="single" w:sz="4" w:space="0" w:color="CCCCCC"/>
-              <w:right w:val="single" w:sz="4" w:space="0" w:color="CCCCCC"/>
+              <w:bottom w:val="single" w:sz="4" w:space="4" w:color="E0E0E0"/>
             </w:tcBorders>
-            <w:vAlign w:val="top"/>
-            <w:shd w:val="clear" w:color="auto" w:fill="FDF4EA"/>
           </w:tcPr>
           <w:p>
             <w:pPr>
@@ -3284,6 +3279,7 @@
               <w:rPr>
                 <w:rFonts w:ascii="Arial" w:hAnsi="Arial"/>
                 <w:b w:val="0"/>
+                <w:color w:val="1A1A1A"/>
                 <w:sz w:val="18"/>
               </w:rPr>
               <w:t>look in %APPDATA%\FLOMASTER\ - updates never touch them</w:t>
@@ -3298,13 +3294,10 @@
         <w:tc>
           <w:tcPr>
             <w:tcW w:type="dxa" w:w="2608"/>
+            <w:vAlign w:val="top"/>
             <w:tcBorders>
-              <w:top w:val="single" w:sz="4" w:space="0" w:color="CCCCCC"/>
-              <w:left w:val="single" w:sz="4" w:space="0" w:color="CCCCCC"/>
-              <w:bottom w:val="single" w:sz="4" w:space="0" w:color="CCCCCC"/>
-              <w:right w:val="single" w:sz="4" w:space="0" w:color="CCCCCC"/>
+              <w:bottom w:val="single" w:sz="8" w:space="4" w:color="000000"/>
             </w:tcBorders>
-            <w:vAlign w:val="top"/>
           </w:tcPr>
           <w:p>
             <w:pPr>
@@ -3314,6 +3307,7 @@
               <w:rPr>
                 <w:rFonts w:ascii="Arial" w:hAnsi="Arial"/>
                 <w:b/>
+                <w:color w:val="1A1A1A"/>
                 <w:sz w:val="18"/>
               </w:rPr>
               <w:t>Cannot replace the exe when updating</w:t>
@@ -3323,13 +3317,10 @@
         <w:tc>
           <w:tcPr>
             <w:tcW w:type="dxa" w:w="3061"/>
+            <w:vAlign w:val="top"/>
             <w:tcBorders>
-              <w:top w:val="single" w:sz="4" w:space="0" w:color="CCCCCC"/>
-              <w:left w:val="single" w:sz="4" w:space="0" w:color="CCCCCC"/>
-              <w:bottom w:val="single" w:sz="4" w:space="0" w:color="CCCCCC"/>
-              <w:right w:val="single" w:sz="4" w:space="0" w:color="CCCCCC"/>
+              <w:bottom w:val="single" w:sz="8" w:space="4" w:color="000000"/>
             </w:tcBorders>
-            <w:vAlign w:val="top"/>
           </w:tcPr>
           <w:p>
             <w:pPr>
@@ -3339,6 +3330,7 @@
               <w:rPr>
                 <w:rFonts w:ascii="Arial" w:hAnsi="Arial"/>
                 <w:b w:val="0"/>
+                <w:color w:val="1A1A1A"/>
                 <w:sz w:val="18"/>
               </w:rPr>
               <w:t>the launcher is running (including the tray) and the file is locked</w:t>
@@ -3348,13 +3340,10 @@
         <w:tc>
           <w:tcPr>
             <w:tcW w:type="dxa" w:w="3969"/>
+            <w:vAlign w:val="top"/>
             <w:tcBorders>
-              <w:top w:val="single" w:sz="4" w:space="0" w:color="CCCCCC"/>
-              <w:left w:val="single" w:sz="4" w:space="0" w:color="CCCCCC"/>
-              <w:bottom w:val="single" w:sz="4" w:space="0" w:color="CCCCCC"/>
-              <w:right w:val="single" w:sz="4" w:space="0" w:color="CCCCCC"/>
+              <w:bottom w:val="single" w:sz="8" w:space="4" w:color="000000"/>
             </w:tcBorders>
-            <w:vAlign w:val="top"/>
           </w:tcPr>
           <w:p>
             <w:pPr>
@@ -3364,6 +3353,7 @@
               <w:rPr>
                 <w:rFonts w:ascii="Arial" w:hAnsi="Arial"/>
                 <w:b w:val="0"/>
+                <w:color w:val="1A1A1A"/>
                 <w:sz w:val="18"/>
               </w:rPr>
               <w:t>close FLOMASTER completely, then replace the files</w:t>
@@ -3373,9 +3363,9 @@
       </w:tr>
     </w:tbl>
     <w:sectPr>
-      <w:footerReference w:type="default" r:id="rId9"/>
-      <w:pgSz w:w="12240" w:h="15840"/>
-      <w:pgMar w:top="1296" w:right="1440" w:bottom="1296" w:left="1440" w:header="720" w:footer="720" w:gutter="0"/>
+      <w:footerReference w:type="default" r:id="rId10"/>
+      <w:pgSz w:w="11906" w:h="16838"/>
+      <w:pgMar w:top="1134" w:right="1247" w:bottom="1134" w:left="1247" w:header="0" w:footer="0" w:gutter="0"/>
       <w:cols w:space="720"/>
       <w:docGrid w:linePitch="360"/>
     </w:sectPr>
@@ -3388,13 +3378,48 @@
   <w:p>
     <w:pPr>
       <w:pStyle w:val="Footer"/>
+    </w:pPr>
+  </w:p>
+</w:ftr>
+</file>
+
+<file path=word/footer2.xml><?xml version="1.0" encoding="utf-8"?>
+<w:ftr xmlns:m="http://schemas.openxmlformats.org/officeDocument/2006/math" xmlns:mc="http://schemas.openxmlformats.org/markup-compatibility/2006" xmlns:mo="http://schemas.microsoft.com/office/mac/office/2008/main" xmlns:mv="urn:schemas-microsoft-com:mac:vml" xmlns:o="urn:schemas-microsoft-com:office:office" xmlns:r="http://schemas.openxmlformats.org/officeDocument/2006/relationships" xmlns:v="urn:schemas-microsoft-com:vml" xmlns:w10="urn:schemas-microsoft-com:office:word" xmlns:w14="http://schemas.microsoft.com/office/word/2010/wordml" xmlns:w="http://schemas.openxmlformats.org/wordprocessingml/2006/main" xmlns:wne="http://schemas.microsoft.com/office/word/2006/wordml" xmlns:wp14="http://schemas.microsoft.com/office/word/2010/wordprocessingDrawing" xmlns:wp="http://schemas.openxmlformats.org/drawingml/2006/wordprocessingDrawing" xmlns:wpc="http://schemas.microsoft.com/office/word/2010/wordprocessingCanvas" xmlns:wpg="http://schemas.microsoft.com/office/word/2010/wordprocessingGroup" xmlns:wpi="http://schemas.microsoft.com/office/word/2010/wordprocessingInk" xmlns:wps="http://schemas.microsoft.com/office/word/2010/wordprocessingShape" mc:Ignorable="w14 wp14">
+  <w:p>
+    <w:pPr>
+      <w:pStyle w:val="Footer"/>
       <w:jc w:val="center"/>
     </w:pPr>
     <w:r>
       <w:rPr>
-        <w:rFonts w:ascii="Arial" w:hAnsi="Arial"/>
-        <w:color w:val="555555"/>
-        <w:sz w:val="18"/>
+        <w:rFonts w:ascii="Century Gothic" w:hAnsi="Century Gothic" w:cs="Century Gothic"/>
+        <w:b w:val="0"/>
+        <w:color w:val="6E6E6E"/>
+        <w:sz w:val="15"/>
+        <w:spacing w:val="40"/>
+      </w:rPr>
+      <w:t>FLOMASTER</w:t>
+    </w:r>
+    <w:r>
+      <w:rPr>
+        <w:rFonts w:ascii="Century Gothic" w:hAnsi="Century Gothic"/>
+        <w:b/>
+        <w:color w:val="C82823"/>
+        <w:sz w:val="15"/>
+      </w:rPr>
+      <w:t>.</w:t>
+    </w:r>
+    <w:r>
+      <w:rPr>
+        <w:sz w:val="15"/>
+      </w:rPr>
+      <w:t xml:space="preserve">      </w:t>
+    </w:r>
+    <w:r>
+      <w:rPr>
+        <w:rFonts w:ascii="Century Gothic" w:hAnsi="Century Gothic"/>
+        <w:color w:val="6E6E6E"/>
+        <w:sz w:val="15"/>
       </w:rPr>
       <w:fldChar w:fldCharType="begin"/>
       <w:instrText xml:space="preserve">PAGE \* arabic \* MERGEFORMAT</w:instrText>
@@ -3768,10 +3793,11 @@
     <w:qFormat/>
     <w:rsid w:val="00FC693F"/>
     <w:pPr>
-      <w:spacing w:line="312" w:lineRule="auto" w:after="80" w:before="0"/>
+      <w:spacing w:line="312" w:lineRule="auto" w:after="80"/>
     </w:pPr>
     <w:rPr>
-      <w:rFonts w:ascii="Arial" w:hAnsi="Arial" w:cs="Arial"/>
+      <w:rFonts w:ascii="Arial" w:hAnsi="Arial"/>
+      <w:color w:val="1A1A1A"/>
       <w:sz w:val="20"/>
     </w:rPr>
   </w:style>
@@ -3830,14 +3856,14 @@
     <w:pPr>
       <w:keepNext/>
       <w:keepLines/>
-      <w:spacing w:before="280" w:after="100" w:line="276" w:lineRule="auto"/>
+      <w:spacing w:before="320" w:after="120"/>
       <w:outlineLvl w:val="0"/>
     </w:pPr>
     <w:rPr>
-      <w:rFonts w:asciiTheme="majorHAnsi" w:eastAsiaTheme="majorEastAsia" w:hAnsiTheme="majorHAnsi" w:cstheme="majorBidi" w:ascii="Arial" w:hAnsi="Arial"/>
+      <w:rFonts w:asciiTheme="majorHAnsi" w:eastAsiaTheme="majorEastAsia" w:hAnsiTheme="majorHAnsi" w:cstheme="majorBidi" w:ascii="Century Gothic" w:hAnsi="Century Gothic"/>
       <w:b/>
       <w:bCs/>
-      <w:color w:val="E87D0D"/>
+      <w:color w:val="000000"/>
       <w:sz w:val="30"/>
       <w:szCs w:val="28"/>
     </w:rPr>
@@ -3854,15 +3880,15 @@
     <w:pPr>
       <w:keepNext/>
       <w:keepLines/>
-      <w:spacing w:before="200" w:after="100" w:line="276" w:lineRule="auto"/>
+      <w:spacing w:before="200" w:after="120"/>
       <w:outlineLvl w:val="1"/>
     </w:pPr>
     <w:rPr>
-      <w:rFonts w:asciiTheme="majorHAnsi" w:eastAsiaTheme="majorEastAsia" w:hAnsiTheme="majorHAnsi" w:cstheme="majorBidi" w:ascii="Arial" w:hAnsi="Arial"/>
+      <w:rFonts w:asciiTheme="majorHAnsi" w:eastAsiaTheme="majorEastAsia" w:hAnsiTheme="majorHAnsi" w:cstheme="majorBidi" w:ascii="Century Gothic" w:hAnsi="Century Gothic"/>
       <w:b/>
       <w:bCs/>
-      <w:color w:val="F2A24B"/>
-      <w:sz w:val="25"/>
+      <w:color w:val="000000"/>
+      <w:sz w:val="23"/>
       <w:szCs w:val="26"/>
     </w:rPr>
   </w:style>

</xml_diff>

<commit_message>
docs: user manuals updated to v2.4 — profiles, Projects panel, OCIO roles, CLI, SYNC, hotkey, themed chrome (RU+EN, 17 sections, 8 pages)
</commit_message>
<xml_diff>
--- a/docs/FLOMASTER_Manual_EN.docx
+++ b/docs/FLOMASTER_Manual_EN.docx
@@ -104,7 +104,7 @@
                 <w:sz w:val="18"/>
                 <w:spacing w:val="60"/>
               </w:rPr>
-              <w:t>V2.3  -  WINDOWS 10/11</w:t>
+              <w:t>V2.4  -  WINDOWS 10/11</w:t>
             </w:r>
           </w:p>
           <w:p>
@@ -152,7 +152,7 @@
           <w:color w:val="1A1A1A"/>
           <w:sz w:val="19"/>
         </w:rPr>
-        <w:t>FLOMASTER is a launcher for 3D graphics applications: one button starts Blender, Maya, Houdini, Nuke, DaVinci Resolve, Unreal Engine or Substance Painter with a predefined OCIO color config. The launcher finds installed applications automatically, keeps launch presets, opens project files and logs every launch. One color config - across all applications, with no manual environment setup.</w:t>
+        <w:t>FLOMASTER is a launcher for 3D graphics applications: one button starts Blender, Maya, Houdini, Nuke, DaVinci Resolve, Unreal Engine or Substance Painter with a predefined OCIO color config. The launcher finds installed applications automatically, keeps launch presets and profiles, opens project files, runs from the command line and logs every launch. One color config - across all applications, with no manual environment setup.</w:t>
       </w:r>
     </w:p>
     <w:p>
@@ -213,7 +213,7 @@
         <w:spacing w:before="120" w:after="60"/>
       </w:pPr>
       <w:r>
-        <w:t>2. Installation</w:t>
+        <w:t>2. Installation and updates</w:t>
       </w:r>
       <w:r>
         <w:tab/>
@@ -267,7 +267,7 @@
         <w:spacing w:before="120" w:after="60"/>
       </w:pPr>
       <w:r>
-        <w:t>5. Project files</w:t>
+        <w:t>5. Launch profiles</w:t>
       </w:r>
       <w:r>
         <w:tab/>
@@ -285,7 +285,7 @@
         <w:spacing w:before="120" w:after="60"/>
       </w:pPr>
       <w:r>
-        <w:t>6. How OCIO support works</w:t>
+        <w:t>6. Projects panel</w:t>
       </w:r>
       <w:r>
         <w:tab/>
@@ -303,7 +303,7 @@
         <w:spacing w:before="120" w:after="60"/>
       </w:pPr>
       <w:r>
-        <w:t>7. Themes</w:t>
+        <w:t>7. Project files</w:t>
       </w:r>
       <w:r>
         <w:tab/>
@@ -321,7 +321,25 @@
         <w:spacing w:before="120" w:after="60"/>
       </w:pPr>
       <w:r>
-        <w:t>8. Settings</w:t>
+        <w:t>8. OCIO roles</w:t>
+      </w:r>
+      <w:r>
+        <w:tab/>
+      </w:r>
+      <w:r>
+        <w:t>4</w:t>
+      </w:r>
+    </w:p>
+    <w:p>
+      <w:pPr>
+        <w:pStyle w:val="9"/>
+        <w:tabs>
+          <w:tab w:val="right" w:leader="dot" w:pos="9026"/>
+        </w:tabs>
+        <w:spacing w:before="120" w:after="60"/>
+      </w:pPr>
+      <w:r>
+        <w:t>9. How OCIO support works</w:t>
       </w:r>
       <w:r>
         <w:tab/>
@@ -339,7 +357,7 @@
         <w:spacing w:before="120" w:after="60"/>
       </w:pPr>
       <w:r>
-        <w:t>9. Tray and log</w:t>
+        <w:t>10. Themes and the window chrome</w:t>
       </w:r>
       <w:r>
         <w:tab/>
@@ -357,7 +375,7 @@
         <w:spacing w:before="120" w:after="60"/>
       </w:pPr>
       <w:r>
-        <w:t>10. Files and folders</w:t>
+        <w:t>11. Settings</w:t>
       </w:r>
       <w:r>
         <w:tab/>
@@ -375,13 +393,13 @@
         <w:spacing w:before="120" w:after="60"/>
       </w:pPr>
       <w:r>
-        <w:t>11. Workflows</w:t>
+        <w:t>12. Tray and log</w:t>
       </w:r>
       <w:r>
         <w:tab/>
       </w:r>
       <w:r>
-        <w:t>5</w:t>
+        <w:t>6</w:t>
       </w:r>
     </w:p>
     <w:p>
@@ -393,13 +411,85 @@
         <w:spacing w:before="120" w:after="60"/>
       </w:pPr>
       <w:r>
-        <w:t>12. Troubleshooting</w:t>
+        <w:t>13. Command line</w:t>
       </w:r>
       <w:r>
         <w:tab/>
       </w:r>
       <w:r>
         <w:t>6</w:t>
+      </w:r>
+    </w:p>
+    <w:p>
+      <w:pPr>
+        <w:pStyle w:val="9"/>
+        <w:tabs>
+          <w:tab w:val="right" w:leader="dot" w:pos="9026"/>
+        </w:tabs>
+        <w:spacing w:before="120" w:after="60"/>
+      </w:pPr>
+      <w:r>
+        <w:t>14. Moving to another machine</w:t>
+      </w:r>
+      <w:r>
+        <w:tab/>
+      </w:r>
+      <w:r>
+        <w:t>6</w:t>
+      </w:r>
+    </w:p>
+    <w:p>
+      <w:pPr>
+        <w:pStyle w:val="9"/>
+        <w:tabs>
+          <w:tab w:val="right" w:leader="dot" w:pos="9026"/>
+        </w:tabs>
+        <w:spacing w:before="120" w:after="60"/>
+      </w:pPr>
+      <w:r>
+        <w:t>15. Files and folders</w:t>
+      </w:r>
+      <w:r>
+        <w:tab/>
+      </w:r>
+      <w:r>
+        <w:t>7</w:t>
+      </w:r>
+    </w:p>
+    <w:p>
+      <w:pPr>
+        <w:pStyle w:val="9"/>
+        <w:tabs>
+          <w:tab w:val="right" w:leader="dot" w:pos="9026"/>
+        </w:tabs>
+        <w:spacing w:before="120" w:after="60"/>
+      </w:pPr>
+      <w:r>
+        <w:t>16. Workflows</w:t>
+      </w:r>
+      <w:r>
+        <w:tab/>
+      </w:r>
+      <w:r>
+        <w:t>7</w:t>
+      </w:r>
+    </w:p>
+    <w:p>
+      <w:pPr>
+        <w:pStyle w:val="9"/>
+        <w:tabs>
+          <w:tab w:val="right" w:leader="dot" w:pos="9026"/>
+        </w:tabs>
+        <w:spacing w:before="120" w:after="60"/>
+      </w:pPr>
+      <w:r>
+        <w:t>17. Troubleshooting</w:t>
+      </w:r>
+      <w:r>
+        <w:tab/>
+      </w:r>
+      <w:r>
+        <w:t>7</w:t>
       </w:r>
     </w:p>
     <w:p>
@@ -468,7 +558,7 @@
           <w:color w:val="1A1A1A"/>
           <w:sz w:val="19"/>
         </w:rPr>
-        <w:t>auto-scan of installed applications: Blender, K-Cycles, Maya, Houdini, Nuke, DaVinci Resolve, Unreal Engine, Substance Painter;</w:t>
+        <w:t>auto-scan of installed applications from the Windows registry, Epic Games manifests and file search — Blender, K-Cycles, Maya, Houdini, Nuke, DaVinci Resolve, Unreal Engine, Substance Painter;</w:t>
       </w:r>
     </w:p>
     <w:p>
@@ -496,7 +586,7 @@
           <w:color w:val="1A1A1A"/>
           <w:sz w:val="19"/>
         </w:rPr>
-        <w:t>project file opening (.blend, .spp, .ma, .mb, .hip, .hipl, .hipnc, .nk) with OCIO applied;</w:t>
+        <w:t>launch profiles: named app + OCIO config + arguments bundles, one-click show switching;</w:t>
       </w:r>
     </w:p>
     <w:p>
@@ -510,7 +600,7 @@
           <w:color w:val="1A1A1A"/>
           <w:sz w:val="19"/>
         </w:rPr>
-        <w:t>7 color themes styled after the applications they launch;</w:t>
+        <w:t>Projects panel: a project file browser over your own folders, opening files right in the launcher;</w:t>
       </w:r>
     </w:p>
     <w:p>
@@ -524,7 +614,7 @@
           <w:color w:val="1A1A1A"/>
           <w:sz w:val="19"/>
         </w:rPr>
-        <w:t>drag and drop: an exe becomes a preset, a project file opens in the chosen application;</w:t>
+        <w:t>OCIO roles: per-preset role overrides without touching the config;</w:t>
       </w:r>
     </w:p>
     <w:p>
@@ -538,7 +628,7 @@
           <w:color w:val="1A1A1A"/>
           <w:sz w:val="19"/>
         </w:rPr>
-        <w:t>system tray with quick launch under the default config;</w:t>
+        <w:t>a command line for batch files and farms;</w:t>
       </w:r>
     </w:p>
     <w:p>
@@ -552,7 +642,7 @@
           <w:color w:val="1A1A1A"/>
           <w:sz w:val="19"/>
         </w:rPr>
-        <w:t>launch log: timestamp, user, application, config, exit code;</w:t>
+        <w:t>settings transfer between machines via a file;</w:t>
       </w:r>
     </w:p>
     <w:p>
@@ -566,7 +656,35 @@
           <w:color w:val="1A1A1A"/>
           <w:sz w:val="19"/>
         </w:rPr>
-        <w:t>bundled ACES 1.2 OCIO config with lowercase acescg / raw aliases.</w:t>
+        <w:t>7 color themes including the window title bar, and a global Ctrl+Alt+F hotkey;</w:t>
+      </w:r>
+    </w:p>
+    <w:p>
+      <w:pPr>
+        <w:pStyle w:val="ListBullet"/>
+      </w:pPr>
+      <w:r>
+        <w:rPr>
+          <w:rFonts w:ascii="Arial" w:hAnsi="Arial"/>
+          <w:i w:val="0"/>
+          <w:color w:val="1A1A1A"/>
+          <w:sz w:val="19"/>
+        </w:rPr>
+        <w:t>system tray with quick launch of presets and profiles;</w:t>
+      </w:r>
+    </w:p>
+    <w:p>
+      <w:pPr>
+        <w:pStyle w:val="ListBullet"/>
+      </w:pPr>
+      <w:r>
+        <w:rPr>
+          <w:rFonts w:ascii="Arial" w:hAnsi="Arial"/>
+          <w:i w:val="0"/>
+          <w:color w:val="1A1A1A"/>
+          <w:sz w:val="19"/>
+        </w:rPr>
+        <w:t>launch log and auto-update from GitHub.</w:t>
       </w:r>
     </w:p>
     <w:p>
@@ -594,7 +712,7 @@
           <w:sz w:val="30"/>
           <w:spacing w:val="20"/>
         </w:rPr>
-        <w:t>INSTALLATION</w:t>
+        <w:t>INSTALLATION AND UPDATES</w:t>
       </w:r>
       <w:bookmarkEnd w:id="100002"/>
     </w:p>
@@ -665,7 +783,21 @@
           <w:color w:val="1A1A1A"/>
           <w:sz w:val="19"/>
         </w:rPr>
-        <w:t>Updating: close the launcher (including the tray), replace the files, start it again. Settings and the log live apart from the program and survive updates.</w:t>
+        <w:t>Auto-update: on start the launcher checks GitHub for a new version, downloads it in the background and shows a "Restart and install" button in Settings — one click, one UAC prompt. Disable it with the Check for updates on start checkbox.</w:t>
+      </w:r>
+    </w:p>
+    <w:p>
+      <w:pPr>
+        <w:pStyle w:val="ListBullet"/>
+      </w:pPr>
+      <w:r>
+        <w:rPr>
+          <w:rFonts w:ascii="Arial" w:hAnsi="Arial"/>
+          <w:i w:val="0"/>
+          <w:color w:val="1A1A1A"/>
+          <w:sz w:val="19"/>
+        </w:rPr>
+        <w:t>Manual update: close the launcher (including the tray), replace the files, start it again. Settings and the log live apart from the program and survive updates.</w:t>
       </w:r>
     </w:p>
     <w:p>
@@ -708,7 +840,7 @@
           <w:color w:val="1A1A1A"/>
           <w:sz w:val="19"/>
         </w:rPr>
-        <w:t>Start FLOMASTER - the auto-scan finds installed applications and their cards appear in the window.</w:t>
+        <w:t>Start FLOMASTER — the auto-scan finds installed applications.</w:t>
       </w:r>
     </w:p>
     <w:p>
@@ -722,7 +854,7 @@
           <w:color w:val="1A1A1A"/>
           <w:sz w:val="19"/>
         </w:rPr>
-        <w:t>Click Launch on a card - the application starts with the launcher OCIO config.</w:t>
+        <w:t>Pick an application in the APPLICATION list and click Launch — it starts with the OCIO config.</w:t>
       </w:r>
     </w:p>
     <w:p>
@@ -736,7 +868,7 @@
           <w:color w:val="1A1A1A"/>
           <w:sz w:val="19"/>
         </w:rPr>
-        <w:t>Check the color spaces in the application (in Blender - the Color Management tab in scene properties).</w:t>
+        <w:t>Check the color spaces in the application (in Blender — the Color Management tab in scene properties).</w:t>
       </w:r>
     </w:p>
     <w:p>
@@ -750,7 +882,7 @@
           <w:color w:val="1A1A1A"/>
           <w:sz w:val="19"/>
         </w:rPr>
-        <w:t>Drag a project file (.blend, .ma, .hip...) onto a card - it opens in that application under the same config.</w:t>
+        <w:t>Expand the Projects panel, add a project folder with the "+" button and open a file with a click — it starts in the selected application.</w:t>
       </w:r>
     </w:p>
     <w:p>
@@ -764,7 +896,21 @@
           <w:color w:val="1A1A1A"/>
           <w:sz w:val="19"/>
         </w:rPr>
-        <w:t>Make it yours: theme and scan paths are in Settings, the default tray config is there too.</w:t>
+        <w:t>Press Save current as profile in the Profiles panel — the current app + config + arguments bundle is saved under a name.</w:t>
+      </w:r>
+    </w:p>
+    <w:p>
+      <w:pPr>
+        <w:pStyle w:val="ListBullet"/>
+      </w:pPr>
+      <w:r>
+        <w:rPr>
+          <w:rFonts w:ascii="Arial" w:hAnsi="Arial"/>
+          <w:i w:val="0"/>
+          <w:color w:val="1A1A1A"/>
+          <w:sz w:val="19"/>
+        </w:rPr>
+        <w:t>Ctrl+Alt+F hides and restores the launcher above any application.</w:t>
       </w:r>
     </w:p>
     <w:p>
@@ -814,7 +960,7 @@
           <w:color w:val="1A1A1A"/>
           <w:sz w:val="19"/>
         </w:rPr>
-        <w:t>On start the launcher looks for installed applications in standard locations. Something installed in a non-standard folder (portable builds, custom versions)? Add the folder in Settings → Scan paths and the card appears on the next scan.</w:t>
+        <w:t>On start the launcher looks for installed applications: first in the Windows registry and Epic Games Launcher manifests, then by file search in standard locations. Something installed in a non-standard folder (portable builds, custom versions)? Add the folder in Settings → Scan paths and the card appears on the next scan.</w:t>
       </w:r>
     </w:p>
     <w:p>
@@ -874,7 +1020,7 @@
           <w:color w:val="1A1A1A"/>
           <w:sz w:val="19"/>
         </w:rPr>
-        <w:t>Each preset carries its own launch arguments (the Quick Commands menu on the card) - that is how you keep several versions of one application or special launch keys.</w:t>
+        <w:t>Each preset carries its own launch arguments (the Quick commands panel) - that is how you keep several versions of one application or special launch keys.</w:t>
       </w:r>
     </w:p>
     <w:p>
@@ -902,7 +1048,7 @@
           <w:sz w:val="30"/>
           <w:spacing w:val="20"/>
         </w:rPr>
-        <w:t>PROJECT FILES</w:t>
+        <w:t>LAUNCH PROFILES</w:t>
       </w:r>
       <w:bookmarkEnd w:id="100007"/>
     </w:p>
@@ -914,7 +1060,74 @@
           <w:color w:val="1A1A1A"/>
           <w:sz w:val="19"/>
         </w:rPr>
-        <w:t>Drag a project file onto an application card - it opens there with the OCIO config applied. Supported: .blend, .spp, .ma, .mb, .hip, .hipl, .hipnc, .nk. Recently opened files are available in the Recent list. The Windows context menu entry "Open in FLOMASTER" (right-click on a project file) works the same way.</w:t>
+        <w:t>A profile is a named snapshot of a launch state: application + OCIO config + arguments. It is the unit of task switching: "show A" and "show B" differ by one click instead of re-tuning three fields.</w:t>
+      </w:r>
+    </w:p>
+    <w:p>
+      <w:pPr>
+        <w:pStyle w:val="ListBullet"/>
+      </w:pPr>
+      <w:r>
+        <w:rPr>
+          <w:rFonts w:ascii="Arial" w:hAnsi="Arial"/>
+          <w:i w:val="0"/>
+          <w:color w:val="1A1A1A"/>
+          <w:sz w:val="19"/>
+        </w:rPr>
+        <w:t>set the application, OCIO config and arguments, expand the Profiles panel and press Save current as profile;</w:t>
+      </w:r>
+    </w:p>
+    <w:p>
+      <w:pPr>
+        <w:pStyle w:val="ListBullet"/>
+      </w:pPr>
+      <w:r>
+        <w:rPr>
+          <w:rFonts w:ascii="Arial" w:hAnsi="Arial"/>
+          <w:i w:val="0"/>
+          <w:color w:val="1A1A1A"/>
+          <w:sz w:val="19"/>
+        </w:rPr>
+        <w:t>clicking a profile restores the whole bundle (profiles reference the preset and config by name — edits are picked up);</w:t>
+      </w:r>
+    </w:p>
+    <w:p>
+      <w:pPr>
+        <w:pStyle w:val="ListBullet"/>
+      </w:pPr>
+      <w:r>
+        <w:rPr>
+          <w:rFonts w:ascii="Arial" w:hAnsi="Arial"/>
+          <w:i w:val="0"/>
+          <w:color w:val="1A1A1A"/>
+          <w:sz w:val="19"/>
+        </w:rPr>
+        <w:t>the cross deletes a profile (with confirmation);</w:t>
+      </w:r>
+    </w:p>
+    <w:p>
+      <w:pPr>
+        <w:pStyle w:val="ListBullet"/>
+      </w:pPr>
+      <w:r>
+        <w:rPr>
+          <w:rFonts w:ascii="Arial" w:hAnsi="Arial"/>
+          <w:i w:val="0"/>
+          <w:color w:val="1A1A1A"/>
+          <w:sz w:val="19"/>
+        </w:rPr>
+        <w:t>the tray menu has a PROFILES section — launch a profile straight from the tray, no window needed.</w:t>
+      </w:r>
+    </w:p>
+    <w:p>
+      <w:r>
+        <w:rPr>
+          <w:rFonts w:ascii="Arial" w:hAnsi="Arial"/>
+          <w:i w:val="0"/>
+          <w:color w:val="1A1A1A"/>
+          <w:sz w:val="19"/>
+        </w:rPr>
+        <w:t>A typical set: one profile per show (different OCIO configs), one per application version, one for background rendering (bake arguments). Profiles travel between machines with your settings — see "Moving to another machine".</w:t>
       </w:r>
     </w:p>
     <w:p>
@@ -942,9 +1155,252 @@
           <w:sz w:val="30"/>
           <w:spacing w:val="20"/>
         </w:rPr>
+        <w:t>PROJECTS PANEL</w:t>
+      </w:r>
+      <w:bookmarkEnd w:id="100008"/>
+    </w:p>
+    <w:p>
+      <w:r>
+        <w:rPr>
+          <w:rFonts w:ascii="Arial" w:hAnsi="Arial"/>
+          <w:i w:val="0"/>
+          <w:color w:val="1A1A1A"/>
+          <w:sz w:val="19"/>
+        </w:rPr>
+        <w:t>The Projects panel is a project file browser inside the launcher: instead of digging through the file manager you open the file you need with one click.</w:t>
+      </w:r>
+    </w:p>
+    <w:p>
+      <w:pPr>
+        <w:pStyle w:val="ListBullet"/>
+      </w:pPr>
+      <w:r>
+        <w:rPr>
+          <w:rFonts w:ascii="Arial" w:hAnsi="Arial"/>
+          <w:i w:val="0"/>
+          <w:color w:val="1A1A1A"/>
+          <w:sz w:val="19"/>
+        </w:rPr>
+        <w:t>add the folder where your projects live with the "+" button (a root); "−" removes the selected root;</w:t>
+      </w:r>
+    </w:p>
+    <w:p>
+      <w:pPr>
+        <w:pStyle w:val="ListBullet"/>
+      </w:pPr>
+      <w:r>
+        <w:rPr>
+          <w:rFonts w:ascii="Arial" w:hAnsi="Arial"/>
+          <w:i w:val="0"/>
+          <w:color w:val="1A1A1A"/>
+          <w:sz w:val="19"/>
+        </w:rPr>
+        <w:t>expand the Projects panel: the list shows every project file under the root recursively, with relative paths;</w:t>
+      </w:r>
+    </w:p>
+    <w:p>
+      <w:pPr>
+        <w:pStyle w:val="ListBullet"/>
+      </w:pPr>
+      <w:r>
+        <w:rPr>
+          <w:rFonts w:ascii="Arial" w:hAnsi="Arial"/>
+          <w:i w:val="0"/>
+          <w:color w:val="1A1A1A"/>
+          <w:sz w:val="19"/>
+        </w:rPr>
+        <w:t>the search field filters the list by file name;</w:t>
+      </w:r>
+    </w:p>
+    <w:p>
+      <w:pPr>
+        <w:pStyle w:val="ListBullet"/>
+      </w:pPr>
+      <w:r>
+        <w:rPr>
+          <w:rFonts w:ascii="Arial" w:hAnsi="Arial"/>
+          <w:i w:val="0"/>
+          <w:color w:val="1A1A1A"/>
+          <w:sz w:val="19"/>
+        </w:rPr>
+        <w:t>clicking a file opens it with the current application, OCIO config applied, and adds it to Recent.</w:t>
+      </w:r>
+    </w:p>
+    <w:p>
+      <w:r>
+        <w:rPr>
+          <w:rFonts w:ascii="Arial" w:hAnsi="Arial"/>
+          <w:i w:val="0"/>
+          <w:color w:val="1A1A1A"/>
+          <w:sz w:val="19"/>
+        </w:rPr>
+        <w:t>Only native DCC formats are listed: .blend, .spp, .ma, .mb, .hip, .hipl, .hipnc, .nk. Export formats (.fbx, .obj, .stl) are deliberately hidden — those are exports, not projects.</w:t>
+      </w:r>
+    </w:p>
+    <w:p>
+      <w:pPr>
+        <w:pStyle w:val="Heading1"/>
+        <w:pBdr>
+          <w:left w:val="single" w:sz="24" w:space="8" w:color="C82823"/>
+        </w:pBdr>
+      </w:pPr>
+      <w:bookmarkStart w:id="100009" w:name="_Toc100009"/>
+      <w:r>
+        <w:rPr>
+          <w:rFonts w:ascii="Century Gothic" w:hAnsi="Century Gothic"/>
+          <w:b/>
+          <w:color w:val="000000"/>
+          <w:sz w:val="30"/>
+        </w:rPr>
+        <w:t xml:space="preserve">7. </w:t>
+      </w:r>
+      <w:r>
+        <w:rPr>
+          <w:rFonts w:ascii="Century Gothic" w:hAnsi="Century Gothic"/>
+          <w:b/>
+          <w:color w:val="000000"/>
+          <w:sz w:val="30"/>
+          <w:spacing w:val="20"/>
+        </w:rPr>
+        <w:t>PROJECT FILES</w:t>
+      </w:r>
+      <w:bookmarkEnd w:id="100009"/>
+    </w:p>
+    <w:p>
+      <w:r>
+        <w:rPr>
+          <w:rFonts w:ascii="Arial" w:hAnsi="Arial"/>
+          <w:i w:val="0"/>
+          <w:color w:val="1A1A1A"/>
+          <w:sz w:val="19"/>
+        </w:rPr>
+        <w:t>Drag a project file onto the launcher window — it opens in the selected application with the OCIO config applied. The same files are available in the Recent list — a click reopens them without the file manager. Supported: .blend, .spp, .ma, .mb, .hip, .hipl, .hipnc, .nk.</w:t>
+      </w:r>
+    </w:p>
+    <w:p>
+      <w:pPr>
+        <w:pStyle w:val="Heading1"/>
+        <w:pBdr>
+          <w:left w:val="single" w:sz="24" w:space="8" w:color="C82823"/>
+        </w:pBdr>
+      </w:pPr>
+      <w:bookmarkStart w:id="100010" w:name="_Toc100010"/>
+      <w:r>
+        <w:rPr>
+          <w:rFonts w:ascii="Century Gothic" w:hAnsi="Century Gothic"/>
+          <w:b/>
+          <w:color w:val="000000"/>
+          <w:sz w:val="30"/>
+        </w:rPr>
+        <w:t xml:space="preserve">8. </w:t>
+      </w:r>
+      <w:r>
+        <w:rPr>
+          <w:rFonts w:ascii="Century Gothic" w:hAnsi="Century Gothic"/>
+          <w:b/>
+          <w:color w:val="000000"/>
+          <w:sz w:val="30"/>
+          <w:spacing w:val="20"/>
+        </w:rPr>
+        <w:t>OCIO ROLES</w:t>
+      </w:r>
+      <w:bookmarkEnd w:id="100010"/>
+    </w:p>
+    <w:p>
+      <w:r>
+        <w:rPr>
+          <w:rFonts w:ascii="Arial" w:hAnsi="Arial"/>
+          <w:i w:val="0"/>
+          <w:color w:val="1A1A1A"/>
+          <w:sz w:val="19"/>
+        </w:rPr>
+        <w:t>The Roles panel shows what the key color roles of the selected config resolve to (scene_linear, data, default_byte and others) — and lets you override them per preset.</w:t>
+      </w:r>
+    </w:p>
+    <w:p>
+      <w:pPr>
+        <w:pStyle w:val="ListBullet"/>
+      </w:pPr>
+      <w:r>
+        <w:rPr>
+          <w:rFonts w:ascii="Arial" w:hAnsi="Arial"/>
+          <w:i w:val="0"/>
+          <w:color w:val="1A1A1A"/>
+          <w:sz w:val="19"/>
+        </w:rPr>
+        <w:t>clicking a role row opens the picker: colorspaces grouped by family, like the Color Space menu in Blender, with search;</w:t>
+      </w:r>
+    </w:p>
+    <w:p>
+      <w:pPr>
+        <w:pStyle w:val="ListBullet"/>
+      </w:pPr>
+      <w:r>
+        <w:rPr>
+          <w:rFonts w:ascii="Arial" w:hAnsi="Arial"/>
+          <w:i w:val="0"/>
+          <w:color w:val="1A1A1A"/>
+          <w:sz w:val="19"/>
+        </w:rPr>
+        <w:t>overrides are stored in the launcher config, and a derived config is built at launch — the original .ocio file is never modified;</w:t>
+      </w:r>
+    </w:p>
+    <w:p>
+      <w:pPr>
+        <w:pStyle w:val="ListBullet"/>
+      </w:pPr>
+      <w:r>
+        <w:rPr>
+          <w:rFonts w:ascii="Arial" w:hAnsi="Arial"/>
+          <w:i w:val="0"/>
+          <w:color w:val="1A1A1A"/>
+          <w:sz w:val="19"/>
+        </w:rPr>
+        <w:t>Reset returns all roles of the preset to the config values;</w:t>
+      </w:r>
+    </w:p>
+    <w:p>
+      <w:pPr>
+        <w:pStyle w:val="ListBullet"/>
+      </w:pPr>
+      <w:r>
+        <w:rPr>
+          <w:rFonts w:ascii="Arial" w:hAnsi="Arial"/>
+          <w:i w:val="0"/>
+          <w:color w:val="1A1A1A"/>
+          <w:sz w:val="19"/>
+        </w:rPr>
+        <w:t>under the config selector a validation line highlights missing critical roles and broken references in advance.</w:t>
+      </w:r>
+    </w:p>
+    <w:p>
+      <w:pPr>
+        <w:pStyle w:val="Heading1"/>
+        <w:pBdr>
+          <w:left w:val="single" w:sz="24" w:space="8" w:color="C82823"/>
+        </w:pBdr>
+      </w:pPr>
+      <w:bookmarkStart w:id="100011" w:name="_Toc100011"/>
+      <w:r>
+        <w:rPr>
+          <w:rFonts w:ascii="Century Gothic" w:hAnsi="Century Gothic"/>
+          <w:b/>
+          <w:color w:val="000000"/>
+          <w:sz w:val="30"/>
+        </w:rPr>
+        <w:t xml:space="preserve">9. </w:t>
+      </w:r>
+      <w:r>
+        <w:rPr>
+          <w:rFonts w:ascii="Century Gothic" w:hAnsi="Century Gothic"/>
+          <w:b/>
+          <w:color w:val="000000"/>
+          <w:sz w:val="30"/>
+          <w:spacing w:val="20"/>
+        </w:rPr>
         <w:t>HOW OCIO SUPPORT WORKS</w:t>
       </w:r>
-      <w:bookmarkEnd w:id="100008"/>
+      <w:bookmarkEnd w:id="100011"/>
     </w:p>
     <w:p>
       <w:r>
@@ -1167,7 +1623,7 @@
           <w:left w:val="single" w:sz="24" w:space="8" w:color="C82823"/>
         </w:pBdr>
       </w:pPr>
-      <w:bookmarkStart w:id="100009" w:name="_Toc100009"/>
+      <w:bookmarkStart w:id="100012" w:name="_Toc100012"/>
       <w:r>
         <w:rPr>
           <w:rFonts w:ascii="Century Gothic" w:hAnsi="Century Gothic"/>
@@ -1175,7 +1631,7 @@
           <w:color w:val="000000"/>
           <w:sz w:val="30"/>
         </w:rPr>
-        <w:t xml:space="preserve">7. </w:t>
+        <w:t xml:space="preserve">10. </w:t>
       </w:r>
       <w:r>
         <w:rPr>
@@ -1185,9 +1641,9 @@
           <w:sz w:val="30"/>
           <w:spacing w:val="20"/>
         </w:rPr>
-        <w:t>THEMES</w:t>
+        <w:t>THEMES AND THE WINDOW CHROME</w:t>
       </w:r>
-      <w:bookmarkEnd w:id="100009"/>
+      <w:bookmarkEnd w:id="100012"/>
     </w:p>
     <w:p>
       <w:r>
@@ -1197,7 +1653,7 @@
           <w:color w:val="1A1A1A"/>
           <w:sz w:val="19"/>
         </w:rPr>
-        <w:t>Seven color schemes - one per application in the pipeline. Switch the theme in Settings; the entire interface follows: buttons, checkboxes, the scrollbar, dropdown menus and the Launch button hover state.</w:t>
+        <w:t>Seven color schemes - one per application in the pipeline. Switch the theme in Settings; the entire interface follows: buttons, checkboxes, the scrollbar, dropdown menus, the window title strip and the Launch button hover state.</w:t>
       </w:r>
     </w:p>
     <w:tbl>
@@ -1840,13 +2296,24 @@
       </w:pPr>
     </w:p>
     <w:p>
+      <w:r>
+        <w:rPr>
+          <w:rFonts w:ascii="Arial" w:hAnsi="Arial"/>
+          <w:i w:val="0"/>
+          <w:color w:val="1A1A1A"/>
+          <w:sz w:val="19"/>
+        </w:rPr>
+        <w:t>The title strip is drawn by the launcher itself, in the theme colors: the application name on the left, minimize and close buttons on the right. Drag the window by the strip.</w:t>
+      </w:r>
+    </w:p>
+    <w:p>
       <w:pPr>
         <w:pStyle w:val="Heading1"/>
         <w:pBdr>
           <w:left w:val="single" w:sz="24" w:space="8" w:color="C82823"/>
         </w:pBdr>
       </w:pPr>
-      <w:bookmarkStart w:id="100010" w:name="_Toc100010"/>
+      <w:bookmarkStart w:id="100013" w:name="_Toc100013"/>
       <w:r>
         <w:rPr>
           <w:rFonts w:ascii="Century Gothic" w:hAnsi="Century Gothic"/>
@@ -1854,7 +2321,7 @@
           <w:color w:val="000000"/>
           <w:sz w:val="30"/>
         </w:rPr>
-        <w:t xml:space="preserve">8. </w:t>
+        <w:t xml:space="preserve">11. </w:t>
       </w:r>
       <w:r>
         <w:rPr>
@@ -1866,7 +2333,7 @@
         </w:rPr>
         <w:t>SETTINGS</w:t>
       </w:r>
-      <w:bookmarkEnd w:id="100010"/>
+      <w:bookmarkEnd w:id="100013"/>
     </w:p>
     <w:tbl>
       <w:tblPr>
@@ -1887,6 +2354,7 @@
       <w:tr>
         <w:trPr>
           <w:cantSplit/>
+          <w:tblHeader/>
         </w:trPr>
         <w:tc>
           <w:tcPr>
@@ -1953,7 +2421,57 @@
           </w:tcPr>
           <w:p>
             <w:pPr>
-              <w:keepNext/>
+              <w:spacing w:before="40" w:after="40" w:line="264" w:lineRule="auto"/>
+            </w:pPr>
+            <w:r>
+              <w:rPr>
+                <w:rFonts w:ascii="Arial" w:hAnsi="Arial"/>
+                <w:b/>
+                <w:color w:val="1A1A1A"/>
+                <w:sz w:val="18"/>
+              </w:rPr>
+              <w:t>Check for updates on start</w:t>
+            </w:r>
+          </w:p>
+        </w:tc>
+        <w:tc>
+          <w:tcPr>
+            <w:tcW w:type="dxa" w:w="6236"/>
+            <w:vAlign w:val="top"/>
+            <w:tcBorders>
+              <w:bottom w:val="single" w:sz="4" w:space="4" w:color="E0E0E0"/>
+            </w:tcBorders>
+          </w:tcPr>
+          <w:p>
+            <w:pPr>
+              <w:spacing w:before="40" w:after="40" w:line="264" w:lineRule="auto"/>
+            </w:pPr>
+            <w:r>
+              <w:rPr>
+                <w:rFonts w:ascii="Arial" w:hAnsi="Arial"/>
+                <w:b w:val="0"/>
+                <w:color w:val="1A1A1A"/>
+                <w:sz w:val="18"/>
+              </w:rPr>
+              <w:t>auto-update check at launch</w:t>
+            </w:r>
+          </w:p>
+        </w:tc>
+      </w:tr>
+      <w:tr>
+        <w:trPr>
+          <w:cantSplit/>
+        </w:trPr>
+        <w:tc>
+          <w:tcPr>
+            <w:tcW w:type="dxa" w:w="3402"/>
+            <w:vAlign w:val="top"/>
+            <w:tcBorders>
+              <w:bottom w:val="single" w:sz="4" w:space="4" w:color="E0E0E0"/>
+            </w:tcBorders>
+          </w:tcPr>
+          <w:p>
+            <w:pPr>
               <w:spacing w:before="40" w:after="40" w:line="264" w:lineRule="auto"/>
             </w:pPr>
             <w:r>
@@ -1977,7 +2495,6 @@
           </w:tcPr>
           <w:p>
             <w:pPr>
-              <w:keepNext/>
               <w:spacing w:before="40" w:after="40" w:line="264" w:lineRule="auto"/>
             </w:pPr>
             <w:r>
@@ -2006,7 +2523,6 @@
           </w:tcPr>
           <w:p>
             <w:pPr>
-              <w:keepNext/>
               <w:spacing w:before="40" w:after="40" w:line="264" w:lineRule="auto"/>
             </w:pPr>
             <w:r>
@@ -2030,7 +2546,6 @@
           </w:tcPr>
           <w:p>
             <w:pPr>
-              <w:keepNext/>
               <w:spacing w:before="40" w:after="40" w:line="264" w:lineRule="auto"/>
             </w:pPr>
             <w:r>
@@ -2059,7 +2574,6 @@
           </w:tcPr>
           <w:p>
             <w:pPr>
-              <w:keepNext/>
               <w:spacing w:before="40" w:after="40" w:line="264" w:lineRule="auto"/>
             </w:pPr>
             <w:r>
@@ -2083,7 +2597,6 @@
           </w:tcPr>
           <w:p>
             <w:pPr>
-              <w:keepNext/>
               <w:spacing w:before="40" w:after="40" w:line="264" w:lineRule="auto"/>
             </w:pPr>
             <w:r>
@@ -2112,7 +2625,6 @@
           </w:tcPr>
           <w:p>
             <w:pPr>
-              <w:keepNext/>
               <w:spacing w:before="40" w:after="40" w:line="264" w:lineRule="auto"/>
             </w:pPr>
             <w:r>
@@ -2136,7 +2648,6 @@
           </w:tcPr>
           <w:p>
             <w:pPr>
-              <w:keepNext/>
               <w:spacing w:before="40" w:after="40" w:line="264" w:lineRule="auto"/>
             </w:pPr>
             <w:r>
@@ -2165,7 +2676,57 @@
           </w:tcPr>
           <w:p>
             <w:pPr>
-              <w:keepNext/>
+              <w:spacing w:before="40" w:after="40" w:line="264" w:lineRule="auto"/>
+            </w:pPr>
+            <w:r>
+              <w:rPr>
+                <w:rFonts w:ascii="Arial" w:hAnsi="Arial"/>
+                <w:b/>
+                <w:color w:val="1A1A1A"/>
+                <w:sz w:val="18"/>
+              </w:rPr>
+              <w:t>Global hotkey (Ctrl+Alt+F)</w:t>
+            </w:r>
+          </w:p>
+        </w:tc>
+        <w:tc>
+          <w:tcPr>
+            <w:tcW w:type="dxa" w:w="6236"/>
+            <w:vAlign w:val="top"/>
+            <w:tcBorders>
+              <w:bottom w:val="single" w:sz="4" w:space="4" w:color="E0E0E0"/>
+            </w:tcBorders>
+          </w:tcPr>
+          <w:p>
+            <w:pPr>
+              <w:spacing w:before="40" w:after="40" w:line="264" w:lineRule="auto"/>
+            </w:pPr>
+            <w:r>
+              <w:rPr>
+                <w:rFonts w:ascii="Arial" w:hAnsi="Arial"/>
+                <w:b w:val="0"/>
+                <w:color w:val="1A1A1A"/>
+                <w:sz w:val="18"/>
+              </w:rPr>
+              <w:t>global hotkey: show/hide the launcher above everything</w:t>
+            </w:r>
+          </w:p>
+        </w:tc>
+      </w:tr>
+      <w:tr>
+        <w:trPr>
+          <w:cantSplit/>
+        </w:trPr>
+        <w:tc>
+          <w:tcPr>
+            <w:tcW w:type="dxa" w:w="3402"/>
+            <w:vAlign w:val="top"/>
+            <w:tcBorders>
+              <w:bottom w:val="single" w:sz="4" w:space="4" w:color="E0E0E0"/>
+            </w:tcBorders>
+          </w:tcPr>
+          <w:p>
+            <w:pPr>
               <w:spacing w:before="40" w:after="40" w:line="264" w:lineRule="auto"/>
             </w:pPr>
             <w:r>
@@ -2189,7 +2750,6 @@
           </w:tcPr>
           <w:p>
             <w:pPr>
-              <w:keepNext/>
               <w:spacing w:before="40" w:after="40" w:line="264" w:lineRule="auto"/>
             </w:pPr>
             <w:r>
@@ -2218,7 +2778,6 @@
           </w:tcPr>
           <w:p>
             <w:pPr>
-              <w:keepNext/>
               <w:spacing w:before="40" w:after="40" w:line="264" w:lineRule="auto"/>
             </w:pPr>
             <w:r>
@@ -2242,7 +2801,6 @@
           </w:tcPr>
           <w:p>
             <w:pPr>
-              <w:keepNext/>
               <w:spacing w:before="40" w:after="40" w:line="264" w:lineRule="auto"/>
             </w:pPr>
             <w:r>
@@ -2253,6 +2811,57 @@
                 <w:sz w:val="18"/>
               </w:rPr>
               <w:t>extra folders for the auto-scan</w:t>
+            </w:r>
+          </w:p>
+        </w:tc>
+      </w:tr>
+      <w:tr>
+        <w:trPr>
+          <w:cantSplit/>
+        </w:trPr>
+        <w:tc>
+          <w:tcPr>
+            <w:tcW w:type="dxa" w:w="3402"/>
+            <w:vAlign w:val="top"/>
+            <w:tcBorders>
+              <w:bottom w:val="single" w:sz="4" w:space="4" w:color="E0E0E0"/>
+            </w:tcBorders>
+          </w:tcPr>
+          <w:p>
+            <w:pPr>
+              <w:spacing w:before="40" w:after="40" w:line="264" w:lineRule="auto"/>
+            </w:pPr>
+            <w:r>
+              <w:rPr>
+                <w:rFonts w:ascii="Arial" w:hAnsi="Arial"/>
+                <w:b/>
+                <w:color w:val="1A1A1A"/>
+                <w:sz w:val="18"/>
+              </w:rPr>
+              <w:t>SYNC</w:t>
+            </w:r>
+          </w:p>
+        </w:tc>
+        <w:tc>
+          <w:tcPr>
+            <w:tcW w:type="dxa" w:w="6236"/>
+            <w:vAlign w:val="top"/>
+            <w:tcBorders>
+              <w:bottom w:val="single" w:sz="4" w:space="4" w:color="E0E0E0"/>
+            </w:tcBorders>
+          </w:tcPr>
+          <w:p>
+            <w:pPr>
+              <w:spacing w:before="40" w:after="40" w:line="264" w:lineRule="auto"/>
+            </w:pPr>
+            <w:r>
+              <w:rPr>
+                <w:rFonts w:ascii="Arial" w:hAnsi="Arial"/>
+                <w:b w:val="0"/>
+                <w:color w:val="1A1A1A"/>
+                <w:sz w:val="18"/>
+              </w:rPr>
+              <w:t>export/import settings to move them to another machine</w:t>
             </w:r>
           </w:p>
         </w:tc>
@@ -2321,7 +2930,7 @@
           <w:left w:val="single" w:sz="24" w:space="8" w:color="C82823"/>
         </w:pBdr>
       </w:pPr>
-      <w:bookmarkStart w:id="100011" w:name="_Toc100011"/>
+      <w:bookmarkStart w:id="100014" w:name="_Toc100014"/>
       <w:r>
         <w:rPr>
           <w:rFonts w:ascii="Century Gothic" w:hAnsi="Century Gothic"/>
@@ -2329,7 +2938,7 @@
           <w:color w:val="000000"/>
           <w:sz w:val="30"/>
         </w:rPr>
-        <w:t xml:space="preserve">9. </w:t>
+        <w:t xml:space="preserve">12. </w:t>
       </w:r>
       <w:r>
         <w:rPr>
@@ -2341,7 +2950,7 @@
         </w:rPr>
         <w:t>TRAY AND LOG</w:t>
       </w:r>
-      <w:bookmarkEnd w:id="100011"/>
+      <w:bookmarkEnd w:id="100014"/>
     </w:p>
     <w:p>
       <w:r>
@@ -2351,7 +2960,7 @@
           <w:color w:val="1A1A1A"/>
           <w:sz w:val="19"/>
         </w:rPr>
-        <w:t>Closing the window minimizes the launcher to the system tray - it keeps running. The tray menu offers quick launch of applications under the default config.</w:t>
+        <w:t>Closing the window minimizes the launcher to the system tray - it keeps running. The tray menu offers quick launch of presets, a PROFILES section (one-click profile launches) and the window itself.</w:t>
       </w:r>
     </w:p>
     <w:p>
@@ -2372,7 +2981,7 @@
           <w:left w:val="single" w:sz="24" w:space="8" w:color="C82823"/>
         </w:pBdr>
       </w:pPr>
-      <w:bookmarkStart w:id="100012" w:name="_Toc100012"/>
+      <w:bookmarkStart w:id="100015" w:name="_Toc100015"/>
       <w:r>
         <w:rPr>
           <w:rFonts w:ascii="Century Gothic" w:hAnsi="Century Gothic"/>
@@ -2380,7 +2989,429 @@
           <w:color w:val="000000"/>
           <w:sz w:val="30"/>
         </w:rPr>
-        <w:t xml:space="preserve">10. </w:t>
+        <w:t xml:space="preserve">13. </w:t>
+      </w:r>
+      <w:r>
+        <w:rPr>
+          <w:rFonts w:ascii="Century Gothic" w:hAnsi="Century Gothic"/>
+          <w:b/>
+          <w:color w:val="000000"/>
+          <w:sz w:val="30"/>
+          <w:spacing w:val="20"/>
+        </w:rPr>
+        <w:t>COMMAND LINE</w:t>
+      </w:r>
+      <w:bookmarkEnd w:id="100015"/>
+    </w:p>
+    <w:p>
+      <w:r>
+        <w:rPr>
+          <w:rFonts w:ascii="Arial" w:hAnsi="Arial"/>
+          <w:i w:val="0"/>
+          <w:color w:val="1A1A1A"/>
+          <w:sz w:val="19"/>
+        </w:rPr>
+        <w:t>The launcher runs without a window - for batch files, farms and scripts:</w:t>
+      </w:r>
+    </w:p>
+    <w:p>
+      <w:r>
+        <w:rPr>
+          <w:rFonts w:ascii="Arial" w:hAnsi="Arial"/>
+          <w:i/>
+          <w:color w:val="1A1A1A"/>
+          <w:sz w:val="19"/>
+        </w:rPr>
+        <w:t>FLOMASTER.exe --list-profiles</w:t>
+      </w:r>
+    </w:p>
+    <w:p>
+      <w:r>
+        <w:rPr>
+          <w:rFonts w:ascii="Arial" w:hAnsi="Arial"/>
+          <w:i/>
+          <w:color w:val="1A1A1A"/>
+          <w:sz w:val="19"/>
+        </w:rPr>
+        <w:t>FLOMASTER.exe --launch "Profile"</w:t>
+      </w:r>
+    </w:p>
+    <w:p>
+      <w:r>
+        <w:rPr>
+          <w:rFonts w:ascii="Arial" w:hAnsi="Arial"/>
+          <w:i/>
+          <w:color w:val="1A1A1A"/>
+          <w:sz w:val="19"/>
+        </w:rPr>
+        <w:t>FLOMASTER.exe --launch "Profile" --project "D:\shows\A\shot_042.blend"</w:t>
+      </w:r>
+    </w:p>
+    <w:p>
+      <w:r>
+        <w:rPr>
+          <w:rFonts w:ascii="Arial" w:hAnsi="Arial"/>
+          <w:i w:val="0"/>
+          <w:color w:val="1A1A1A"/>
+          <w:sz w:val="19"/>
+        </w:rPr>
+        <w:t>A profile resolves to application + OCIO config + arguments - the same environment as a manual launch. --project appends the file to the profile arguments (or substitutes the {file} placeholder if the profile has one).</w:t>
+      </w:r>
+    </w:p>
+    <w:tbl>
+      <w:tblPr>
+        <w:tblW w:type="auto" w:w="0"/>
+        <w:tblLayout w:type="fixed"/>
+        <w:tblLook w:firstColumn="1" w:firstRow="1" w:lastColumn="0" w:lastRow="0" w:noHBand="0" w:noVBand="1" w:val="04A0"/>
+        <w:tblCellMar>
+          <w:top w:w="40" w:type="dxa"/>
+          <w:left w:w="80" w:type="dxa"/>
+          <w:bottom w:w="40" w:type="dxa"/>
+          <w:right w:w="80" w:type="dxa"/>
+        </w:tblCellMar>
+      </w:tblPr>
+      <w:tblGrid>
+        <w:gridCol w:w="4706"/>
+        <w:gridCol w:w="4706"/>
+      </w:tblGrid>
+      <w:tr>
+        <w:trPr>
+          <w:cantSplit/>
+        </w:trPr>
+        <w:tc>
+          <w:tcPr>
+            <w:tcW w:type="dxa" w:w="2608"/>
+            <w:vAlign w:val="top"/>
+            <w:tcBorders>
+              <w:bottom w:val="single" w:sz="12" w:space="4" w:color="C82823"/>
+            </w:tcBorders>
+          </w:tcPr>
+          <w:p>
+            <w:pPr>
+              <w:keepNext/>
+              <w:spacing w:before="40" w:after="40" w:line="264" w:lineRule="auto"/>
+            </w:pPr>
+            <w:r>
+              <w:rPr>
+                <w:rFonts w:ascii="Century Gothic" w:hAnsi="Century Gothic"/>
+                <w:b/>
+                <w:color w:val="000000"/>
+                <w:sz w:val="17"/>
+                <w:spacing w:val="20"/>
+              </w:rPr>
+              <w:t>EXIT CODE</w:t>
+            </w:r>
+          </w:p>
+        </w:tc>
+        <w:tc>
+          <w:tcPr>
+            <w:tcW w:type="dxa" w:w="7030"/>
+            <w:vAlign w:val="top"/>
+            <w:tcBorders>
+              <w:bottom w:val="single" w:sz="12" w:space="4" w:color="C82823"/>
+            </w:tcBorders>
+          </w:tcPr>
+          <w:p>
+            <w:pPr>
+              <w:keepNext/>
+              <w:spacing w:before="40" w:after="40" w:line="264" w:lineRule="auto"/>
+            </w:pPr>
+            <w:r>
+              <w:rPr>
+                <w:rFonts w:ascii="Century Gothic" w:hAnsi="Century Gothic"/>
+                <w:b/>
+                <w:color w:val="000000"/>
+                <w:sz w:val="17"/>
+                <w:spacing w:val="20"/>
+              </w:rPr>
+              <w:t>MEANING</w:t>
+            </w:r>
+          </w:p>
+        </w:tc>
+      </w:tr>
+      <w:tr>
+        <w:trPr>
+          <w:cantSplit/>
+        </w:trPr>
+        <w:tc>
+          <w:tcPr>
+            <w:tcW w:type="dxa" w:w="2608"/>
+            <w:vAlign w:val="top"/>
+            <w:tcBorders>
+              <w:bottom w:val="single" w:sz="4" w:space="4" w:color="E0E0E0"/>
+            </w:tcBorders>
+          </w:tcPr>
+          <w:p>
+            <w:pPr>
+              <w:keepNext/>
+              <w:spacing w:before="40" w:after="40" w:line="264" w:lineRule="auto"/>
+            </w:pPr>
+            <w:r>
+              <w:rPr>
+                <w:rFonts w:ascii="Arial" w:hAnsi="Arial"/>
+                <w:b/>
+                <w:color w:val="1A1A1A"/>
+                <w:sz w:val="18"/>
+              </w:rPr>
+              <w:t>0</w:t>
+            </w:r>
+          </w:p>
+        </w:tc>
+        <w:tc>
+          <w:tcPr>
+            <w:tcW w:type="dxa" w:w="7030"/>
+            <w:vAlign w:val="top"/>
+            <w:tcBorders>
+              <w:bottom w:val="single" w:sz="4" w:space="4" w:color="E0E0E0"/>
+            </w:tcBorders>
+          </w:tcPr>
+          <w:p>
+            <w:pPr>
+              <w:keepNext/>
+              <w:spacing w:before="40" w:after="40" w:line="264" w:lineRule="auto"/>
+            </w:pPr>
+            <w:r>
+              <w:rPr>
+                <w:rFonts w:ascii="Arial" w:hAnsi="Arial"/>
+                <w:b w:val="0"/>
+                <w:color w:val="1A1A1A"/>
+                <w:sz w:val="18"/>
+              </w:rPr>
+              <w:t>launched successfully</w:t>
+            </w:r>
+          </w:p>
+        </w:tc>
+      </w:tr>
+      <w:tr>
+        <w:trPr>
+          <w:cantSplit/>
+        </w:trPr>
+        <w:tc>
+          <w:tcPr>
+            <w:tcW w:type="dxa" w:w="2608"/>
+            <w:vAlign w:val="top"/>
+            <w:tcBorders>
+              <w:bottom w:val="single" w:sz="4" w:space="4" w:color="E0E0E0"/>
+            </w:tcBorders>
+          </w:tcPr>
+          <w:p>
+            <w:pPr>
+              <w:keepNext/>
+              <w:spacing w:before="40" w:after="40" w:line="264" w:lineRule="auto"/>
+            </w:pPr>
+            <w:r>
+              <w:rPr>
+                <w:rFonts w:ascii="Arial" w:hAnsi="Arial"/>
+                <w:b/>
+                <w:color w:val="1A1A1A"/>
+                <w:sz w:val="18"/>
+              </w:rPr>
+              <w:t>1</w:t>
+            </w:r>
+          </w:p>
+        </w:tc>
+        <w:tc>
+          <w:tcPr>
+            <w:tcW w:type="dxa" w:w="7030"/>
+            <w:vAlign w:val="top"/>
+            <w:tcBorders>
+              <w:bottom w:val="single" w:sz="4" w:space="4" w:color="E0E0E0"/>
+            </w:tcBorders>
+          </w:tcPr>
+          <w:p>
+            <w:pPr>
+              <w:keepNext/>
+              <w:spacing w:before="40" w:after="40" w:line="264" w:lineRule="auto"/>
+            </w:pPr>
+            <w:r>
+              <w:rPr>
+                <w:rFonts w:ascii="Arial" w:hAnsi="Arial"/>
+                <w:b w:val="0"/>
+                <w:color w:val="1A1A1A"/>
+                <w:sz w:val="18"/>
+              </w:rPr>
+              <w:t>launch or usage error</w:t>
+            </w:r>
+          </w:p>
+        </w:tc>
+      </w:tr>
+      <w:tr>
+        <w:trPr>
+          <w:cantSplit/>
+        </w:trPr>
+        <w:tc>
+          <w:tcPr>
+            <w:tcW w:type="dxa" w:w="2608"/>
+            <w:vAlign w:val="top"/>
+            <w:tcBorders>
+              <w:bottom w:val="single" w:sz="8" w:space="4" w:color="000000"/>
+            </w:tcBorders>
+          </w:tcPr>
+          <w:p>
+            <w:pPr>
+              <w:spacing w:before="40" w:after="40" w:line="264" w:lineRule="auto"/>
+            </w:pPr>
+            <w:r>
+              <w:rPr>
+                <w:rFonts w:ascii="Arial" w:hAnsi="Arial"/>
+                <w:b/>
+                <w:color w:val="1A1A1A"/>
+                <w:sz w:val="18"/>
+              </w:rPr>
+              <w:t>2</w:t>
+            </w:r>
+          </w:p>
+        </w:tc>
+        <w:tc>
+          <w:tcPr>
+            <w:tcW w:type="dxa" w:w="7030"/>
+            <w:vAlign w:val="top"/>
+            <w:tcBorders>
+              <w:bottom w:val="single" w:sz="8" w:space="4" w:color="000000"/>
+            </w:tcBorders>
+          </w:tcPr>
+          <w:p>
+            <w:pPr>
+              <w:spacing w:before="40" w:after="40" w:line="264" w:lineRule="auto"/>
+            </w:pPr>
+            <w:r>
+              <w:rPr>
+                <w:rFonts w:ascii="Arial" w:hAnsi="Arial"/>
+                <w:b w:val="0"/>
+                <w:color w:val="1A1A1A"/>
+                <w:sz w:val="18"/>
+              </w:rPr>
+              <w:t>profile, preset or project file not found</w:t>
+            </w:r>
+          </w:p>
+        </w:tc>
+      </w:tr>
+    </w:tbl>
+    <w:p>
+      <w:pPr>
+        <w:spacing w:after="80" w:line="240" w:lineRule="auto"/>
+      </w:pPr>
+    </w:p>
+    <w:p>
+      <w:r>
+        <w:rPr>
+          <w:rFonts w:ascii="Arial" w:hAnsi="Arial"/>
+          <w:i w:val="0"/>
+          <w:color w:val="1A1A1A"/>
+          <w:sz w:val="19"/>
+        </w:rPr>
+        <w:t>Output goes to the console the exe was started from. Environment variables and OCIO are passed exactly like a window launch.</w:t>
+      </w:r>
+    </w:p>
+    <w:p>
+      <w:pPr>
+        <w:pStyle w:val="Heading1"/>
+        <w:pBdr>
+          <w:left w:val="single" w:sz="24" w:space="8" w:color="C82823"/>
+        </w:pBdr>
+      </w:pPr>
+      <w:bookmarkStart w:id="100016" w:name="_Toc100016"/>
+      <w:r>
+        <w:rPr>
+          <w:rFonts w:ascii="Century Gothic" w:hAnsi="Century Gothic"/>
+          <w:b/>
+          <w:color w:val="000000"/>
+          <w:sz w:val="30"/>
+        </w:rPr>
+        <w:t xml:space="preserve">14. </w:t>
+      </w:r>
+      <w:r>
+        <w:rPr>
+          <w:rFonts w:ascii="Century Gothic" w:hAnsi="Century Gothic"/>
+          <w:b/>
+          <w:color w:val="000000"/>
+          <w:sz w:val="30"/>
+          <w:spacing w:val="20"/>
+        </w:rPr>
+        <w:t>MOVING TO ANOTHER MACHINE</w:t>
+      </w:r>
+      <w:bookmarkEnd w:id="100016"/>
+    </w:p>
+    <w:p>
+      <w:r>
+        <w:rPr>
+          <w:rFonts w:ascii="Arial" w:hAnsi="Arial"/>
+          <w:i w:val="0"/>
+          <w:color w:val="1A1A1A"/>
+          <w:sz w:val="19"/>
+        </w:rPr>
+        <w:t>Settings travel as a file: Settings → SYNC → Export settings saves profiles, project roots, theme and options into a flomaster_setup_date.flomaster file. On another machine: install the launcher, press Import settings and pick the file.</w:t>
+      </w:r>
+    </w:p>
+    <w:p>
+      <w:pPr>
+        <w:pStyle w:val="ListBullet"/>
+      </w:pPr>
+      <w:r>
+        <w:rPr>
+          <w:rFonts w:ascii="Arial" w:hAnsi="Arial"/>
+          <w:i w:val="0"/>
+          <w:color w:val="1A1A1A"/>
+          <w:sz w:val="19"/>
+        </w:rPr>
+        <w:t>profiles are imported by name: new ones are added, existing ones updated;</w:t>
+      </w:r>
+    </w:p>
+    <w:p>
+      <w:pPr>
+        <w:pStyle w:val="ListBullet"/>
+      </w:pPr>
+      <w:r>
+        <w:rPr>
+          <w:rFonts w:ascii="Arial" w:hAnsi="Arial"/>
+          <w:i w:val="0"/>
+          <w:color w:val="1A1A1A"/>
+          <w:sz w:val="19"/>
+        </w:rPr>
+        <w:t>project roots merge without duplicates;</w:t>
+      </w:r>
+    </w:p>
+    <w:p>
+      <w:pPr>
+        <w:pStyle w:val="ListBullet"/>
+      </w:pPr>
+      <w:r>
+        <w:rPr>
+          <w:rFonts w:ascii="Arial" w:hAnsi="Arial"/>
+          <w:i w:val="0"/>
+          <w:color w:val="1A1A1A"/>
+          <w:sz w:val="19"/>
+        </w:rPr>
+        <w:t>exe paths stay machine-local: presets match by name, so after importing check that applications are found (Rescan);</w:t>
+      </w:r>
+    </w:p>
+    <w:p>
+      <w:r>
+        <w:rPr>
+          <w:rFonts w:ascii="Arial" w:hAnsi="Arial"/>
+          <w:i w:val="0"/>
+          <w:color w:val="1A1A1A"/>
+          <w:sz w:val="19"/>
+        </w:rPr>
+        <w:t>The auto-scan on a fresh machine picks up installed applications from the registry and Epic manifests — as a rule, presets assemble themselves.</w:t>
+      </w:r>
+    </w:p>
+    <w:p>
+      <w:pPr>
+        <w:pStyle w:val="Heading1"/>
+        <w:pBdr>
+          <w:left w:val="single" w:sz="24" w:space="8" w:color="C82823"/>
+        </w:pBdr>
+      </w:pPr>
+      <w:bookmarkStart w:id="100017" w:name="_Toc100017"/>
+      <w:r>
+        <w:rPr>
+          <w:rFonts w:ascii="Century Gothic" w:hAnsi="Century Gothic"/>
+          <w:b/>
+          <w:color w:val="000000"/>
+          <w:sz w:val="30"/>
+        </w:rPr>
+        <w:t xml:space="preserve">15. </w:t>
       </w:r>
       <w:r>
         <w:rPr>
@@ -2392,7 +3423,7 @@
         </w:rPr>
         <w:t>FILES AND FOLDERS</w:t>
       </w:r>
-      <w:bookmarkEnd w:id="100012"/>
+      <w:bookmarkEnd w:id="100017"/>
     </w:p>
     <w:tbl>
       <w:tblPr>
@@ -2564,7 +3595,7 @@
                 <w:color w:val="1A1A1A"/>
                 <w:sz w:val="18"/>
               </w:rPr>
-              <w:t>launcher_config.json (settings), flomaster.log (log)</w:t>
+              <w:t>launcher_config.json (settings), flomaster.log (log), variants/ (per-role config variants)</w:t>
             </w:r>
           </w:p>
         </w:tc>
@@ -2593,7 +3624,7 @@
           <w:left w:val="single" w:sz="24" w:space="8" w:color="C82823"/>
         </w:pBdr>
       </w:pPr>
-      <w:bookmarkStart w:id="100013" w:name="_Toc100013"/>
+      <w:bookmarkStart w:id="100018" w:name="_Toc100018"/>
       <w:r>
         <w:rPr>
           <w:rFonts w:ascii="Century Gothic" w:hAnsi="Century Gothic"/>
@@ -2601,7 +3632,7 @@
           <w:color w:val="000000"/>
           <w:sz w:val="30"/>
         </w:rPr>
-        <w:t xml:space="preserve">11. </w:t>
+        <w:t xml:space="preserve">16. </w:t>
       </w:r>
       <w:r>
         <w:rPr>
@@ -2613,17 +3644,17 @@
         </w:rPr>
         <w:t>WORKFLOWS</w:t>
       </w:r>
-      <w:bookmarkEnd w:id="100013"/>
+      <w:bookmarkEnd w:id="100018"/>
     </w:p>
     <w:p>
       <w:pPr>
         <w:pStyle w:val="Heading2"/>
       </w:pPr>
-      <w:bookmarkStart w:id="100014" w:name="_Toc100014"/>
+      <w:bookmarkStart w:id="100019" w:name="_Toc100019"/>
       <w:r>
         <w:t>One color from the start of the day</w:t>
       </w:r>
-      <w:bookmarkEnd w:id="100014"/>
+      <w:bookmarkEnd w:id="100019"/>
     </w:p>
     <w:p>
       <w:r>
@@ -2640,11 +3671,53 @@
       <w:pPr>
         <w:pStyle w:val="Heading2"/>
       </w:pPr>
-      <w:bookmarkStart w:id="100015" w:name="_Toc100015"/>
+      <w:bookmarkStart w:id="100020" w:name="_Toc100020"/>
+      <w:r>
+        <w:t>Switching between shows</w:t>
+      </w:r>
+      <w:bookmarkEnd w:id="100020"/>
+    </w:p>
+    <w:p>
+      <w:r>
+        <w:rPr>
+          <w:rFonts w:ascii="Arial" w:hAnsi="Arial"/>
+          <w:i w:val="0"/>
+          <w:color w:val="1A1A1A"/>
+          <w:sz w:val="19"/>
+        </w:rPr>
+        <w:t>Set up one profile per show and switch them in the Profiles panel with a single click. From the tray a profile launches right away, without the launcher window.</w:t>
+      </w:r>
+    </w:p>
+    <w:p>
+      <w:pPr>
+        <w:pStyle w:val="Heading2"/>
+      </w:pPr>
+      <w:bookmarkStart w:id="100021" w:name="_Toc100021"/>
+      <w:r>
+        <w:t>Open a project file without leaving the task</w:t>
+      </w:r>
+      <w:bookmarkEnd w:id="100021"/>
+    </w:p>
+    <w:p>
+      <w:r>
+        <w:rPr>
+          <w:rFonts w:ascii="Arial" w:hAnsi="Arial"/>
+          <w:i w:val="0"/>
+          <w:color w:val="1A1A1A"/>
+          <w:sz w:val="19"/>
+        </w:rPr>
+        <w:t>Projects panel → root → click the file. Name search finds files deep inside folders.</w:t>
+      </w:r>
+    </w:p>
+    <w:p>
+      <w:pPr>
+        <w:pStyle w:val="Heading2"/>
+      </w:pPr>
+      <w:bookmarkStart w:id="100022" w:name="_Toc100022"/>
       <w:r>
         <w:t>Textures: what opens and where</w:t>
       </w:r>
-      <w:bookmarkEnd w:id="100015"/>
+      <w:bookmarkEnd w:id="100022"/>
     </w:p>
     <w:p>
       <w:r>
@@ -2661,11 +3734,11 @@
       <w:pPr>
         <w:pStyle w:val="Heading2"/>
       </w:pPr>
-      <w:bookmarkStart w:id="100016" w:name="_Toc100016"/>
+      <w:bookmarkStart w:id="100023" w:name="_Toc100023"/>
       <w:r>
-        <w:t>Open a scene in another application</w:t>
+        <w:t>Background render from a batch file</w:t>
       </w:r>
-      <w:bookmarkEnd w:id="100016"/>
+      <w:bookmarkEnd w:id="100023"/>
     </w:p>
     <w:p>
       <w:r>
@@ -2675,18 +3748,18 @@
           <w:color w:val="1A1A1A"/>
           <w:sz w:val="19"/>
         </w:rPr>
-        <w:t>Drag the scene file onto the application card - or use Recent to reopen the last file without hunting for it in the file manager.</w:t>
+        <w:t>Save a profile with bake arguments and run: FLOMASTER.exe --launch "Render" --project "scene.blend". Exit code 0 — the process is on its way.</w:t>
       </w:r>
     </w:p>
     <w:p>
       <w:pPr>
         <w:pStyle w:val="Heading2"/>
       </w:pPr>
-      <w:bookmarkStart w:id="100017" w:name="_Toc100017"/>
+      <w:bookmarkStart w:id="100024" w:name="_Toc100024"/>
       <w:r>
         <w:t>Several versions of one application</w:t>
       </w:r>
-      <w:bookmarkEnd w:id="100017"/>
+      <w:bookmarkEnd w:id="100024"/>
     </w:p>
     <w:p>
       <w:r>
@@ -2696,7 +3769,7 @@
           <w:color w:val="1A1A1A"/>
           <w:sz w:val="19"/>
         </w:rPr>
-        <w:t>Create one preset per version (drag the exe + name) and start the one you need with a click; the version arguments live in the preset Quick Commands.</w:t>
+        <w:t>Create one preset per version (drag the exe + name) and start the one you need with a click; the version arguments live in the preset Quick commands.</w:t>
       </w:r>
     </w:p>
     <w:p>
@@ -2706,7 +3779,7 @@
           <w:left w:val="single" w:sz="24" w:space="8" w:color="C82823"/>
         </w:pBdr>
       </w:pPr>
-      <w:bookmarkStart w:id="100018" w:name="_Toc100018"/>
+      <w:bookmarkStart w:id="100025" w:name="_Toc100025"/>
       <w:r>
         <w:rPr>
           <w:rFonts w:ascii="Century Gothic" w:hAnsi="Century Gothic"/>
@@ -2714,7 +3787,7 @@
           <w:color w:val="000000"/>
           <w:sz w:val="30"/>
         </w:rPr>
-        <w:t xml:space="preserve">12. </w:t>
+        <w:t xml:space="preserve">17. </w:t>
       </w:r>
       <w:r>
         <w:rPr>
@@ -2726,7 +3799,7 @@
         </w:rPr>
         <w:t>TROUBLESHOOTING</w:t>
       </w:r>
-      <w:bookmarkEnd w:id="100018"/>
+      <w:bookmarkEnd w:id="100025"/>
     </w:p>
     <w:tbl>
       <w:tblPr>
@@ -2748,6 +3821,7 @@
       <w:tr>
         <w:trPr>
           <w:cantSplit/>
+          <w:tblHeader/>
         </w:trPr>
         <w:tc>
           <w:tcPr>
@@ -2839,7 +3913,6 @@
           </w:tcPr>
           <w:p>
             <w:pPr>
-              <w:keepNext/>
               <w:spacing w:before="40" w:after="40" w:line="264" w:lineRule="auto"/>
             </w:pPr>
             <w:r>
@@ -2863,7 +3936,6 @@
           </w:tcPr>
           <w:p>
             <w:pPr>
-              <w:keepNext/>
               <w:spacing w:before="40" w:after="40" w:line="264" w:lineRule="auto"/>
             </w:pPr>
             <w:r>
@@ -2887,7 +3959,6 @@
           </w:tcPr>
           <w:p>
             <w:pPr>
-              <w:keepNext/>
               <w:spacing w:before="40" w:after="40" w:line="264" w:lineRule="auto"/>
             </w:pPr>
             <w:r>
@@ -2916,7 +3987,228 @@
           </w:tcPr>
           <w:p>
             <w:pPr>
-              <w:keepNext/>
+              <w:spacing w:before="40" w:after="40" w:line="264" w:lineRule="auto"/>
+            </w:pPr>
+            <w:r>
+              <w:rPr>
+                <w:rFonts w:ascii="Arial" w:hAnsi="Arial"/>
+                <w:b/>
+                <w:color w:val="1A1A1A"/>
+                <w:sz w:val="18"/>
+              </w:rPr>
+              <w:t>Ctrl+Alt+F does nothing</w:t>
+            </w:r>
+          </w:p>
+        </w:tc>
+        <w:tc>
+          <w:tcPr>
+            <w:tcW w:type="dxa" w:w="3061"/>
+            <w:vAlign w:val="top"/>
+            <w:tcBorders>
+              <w:bottom w:val="single" w:sz="4" w:space="4" w:color="E0E0E0"/>
+            </w:tcBorders>
+          </w:tcPr>
+          <w:p>
+            <w:pPr>
+              <w:spacing w:before="40" w:after="40" w:line="264" w:lineRule="auto"/>
+            </w:pPr>
+            <w:r>
+              <w:rPr>
+                <w:rFonts w:ascii="Arial" w:hAnsi="Arial"/>
+                <w:b w:val="0"/>
+                <w:color w:val="1A1A1A"/>
+                <w:sz w:val="18"/>
+              </w:rPr>
+              <w:t>the combination is taken by another application</w:t>
+            </w:r>
+          </w:p>
+        </w:tc>
+        <w:tc>
+          <w:tcPr>
+            <w:tcW w:type="dxa" w:w="3969"/>
+            <w:vAlign w:val="top"/>
+            <w:tcBorders>
+              <w:bottom w:val="single" w:sz="4" w:space="4" w:color="E0E0E0"/>
+            </w:tcBorders>
+          </w:tcPr>
+          <w:p>
+            <w:pPr>
+              <w:spacing w:before="40" w:after="40" w:line="264" w:lineRule="auto"/>
+            </w:pPr>
+            <w:r>
+              <w:rPr>
+                <w:rFonts w:ascii="Arial" w:hAnsi="Arial"/>
+                <w:b w:val="0"/>
+                <w:color w:val="1A1A1A"/>
+                <w:sz w:val="18"/>
+              </w:rPr>
+              <w:t>check for a warn line in the log; free the combination or toggle the Global hotkey checkbox off and on</w:t>
+            </w:r>
+          </w:p>
+        </w:tc>
+      </w:tr>
+      <w:tr>
+        <w:trPr>
+          <w:cantSplit/>
+        </w:trPr>
+        <w:tc>
+          <w:tcPr>
+            <w:tcW w:type="dxa" w:w="2608"/>
+            <w:vAlign w:val="top"/>
+            <w:tcBorders>
+              <w:bottom w:val="single" w:sz="4" w:space="4" w:color="E0E0E0"/>
+            </w:tcBorders>
+          </w:tcPr>
+          <w:p>
+            <w:pPr>
+              <w:spacing w:before="40" w:after="40" w:line="264" w:lineRule="auto"/>
+            </w:pPr>
+            <w:r>
+              <w:rPr>
+                <w:rFonts w:ascii="Arial" w:hAnsi="Arial"/>
+                <w:b/>
+                <w:color w:val="1A1A1A"/>
+                <w:sz w:val="18"/>
+              </w:rPr>
+              <w:t>Profile does not start from the command line, exit code 2</w:t>
+            </w:r>
+          </w:p>
+        </w:tc>
+        <w:tc>
+          <w:tcPr>
+            <w:tcW w:type="dxa" w:w="3061"/>
+            <w:vAlign w:val="top"/>
+            <w:tcBorders>
+              <w:bottom w:val="single" w:sz="4" w:space="4" w:color="E0E0E0"/>
+            </w:tcBorders>
+          </w:tcPr>
+          <w:p>
+            <w:pPr>
+              <w:spacing w:before="40" w:after="40" w:line="264" w:lineRule="auto"/>
+            </w:pPr>
+            <w:r>
+              <w:rPr>
+                <w:rFonts w:ascii="Arial" w:hAnsi="Arial"/>
+                <w:b w:val="0"/>
+                <w:color w:val="1A1A1A"/>
+                <w:sz w:val="18"/>
+              </w:rPr>
+              <w:t>profile/preset/file not found</w:t>
+            </w:r>
+          </w:p>
+        </w:tc>
+        <w:tc>
+          <w:tcPr>
+            <w:tcW w:type="dxa" w:w="3969"/>
+            <w:vAlign w:val="top"/>
+            <w:tcBorders>
+              <w:bottom w:val="single" w:sz="4" w:space="4" w:color="E0E0E0"/>
+            </w:tcBorders>
+          </w:tcPr>
+          <w:p>
+            <w:pPr>
+              <w:spacing w:before="40" w:after="40" w:line="264" w:lineRule="auto"/>
+            </w:pPr>
+            <w:r>
+              <w:rPr>
+                <w:rFonts w:ascii="Arial" w:hAnsi="Arial"/>
+                <w:b w:val="0"/>
+                <w:color w:val="1A1A1A"/>
+                <w:sz w:val="18"/>
+              </w:rPr>
+              <w:t>check the profile name with --list-profiles; presets match by name</w:t>
+            </w:r>
+          </w:p>
+        </w:tc>
+      </w:tr>
+      <w:tr>
+        <w:trPr>
+          <w:cantSplit/>
+        </w:trPr>
+        <w:tc>
+          <w:tcPr>
+            <w:tcW w:type="dxa" w:w="2608"/>
+            <w:vAlign w:val="top"/>
+            <w:tcBorders>
+              <w:bottom w:val="single" w:sz="4" w:space="4" w:color="E0E0E0"/>
+            </w:tcBorders>
+          </w:tcPr>
+          <w:p>
+            <w:pPr>
+              <w:spacing w:before="40" w:after="40" w:line="264" w:lineRule="auto"/>
+            </w:pPr>
+            <w:r>
+              <w:rPr>
+                <w:rFonts w:ascii="Arial" w:hAnsi="Arial"/>
+                <w:b/>
+                <w:color w:val="1A1A1A"/>
+                <w:sz w:val="18"/>
+              </w:rPr>
+              <w:t>Project file is not visible in the Projects panel</w:t>
+            </w:r>
+          </w:p>
+        </w:tc>
+        <w:tc>
+          <w:tcPr>
+            <w:tcW w:type="dxa" w:w="3061"/>
+            <w:vAlign w:val="top"/>
+            <w:tcBorders>
+              <w:bottom w:val="single" w:sz="4" w:space="4" w:color="E0E0E0"/>
+            </w:tcBorders>
+          </w:tcPr>
+          <w:p>
+            <w:pPr>
+              <w:spacing w:before="40" w:after="40" w:line="264" w:lineRule="auto"/>
+            </w:pPr>
+            <w:r>
+              <w:rPr>
+                <w:rFonts w:ascii="Arial" w:hAnsi="Arial"/>
+                <w:b w:val="0"/>
+                <w:color w:val="1A1A1A"/>
+                <w:sz w:val="18"/>
+              </w:rPr>
+              <w:t>only native DCC formats are listed (.blend, .spp, .ma, .mb, .hip, .hipl, .hipnc, .nk)</w:t>
+            </w:r>
+          </w:p>
+        </w:tc>
+        <w:tc>
+          <w:tcPr>
+            <w:tcW w:type="dxa" w:w="3969"/>
+            <w:vAlign w:val="top"/>
+            <w:tcBorders>
+              <w:bottom w:val="single" w:sz="4" w:space="4" w:color="E0E0E0"/>
+            </w:tcBorders>
+          </w:tcPr>
+          <w:p>
+            <w:pPr>
+              <w:spacing w:before="40" w:after="40" w:line="264" w:lineRule="auto"/>
+            </w:pPr>
+            <w:r>
+              <w:rPr>
+                <w:rFonts w:ascii="Arial" w:hAnsi="Arial"/>
+                <w:b w:val="0"/>
+                <w:color w:val="1A1A1A"/>
+                <w:sz w:val="18"/>
+              </w:rPr>
+              <w:t>use name search or drag the file into the window directly</w:t>
+            </w:r>
+          </w:p>
+        </w:tc>
+      </w:tr>
+      <w:tr>
+        <w:trPr>
+          <w:cantSplit/>
+        </w:trPr>
+        <w:tc>
+          <w:tcPr>
+            <w:tcW w:type="dxa" w:w="2608"/>
+            <w:vAlign w:val="top"/>
+            <w:tcBorders>
+              <w:bottom w:val="single" w:sz="4" w:space="4" w:color="E0E0E0"/>
+            </w:tcBorders>
+          </w:tcPr>
+          <w:p>
+            <w:pPr>
               <w:spacing w:before="40" w:after="40" w:line="264" w:lineRule="auto"/>
             </w:pPr>
             <w:r>
@@ -2940,7 +4232,6 @@
           </w:tcPr>
           <w:p>
             <w:pPr>
-              <w:keepNext/>
               <w:spacing w:before="40" w:after="40" w:line="264" w:lineRule="auto"/>
             </w:pPr>
             <w:r>
@@ -2964,7 +4255,6 @@
           </w:tcPr>
           <w:p>
             <w:pPr>
-              <w:keepNext/>
               <w:spacing w:before="40" w:after="40" w:line="264" w:lineRule="auto"/>
             </w:pPr>
             <w:r>
@@ -2993,7 +4283,6 @@
           </w:tcPr>
           <w:p>
             <w:pPr>
-              <w:keepNext/>
               <w:spacing w:before="40" w:after="40" w:line="264" w:lineRule="auto"/>
             </w:pPr>
             <w:r>
@@ -3017,7 +4306,6 @@
           </w:tcPr>
           <w:p>
             <w:pPr>
-              <w:keepNext/>
               <w:spacing w:before="40" w:after="40" w:line="264" w:lineRule="auto"/>
             </w:pPr>
             <w:r>
@@ -3041,7 +4329,6 @@
           </w:tcPr>
           <w:p>
             <w:pPr>
-              <w:keepNext/>
               <w:spacing w:before="40" w:after="40" w:line="264" w:lineRule="auto"/>
             </w:pPr>
             <w:r>
@@ -3070,7 +4357,6 @@
           </w:tcPr>
           <w:p>
             <w:pPr>
-              <w:keepNext/>
               <w:spacing w:before="40" w:after="40" w:line="264" w:lineRule="auto"/>
             </w:pPr>
             <w:r>
@@ -3094,7 +4380,6 @@
           </w:tcPr>
           <w:p>
             <w:pPr>
-              <w:keepNext/>
               <w:spacing w:before="40" w:after="40" w:line="264" w:lineRule="auto"/>
             </w:pPr>
             <w:r>
@@ -3118,7 +4403,6 @@
           </w:tcPr>
           <w:p>
             <w:pPr>
-              <w:keepNext/>
               <w:spacing w:before="40" w:after="40" w:line="264" w:lineRule="auto"/>
             </w:pPr>
             <w:r>
@@ -3147,7 +4431,6 @@
           </w:tcPr>
           <w:p>
             <w:pPr>
-              <w:keepNext/>
               <w:spacing w:before="40" w:after="40" w:line="264" w:lineRule="auto"/>
             </w:pPr>
             <w:r>
@@ -3171,7 +4454,6 @@
           </w:tcPr>
           <w:p>
             <w:pPr>
-              <w:keepNext/>
               <w:spacing w:before="40" w:after="40" w:line="264" w:lineRule="auto"/>
             </w:pPr>
             <w:r>
@@ -3195,7 +4477,6 @@
           </w:tcPr>
           <w:p>
             <w:pPr>
-              <w:keepNext/>
               <w:spacing w:before="40" w:after="40" w:line="264" w:lineRule="auto"/>
             </w:pPr>
             <w:r>
@@ -3224,7 +4505,6 @@
           </w:tcPr>
           <w:p>
             <w:pPr>
-              <w:keepNext/>
               <w:spacing w:before="40" w:after="40" w:line="264" w:lineRule="auto"/>
             </w:pPr>
             <w:r>
@@ -3248,7 +4528,6 @@
           </w:tcPr>
           <w:p>
             <w:pPr>
-              <w:keepNext/>
               <w:spacing w:before="40" w:after="40" w:line="264" w:lineRule="auto"/>
             </w:pPr>
             <w:r>
@@ -3272,7 +4551,6 @@
           </w:tcPr>
           <w:p>
             <w:pPr>
-              <w:keepNext/>
               <w:spacing w:before="40" w:after="40" w:line="264" w:lineRule="auto"/>
             </w:pPr>
             <w:r>
@@ -3310,7 +4588,7 @@
                 <w:color w:val="1A1A1A"/>
                 <w:sz w:val="18"/>
               </w:rPr>
-              <w:t>Cannot replace the exe when updating</w:t>
+              <w:t>After moving settings the presets point to wrong places</w:t>
             </w:r>
           </w:p>
         </w:tc>
@@ -3333,7 +4611,7 @@
                 <w:color w:val="1A1A1A"/>
                 <w:sz w:val="18"/>
               </w:rPr>
-              <w:t>the launcher is running (including the tray) and the file is locked</w:t>
+              <w:t>exe paths are machine-specific and are not exported</w:t>
             </w:r>
           </w:p>
         </w:tc>
@@ -3356,7 +4634,7 @@
                 <w:color w:val="1A1A1A"/>
                 <w:sz w:val="18"/>
               </w:rPr>
-              <w:t>close FLOMASTER completely, then replace the files</w:t>
+              <w:t>run Rescan on the new machine — presets will be found in the registry</w:t>
             </w:r>
           </w:p>
         </w:tc>

</xml_diff>

<commit_message>
docs: terminology — «шоу/show» replaced with «проект/project» in manuals and READMEs (paths in CLI examples too)
</commit_message>
<xml_diff>
--- a/docs/FLOMASTER_Manual_EN.docx
+++ b/docs/FLOMASTER_Manual_EN.docx
@@ -586,7 +586,7 @@
           <w:color w:val="1A1A1A"/>
           <w:sz w:val="19"/>
         </w:rPr>
-        <w:t>launch profiles: named app + OCIO config + arguments bundles, one-click show switching;</w:t>
+        <w:t>launch profiles: named app + OCIO config + arguments bundles, one-click project switching;</w:t>
       </w:r>
     </w:p>
     <w:p>
@@ -1060,7 +1060,7 @@
           <w:color w:val="1A1A1A"/>
           <w:sz w:val="19"/>
         </w:rPr>
-        <w:t>A profile is a named snapshot of a launch state: application + OCIO config + arguments. It is the unit of task switching: "show A" and "show B" differ by one click instead of re-tuning three fields.</w:t>
+        <w:t>A profile is a named snapshot of a launch state: application + OCIO config + arguments. It is the unit of task switching: "Project A" and "Project B" differ by one click instead of re-tuning three fields.</w:t>
       </w:r>
     </w:p>
     <w:p>
@@ -1127,7 +1127,7 @@
           <w:color w:val="1A1A1A"/>
           <w:sz w:val="19"/>
         </w:rPr>
-        <w:t>A typical set: one profile per show (different OCIO configs), one per application version, one for background rendering (bake arguments). Profiles travel between machines with your settings — see "Moving to another machine".</w:t>
+        <w:t>A typical set: one profile per project (different OCIO configs), one per application version, one for background rendering (bake arguments). Profiles travel between machines with your settings — see "Moving to another machine".</w:t>
       </w:r>
     </w:p>
     <w:p>
@@ -3044,7 +3044,7 @@
           <w:color w:val="1A1A1A"/>
           <w:sz w:val="19"/>
         </w:rPr>
-        <w:t>FLOMASTER.exe --launch "Profile" --project "D:\shows\A\shot_042.blend"</w:t>
+        <w:t>FLOMASTER.exe --launch "Profile" --project "D:\projects\A\shot_042.blend"</w:t>
       </w:r>
     </w:p>
     <w:p>
@@ -3673,7 +3673,7 @@
       </w:pPr>
       <w:bookmarkStart w:id="100020" w:name="_Toc100020"/>
       <w:r>
-        <w:t>Switching between shows</w:t>
+        <w:t>Switching between projects</w:t>
       </w:r>
       <w:bookmarkEnd w:id="100020"/>
     </w:p>
@@ -3685,7 +3685,7 @@
           <w:color w:val="1A1A1A"/>
           <w:sz w:val="19"/>
         </w:rPr>
-        <w:t>Set up one profile per show and switch them in the Profiles panel with a single click. From the tray a profile launches right away, without the launcher window.</w:t>
+        <w:t>Set up one profile per project and switch them in the Profiles panel with a single click. From the tray a profile launches right away, without the launcher window.</w:t>
       </w:r>
     </w:p>
     <w:p>

</xml_diff>

<commit_message>
docs: manuals updated to v2.5 — fullscreen dashboard section, routing, overlay settings, renumbered 1..18 (RU+EN)
</commit_message>
<xml_diff>
--- a/docs/FLOMASTER_Manual_EN.docx
+++ b/docs/FLOMASTER_Manual_EN.docx
@@ -104,7 +104,7 @@
                 <w:sz w:val="18"/>
                 <w:spacing w:val="60"/>
               </w:rPr>
-              <w:t>V2.4  -  WINDOWS 10/11</w:t>
+              <w:t>V2.5  -  WINDOWS 10/11</w:t>
             </w:r>
           </w:p>
           <w:p>
@@ -238,7 +238,7 @@
         <w:tab/>
       </w:r>
       <w:r>
-        <w:t>3</w:t>
+        <w:t>4</w:t>
       </w:r>
     </w:p>
     <w:p>
@@ -304,7 +304,7 @@
         <w:spacing w:before="120" w:after="60"/>
       </w:pPr>
       <w:r>
-        <w:t>7. Project files</w:t>
+        <w:t>7. The fullscreen dashboard</w:t>
       </w:r>
       <w:r>
         <w:tab/>
@@ -322,7 +322,7 @@
         <w:spacing w:before="120" w:after="60"/>
       </w:pPr>
       <w:r>
-        <w:t>8. OCIO roles</w:t>
+        <w:t>8. Project files</w:t>
       </w:r>
       <w:r>
         <w:tab/>
@@ -340,7 +340,7 @@
         <w:spacing w:before="120" w:after="60"/>
       </w:pPr>
       <w:r>
-        <w:t>9. How OCIO support works</w:t>
+        <w:t>9. OCIO roles</w:t>
       </w:r>
       <w:r>
         <w:tab/>
@@ -358,7 +358,7 @@
         <w:spacing w:before="120" w:after="60"/>
       </w:pPr>
       <w:r>
-        <w:t>10. Themes and the window chrome</w:t>
+        <w:t>10. How OCIO support works</w:t>
       </w:r>
       <w:r>
         <w:tab/>
@@ -376,7 +376,7 @@
         <w:spacing w:before="120" w:after="60"/>
       </w:pPr>
       <w:r>
-        <w:t>11. Settings</w:t>
+        <w:t>11. Themes and the window chrome</w:t>
       </w:r>
       <w:r>
         <w:tab/>
@@ -394,7 +394,7 @@
         <w:spacing w:before="120" w:after="60"/>
       </w:pPr>
       <w:r>
-        <w:t>12. Tray and log</w:t>
+        <w:t>12. Settings</w:t>
       </w:r>
       <w:r>
         <w:tab/>
@@ -412,25 +412,7 @@
         <w:spacing w:before="120" w:after="60"/>
       </w:pPr>
       <w:r>
-        <w:t>13. Command line</w:t>
-      </w:r>
-      <w:r>
-        <w:tab/>
-      </w:r>
-      <w:r>
-        <w:t>6</w:t>
-      </w:r>
-    </w:p>
-    <w:p>
-      <w:pPr>
-        <w:pStyle w:val="9"/>
-        <w:tabs>
-          <w:tab w:val="right" w:leader="dot" w:pos="9026"/>
-        </w:tabs>
-        <w:spacing w:before="120" w:after="60"/>
-      </w:pPr>
-      <w:r>
-        <w:t>14. Moving to another machine</w:t>
+        <w:t>13. Tray and log</w:t>
       </w:r>
       <w:r>
         <w:tab/>
@@ -448,7 +430,7 @@
         <w:spacing w:before="120" w:after="60"/>
       </w:pPr>
       <w:r>
-        <w:t>15. Files and folders</w:t>
+        <w:t>14. Command line</w:t>
       </w:r>
       <w:r>
         <w:tab/>
@@ -466,7 +448,7 @@
         <w:spacing w:before="120" w:after="60"/>
       </w:pPr>
       <w:r>
-        <w:t>16. Workflows</w:t>
+        <w:t>15. Moving to another machine</w:t>
       </w:r>
       <w:r>
         <w:tab/>
@@ -484,7 +466,43 @@
         <w:spacing w:before="120" w:after="60"/>
       </w:pPr>
       <w:r>
-        <w:t>17. Troubleshooting</w:t>
+        <w:t>16. Files and folders</w:t>
+      </w:r>
+      <w:r>
+        <w:tab/>
+      </w:r>
+      <w:r>
+        <w:t>8</w:t>
+      </w:r>
+    </w:p>
+    <w:p>
+      <w:pPr>
+        <w:pStyle w:val="9"/>
+        <w:tabs>
+          <w:tab w:val="right" w:leader="dot" w:pos="9026"/>
+        </w:tabs>
+        <w:spacing w:before="120" w:after="60"/>
+      </w:pPr>
+      <w:r>
+        <w:t>17. Workflows</w:t>
+      </w:r>
+      <w:r>
+        <w:tab/>
+      </w:r>
+      <w:r>
+        <w:t>8</w:t>
+      </w:r>
+    </w:p>
+    <w:p>
+      <w:pPr>
+        <w:pStyle w:val="9"/>
+        <w:tabs>
+          <w:tab w:val="right" w:leader="dot" w:pos="9026"/>
+        </w:tabs>
+        <w:spacing w:before="120" w:after="60"/>
+      </w:pPr>
+      <w:r>
+        <w:t>18. Troubleshooting</w:t>
       </w:r>
       <w:r>
         <w:tab/>
@@ -601,7 +619,21 @@
           <w:color w:val="1A1A1A"/>
           <w:sz w:val="19"/>
         </w:rPr>
-        <w:t>Projects panel: a project file browser over your own folders, opening files right in the launcher;</w:t>
+        <w:t>fullscreen overlay dashboard by Ctrl+Alt+F: color config, applications, projects, profiles, roles and recent files — over everything;</w:t>
+      </w:r>
+    </w:p>
+    <w:p>
+      <w:pPr>
+        <w:pStyle w:val="ListBullet"/>
+      </w:pPr>
+      <w:r>
+        <w:rPr>
+          <w:rFonts w:ascii="Arial" w:hAnsi="Arial"/>
+          <w:i w:val="0"/>
+          <w:color w:val="1A1A1A"/>
+          <w:sz w:val="19"/>
+        </w:rPr>
+        <w:t>project routing: .spp opens in Substance Painter, .blend in Blender, .hip in Houdini;</w:t>
       </w:r>
     </w:p>
     <w:p>
@@ -775,6 +807,20 @@
     </w:p>
     <w:p>
       <w:pPr>
+        <w:pStyle w:val="ListBullet"/>
+      </w:pPr>
+      <w:r>
+        <w:rPr>
+          <w:rFonts w:ascii="Arial" w:hAnsi="Arial"/>
+          <w:i w:val="0"/>
+          <w:color w:val="1A1A1A"/>
+          <w:sz w:val="19"/>
+        </w:rPr>
+        <w:t>Auto-update: on start the launcher compares its version against the latest release on GitHub. If a new one is out, it is downloaded in the background with no action on your side; a Restart and install button appears in Settings.</w:t>
+      </w:r>
+    </w:p>
+    <w:p>
+      <w:pPr>
         <w:pStyle w:val="Heading2"/>
       </w:pPr>
       <w:bookmarkStart w:id="100003" w:name="_Toc100003"/>
@@ -782,17 +828,6 @@
         <w:t>2.1 Auto-update</w:t>
       </w:r>
       <w:bookmarkEnd w:id="100003"/>
-    </w:p>
-    <w:p>
-      <w:r>
-        <w:rPr>
-          <w:rFonts w:ascii="Arial" w:hAnsi="Arial"/>
-          <w:i w:val="0"/>
-          <w:color w:val="1A1A1A"/>
-          <w:sz w:val="19"/>
-        </w:rPr>
-        <w:t>A few seconds after launch the launcher compares its version against the latest release on GitHub. If a new one is out, it is downloaded in the background with no action on your side; a Restart and install button appears in Settings.</w:t>
-      </w:r>
     </w:p>
     <w:tbl>
       <w:tblPr>
@@ -1195,7 +1230,7 @@
           <w:color w:val="1A1A1A"/>
           <w:sz w:val="19"/>
         </w:rPr>
-        <w:t>Expand the Projects panel, add a project folder with the "+" button and open a file with a click — it starts in the selected application.</w:t>
+        <w:t>Expand the Projects panel, add a project folder with the "+" button and open a file with a click — it starts in the matching application.</w:t>
       </w:r>
     </w:p>
     <w:p>
@@ -1223,7 +1258,7 @@
           <w:color w:val="1A1A1A"/>
           <w:sz w:val="19"/>
         </w:rPr>
-        <w:t>Ctrl+Alt+F hides and restores the launcher above any application.</w:t>
+        <w:t>Ctrl+Alt+F opens the fullscreen dashboard over everything: color config, applications, projects, profiles and roles on one screen.</w:t>
       </w:r>
     </w:p>
     <w:p>
@@ -1373,7 +1408,7 @@
           <w:color w:val="1A1A1A"/>
           <w:sz w:val="19"/>
         </w:rPr>
-        <w:t>A profile is a named snapshot of a launch state: application + OCIO config + arguments. It is the unit of task switching: "Project A" and "Project B" differ by one click instead of re-tuning three fields.</w:t>
+        <w:t>A profile is a named snapshot of a launch state: application + OCIO config + arguments. It is the unit of task switching: "project A" and "project B" differ by one click instead of re-tuning three fields.</w:t>
       </w:r>
     </w:p>
     <w:p>
@@ -1480,7 +1515,7 @@
           <w:color w:val="1A1A1A"/>
           <w:sz w:val="19"/>
         </w:rPr>
-        <w:t>The Projects panel is a project file browser inside the launcher: instead of digging through the file manager you open the file you need with one click.</w:t>
+        <w:t>The Projects panel is a project file browser inside the launcher: instead of digging through the file manager you open the needed file with one click.</w:t>
       </w:r>
     </w:p>
     <w:p>
@@ -1508,7 +1543,7 @@
           <w:color w:val="1A1A1A"/>
           <w:sz w:val="19"/>
         </w:rPr>
-        <w:t>expand the Projects panel: the list shows every project file under the root recursively, with relative paths;</w:t>
+        <w:t>the list shows every project file under the root recursively, with relative paths;</w:t>
       </w:r>
     </w:p>
     <w:p>
@@ -1522,7 +1557,7 @@
           <w:color w:val="1A1A1A"/>
           <w:sz w:val="19"/>
         </w:rPr>
-        <w:t>the search field filters the list by file name;</w:t>
+        <w:t>a click opens the file in the matching application: .spp — in Substance Painter, .blend — in Blender, .hip — in Houdini (the application is picked by extension, even if another one is selected in the list);</w:t>
       </w:r>
     </w:p>
     <w:p>
@@ -1536,18 +1571,7 @@
           <w:color w:val="1A1A1A"/>
           <w:sz w:val="19"/>
         </w:rPr>
-        <w:t>clicking a file opens it with the current application, OCIO config applied, and adds it to Recent.</w:t>
-      </w:r>
-    </w:p>
-    <w:p>
-      <w:r>
-        <w:rPr>
-          <w:rFonts w:ascii="Arial" w:hAnsi="Arial"/>
-          <w:i w:val="0"/>
-          <w:color w:val="1A1A1A"/>
-          <w:sz w:val="19"/>
-        </w:rPr>
-        <w:t>Only native DCC formats are listed: .blend, .spp, .ma, .mb, .hip, .hipl, .hipnc, .nk. Export formats (.fbx, .obj, .stl) are deliberately hidden — those are exports, not projects.</w:t>
+        <w:t>Recent — the same rule: recent files reopen in their applications.</w:t>
       </w:r>
     </w:p>
     <w:p>
@@ -1575,7 +1599,7 @@
           <w:sz w:val="30"/>
           <w:spacing w:val="20"/>
         </w:rPr>
-        <w:t>PROJECT FILES</w:t>
+        <w:t>THE FULLSCREEN DASHBOARD</w:t>
       </w:r>
       <w:bookmarkEnd w:id="100011"/>
     </w:p>
@@ -1587,7 +1611,130 @@
           <w:color w:val="1A1A1A"/>
           <w:sz w:val="19"/>
         </w:rPr>
-        <w:t>Drag a project file onto the launcher window — it opens in the selected application with the OCIO config applied. The same files are available in the Recent list — a click reopens them without the file manager. Supported: .blend, .spp, .ma, .mb, .hip, .hipl, .hipnc, .nk.</w:t>
+        <w:t>Ctrl+Alt+F opens the launcher over every window: color config, applications, projects, profiles, roles and recent files — on one screen. Ctrl+Alt+F again or Esc closes the dashboard.</w:t>
+      </w:r>
+    </w:p>
+    <w:p>
+      <w:pPr>
+        <w:pStyle w:val="ListBullet"/>
+      </w:pPr>
+      <w:r>
+        <w:rPr>
+          <w:rFonts w:ascii="Arial" w:hAnsi="Arial"/>
+          <w:i w:val="0"/>
+          <w:color w:val="1A1A1A"/>
+          <w:sz w:val="19"/>
+        </w:rPr>
+        <w:t>COLOR CONFIG: click a chip to switch the config for all subsequent launches;</w:t>
+      </w:r>
+    </w:p>
+    <w:p>
+      <w:pPr>
+        <w:pStyle w:val="ListBullet"/>
+      </w:pPr>
+      <w:r>
+        <w:rPr>
+          <w:rFonts w:ascii="Arial" w:hAnsi="Arial"/>
+          <w:i w:val="0"/>
+          <w:color w:val="1A1A1A"/>
+          <w:sz w:val="19"/>
+        </w:rPr>
+        <w:t>APPLICATIONS: tiles with real exe icons, click = launch;</w:t>
+      </w:r>
+    </w:p>
+    <w:p>
+      <w:pPr>
+        <w:pStyle w:val="ListBullet"/>
+      </w:pPr>
+      <w:r>
+        <w:rPr>
+          <w:rFonts w:ascii="Arial" w:hAnsi="Arial"/>
+          <w:i w:val="0"/>
+          <w:color w:val="1A1A1A"/>
+          <w:sz w:val="19"/>
+        </w:rPr>
+        <w:t>PROJECTS: root chips and project files, a click opens the file in the matching application;</w:t>
+      </w:r>
+    </w:p>
+    <w:p>
+      <w:pPr>
+        <w:pStyle w:val="ListBullet"/>
+      </w:pPr>
+      <w:r>
+        <w:rPr>
+          <w:rFonts w:ascii="Arial" w:hAnsi="Arial"/>
+          <w:i w:val="0"/>
+          <w:color w:val="1A1A1A"/>
+          <w:sz w:val="19"/>
+        </w:rPr>
+        <w:t>PROFILES: a click applies the profile and launches the application;</w:t>
+      </w:r>
+    </w:p>
+    <w:p>
+      <w:pPr>
+        <w:pStyle w:val="ListBullet"/>
+      </w:pPr>
+      <w:r>
+        <w:rPr>
+          <w:rFonts w:ascii="Arial" w:hAnsi="Arial"/>
+          <w:i w:val="0"/>
+          <w:color w:val="1A1A1A"/>
+          <w:sz w:val="19"/>
+        </w:rPr>
+        <w:t>OCIO ROLES: clicking a role opens the colorspace picker, Reset returns the config values;</w:t>
+      </w:r>
+    </w:p>
+    <w:p>
+      <w:pPr>
+        <w:pStyle w:val="ListBullet"/>
+      </w:pPr>
+      <w:r>
+        <w:rPr>
+          <w:rFonts w:ascii="Arial" w:hAnsi="Arial"/>
+          <w:i w:val="0"/>
+          <w:color w:val="1A1A1A"/>
+          <w:sz w:val="19"/>
+        </w:rPr>
+        <w:t>RECENT FILES: recent files, a click reopens them;</w:t>
+      </w:r>
+    </w:p>
+    <w:p>
+      <w:pPr>
+        <w:pStyle w:val="ListBullet"/>
+      </w:pPr>
+      <w:r>
+        <w:rPr>
+          <w:rFonts w:ascii="Arial" w:hAnsi="Arial"/>
+          <w:i w:val="0"/>
+          <w:color w:val="1A1A1A"/>
+          <w:sz w:val="19"/>
+        </w:rPr>
+        <w:t>ARGUMENTS: arguments applied to launches (including from the dashboard);</w:t>
+      </w:r>
+    </w:p>
+    <w:p>
+      <w:pPr>
+        <w:pStyle w:val="ListBullet"/>
+      </w:pPr>
+      <w:r>
+        <w:rPr>
+          <w:rFonts w:ascii="Arial" w:hAnsi="Arial"/>
+          <w:i w:val="0"/>
+          <w:color w:val="1A1A1A"/>
+          <w:sz w:val="19"/>
+        </w:rPr>
+        <w:t>SETTINGS: theme, always-on-top mode and the hotkey.</w:t>
+      </w:r>
+    </w:p>
+    <w:p>
+      <w:r>
+        <w:rPr>
+          <w:rFonts w:ascii="Arial" w:hAnsi="Arial"/>
+          <w:i w:val="0"/>
+          <w:color w:val="1A1A1A"/>
+          <w:sz w:val="19"/>
+        </w:rPr>
+        <w:t>The dashboard opens on the monitor where it was last closed (remembered in the settings) and can be dragged between monitors by its header — sizes adapt to each monitor. If you do not need it above other windows — untick Overlay on top in the dashboard settings.</w:t>
       </w:r>
     </w:p>
     <w:p>
@@ -1615,9 +1762,49 @@
           <w:sz w:val="30"/>
           <w:spacing w:val="20"/>
         </w:rPr>
+        <w:t>PROJECT FILES</w:t>
+      </w:r>
+      <w:bookmarkEnd w:id="100012"/>
+    </w:p>
+    <w:p>
+      <w:r>
+        <w:rPr>
+          <w:rFonts w:ascii="Arial" w:hAnsi="Arial"/>
+          <w:i w:val="0"/>
+          <w:color w:val="1A1A1A"/>
+          <w:sz w:val="19"/>
+        </w:rPr>
+        <w:t>Drag a project file onto the launcher window — the file opens in the matching application with the OCIO config applied: .spp — in Substance Painter, .blend — in Blender, .hip — in Houdini (the application is picked by extension, even if another one is selected in the list). Supported: .blend, .spp, .ma, .mb, .hip, .hipl, .hipnc, .nk. Recently opened files are available in the Recent list — a click reopens them in their applications.</w:t>
+      </w:r>
+    </w:p>
+    <w:p>
+      <w:pPr>
+        <w:pStyle w:val="Heading1"/>
+        <w:pBdr>
+          <w:left w:val="single" w:sz="24" w:space="8" w:color="C82823"/>
+        </w:pBdr>
+      </w:pPr>
+      <w:bookmarkStart w:id="100013" w:name="_Toc100013"/>
+      <w:r>
+        <w:rPr>
+          <w:rFonts w:ascii="Century Gothic" w:hAnsi="Century Gothic"/>
+          <w:b/>
+          <w:color w:val="000000"/>
+          <w:sz w:val="30"/>
+        </w:rPr>
+        <w:t xml:space="preserve">9. </w:t>
+      </w:r>
+      <w:r>
+        <w:rPr>
+          <w:rFonts w:ascii="Century Gothic" w:hAnsi="Century Gothic"/>
+          <w:b/>
+          <w:color w:val="000000"/>
+          <w:sz w:val="30"/>
+          <w:spacing w:val="20"/>
+        </w:rPr>
         <w:t>OCIO ROLES</w:t>
       </w:r>
-      <w:bookmarkEnd w:id="100012"/>
+      <w:bookmarkEnd w:id="100013"/>
     </w:p>
     <w:p>
       <w:r>
@@ -1683,7 +1870,7 @@
           <w:color w:val="1A1A1A"/>
           <w:sz w:val="19"/>
         </w:rPr>
-        <w:t>under the config selector a validation line highlights missing critical roles and broken references in advance.</w:t>
+        <w:t>under the config selector — a validation line: missing critical roles and broken references are highlighted in advance.</w:t>
       </w:r>
     </w:p>
     <w:p>
@@ -1693,7 +1880,7 @@
           <w:left w:val="single" w:sz="24" w:space="8" w:color="C82823"/>
         </w:pBdr>
       </w:pPr>
-      <w:bookmarkStart w:id="100013" w:name="_Toc100013"/>
+      <w:bookmarkStart w:id="100014" w:name="_Toc100014"/>
       <w:r>
         <w:rPr>
           <w:rFonts w:ascii="Century Gothic" w:hAnsi="Century Gothic"/>
@@ -1701,7 +1888,7 @@
           <w:color w:val="000000"/>
           <w:sz w:val="30"/>
         </w:rPr>
-        <w:t xml:space="preserve">9. </w:t>
+        <w:t xml:space="preserve">10. </w:t>
       </w:r>
       <w:r>
         <w:rPr>
@@ -1713,7 +1900,7 @@
         </w:rPr>
         <w:t>HOW OCIO SUPPORT WORKS</w:t>
       </w:r>
-      <w:bookmarkEnd w:id="100013"/>
+      <w:bookmarkEnd w:id="100014"/>
     </w:p>
     <w:p>
       <w:r>
@@ -1936,7 +2123,7 @@
           <w:left w:val="single" w:sz="24" w:space="8" w:color="C82823"/>
         </w:pBdr>
       </w:pPr>
-      <w:bookmarkStart w:id="100014" w:name="_Toc100014"/>
+      <w:bookmarkStart w:id="100015" w:name="_Toc100015"/>
       <w:r>
         <w:rPr>
           <w:rFonts w:ascii="Century Gothic" w:hAnsi="Century Gothic"/>
@@ -1944,7 +2131,7 @@
           <w:color w:val="000000"/>
           <w:sz w:val="30"/>
         </w:rPr>
-        <w:t xml:space="preserve">10. </w:t>
+        <w:t xml:space="preserve">11. </w:t>
       </w:r>
       <w:r>
         <w:rPr>
@@ -1956,7 +2143,7 @@
         </w:rPr>
         <w:t>THEMES AND THE WINDOW CHROME</w:t>
       </w:r>
-      <w:bookmarkEnd w:id="100014"/>
+      <w:bookmarkEnd w:id="100015"/>
     </w:p>
     <w:p>
       <w:r>
@@ -2626,7 +2813,7 @@
           <w:left w:val="single" w:sz="24" w:space="8" w:color="C82823"/>
         </w:pBdr>
       </w:pPr>
-      <w:bookmarkStart w:id="100015" w:name="_Toc100015"/>
+      <w:bookmarkStart w:id="100016" w:name="_Toc100016"/>
       <w:r>
         <w:rPr>
           <w:rFonts w:ascii="Century Gothic" w:hAnsi="Century Gothic"/>
@@ -2634,7 +2821,7 @@
           <w:color w:val="000000"/>
           <w:sz w:val="30"/>
         </w:rPr>
-        <w:t xml:space="preserve">11. </w:t>
+        <w:t xml:space="preserve">12. </w:t>
       </w:r>
       <w:r>
         <w:rPr>
@@ -2646,7 +2833,7 @@
         </w:rPr>
         <w:t>SETTINGS</w:t>
       </w:r>
-      <w:bookmarkEnd w:id="100015"/>
+      <w:bookmarkEnd w:id="100016"/>
     </w:p>
     <w:tbl>
       <w:tblPr>
@@ -2947,7 +3134,7 @@
                 <w:color w:val="1A1A1A"/>
                 <w:sz w:val="18"/>
               </w:rPr>
-              <w:t>Smooth animation</w:t>
+              <w:t>Overlay on top</w:t>
             </w:r>
           </w:p>
         </w:tc>
@@ -2970,7 +3157,7 @@
                 <w:color w:val="1A1A1A"/>
                 <w:sz w:val="18"/>
               </w:rPr>
-              <w:t>enable/disable panel animation</w:t>
+              <w:t>fullscreen dashboard above all windows</w:t>
             </w:r>
           </w:p>
         </w:tc>
@@ -3021,7 +3208,58 @@
                 <w:color w:val="1A1A1A"/>
                 <w:sz w:val="18"/>
               </w:rPr>
-              <w:t>global hotkey: show/hide the launcher above everything</w:t>
+              <w:t>global hotkey: show/hide the dashboard</w:t>
+            </w:r>
+          </w:p>
+        </w:tc>
+      </w:tr>
+      <w:tr>
+        <w:trPr>
+          <w:cantSplit/>
+        </w:trPr>
+        <w:tc>
+          <w:tcPr>
+            <w:tcW w:type="dxa" w:w="3402"/>
+            <w:vAlign w:val="top"/>
+            <w:tcBorders>
+              <w:bottom w:val="single" w:sz="4" w:space="4" w:color="E0E0E0"/>
+            </w:tcBorders>
+          </w:tcPr>
+          <w:p>
+            <w:pPr>
+              <w:spacing w:before="40" w:after="40" w:line="264" w:lineRule="auto"/>
+            </w:pPr>
+            <w:r>
+              <w:rPr>
+                <w:rFonts w:ascii="Arial" w:hAnsi="Arial"/>
+                <w:b/>
+                <w:color w:val="1A1A1A"/>
+                <w:sz w:val="18"/>
+              </w:rPr>
+              <w:t>Smooth animation</w:t>
+            </w:r>
+          </w:p>
+        </w:tc>
+        <w:tc>
+          <w:tcPr>
+            <w:tcW w:type="dxa" w:w="6236"/>
+            <w:vAlign w:val="top"/>
+            <w:tcBorders>
+              <w:bottom w:val="single" w:sz="4" w:space="4" w:color="E0E0E0"/>
+            </w:tcBorders>
+          </w:tcPr>
+          <w:p>
+            <w:pPr>
+              <w:spacing w:before="40" w:after="40" w:line="264" w:lineRule="auto"/>
+            </w:pPr>
+            <w:r>
+              <w:rPr>
+                <w:rFonts w:ascii="Arial" w:hAnsi="Arial"/>
+                <w:b w:val="0"/>
+                <w:color w:val="1A1A1A"/>
+                <w:sz w:val="18"/>
+              </w:rPr>
+              <w:t>enable/disable panel animation</w:t>
             </w:r>
           </w:p>
         </w:tc>
@@ -3243,7 +3481,7 @@
           <w:left w:val="single" w:sz="24" w:space="8" w:color="C82823"/>
         </w:pBdr>
       </w:pPr>
-      <w:bookmarkStart w:id="100016" w:name="_Toc100016"/>
+      <w:bookmarkStart w:id="100017" w:name="_Toc100017"/>
       <w:r>
         <w:rPr>
           <w:rFonts w:ascii="Century Gothic" w:hAnsi="Century Gothic"/>
@@ -3251,7 +3489,7 @@
           <w:color w:val="000000"/>
           <w:sz w:val="30"/>
         </w:rPr>
-        <w:t xml:space="preserve">12. </w:t>
+        <w:t xml:space="preserve">13. </w:t>
       </w:r>
       <w:r>
         <w:rPr>
@@ -3263,7 +3501,7 @@
         </w:rPr>
         <w:t>TRAY AND LOG</w:t>
       </w:r>
-      <w:bookmarkEnd w:id="100016"/>
+      <w:bookmarkEnd w:id="100017"/>
     </w:p>
     <w:p>
       <w:r>
@@ -3294,7 +3532,7 @@
           <w:left w:val="single" w:sz="24" w:space="8" w:color="C82823"/>
         </w:pBdr>
       </w:pPr>
-      <w:bookmarkStart w:id="100017" w:name="_Toc100017"/>
+      <w:bookmarkStart w:id="100018" w:name="_Toc100018"/>
       <w:r>
         <w:rPr>
           <w:rFonts w:ascii="Century Gothic" w:hAnsi="Century Gothic"/>
@@ -3302,7 +3540,7 @@
           <w:color w:val="000000"/>
           <w:sz w:val="30"/>
         </w:rPr>
-        <w:t xml:space="preserve">13. </w:t>
+        <w:t xml:space="preserve">14. </w:t>
       </w:r>
       <w:r>
         <w:rPr>
@@ -3314,7 +3552,7 @@
         </w:rPr>
         <w:t>COMMAND LINE</w:t>
       </w:r>
-      <w:bookmarkEnd w:id="100017"/>
+      <w:bookmarkEnd w:id="100018"/>
     </w:p>
     <w:p>
       <w:r>
@@ -3623,7 +3861,7 @@
           <w:left w:val="single" w:sz="24" w:space="8" w:color="C82823"/>
         </w:pBdr>
       </w:pPr>
-      <w:bookmarkStart w:id="100018" w:name="_Toc100018"/>
+      <w:bookmarkStart w:id="100019" w:name="_Toc100019"/>
       <w:r>
         <w:rPr>
           <w:rFonts w:ascii="Century Gothic" w:hAnsi="Century Gothic"/>
@@ -3631,7 +3869,7 @@
           <w:color w:val="000000"/>
           <w:sz w:val="30"/>
         </w:rPr>
-        <w:t xml:space="preserve">14. </w:t>
+        <w:t xml:space="preserve">15. </w:t>
       </w:r>
       <w:r>
         <w:rPr>
@@ -3643,7 +3881,7 @@
         </w:rPr>
         <w:t>MOVING TO ANOTHER MACHINE</w:t>
       </w:r>
-      <w:bookmarkEnd w:id="100018"/>
+      <w:bookmarkEnd w:id="100019"/>
     </w:p>
     <w:p>
       <w:r>
@@ -3716,7 +3954,7 @@
           <w:left w:val="single" w:sz="24" w:space="8" w:color="C82823"/>
         </w:pBdr>
       </w:pPr>
-      <w:bookmarkStart w:id="100019" w:name="_Toc100019"/>
+      <w:bookmarkStart w:id="100020" w:name="_Toc100020"/>
       <w:r>
         <w:rPr>
           <w:rFonts w:ascii="Century Gothic" w:hAnsi="Century Gothic"/>
@@ -3724,7 +3962,7 @@
           <w:color w:val="000000"/>
           <w:sz w:val="30"/>
         </w:rPr>
-        <w:t xml:space="preserve">15. </w:t>
+        <w:t xml:space="preserve">16. </w:t>
       </w:r>
       <w:r>
         <w:rPr>
@@ -3736,7 +3974,7 @@
         </w:rPr>
         <w:t>FILES AND FOLDERS</w:t>
       </w:r>
-      <w:bookmarkEnd w:id="100019"/>
+      <w:bookmarkEnd w:id="100020"/>
     </w:p>
     <w:tbl>
       <w:tblPr>
@@ -3937,7 +4175,7 @@
           <w:left w:val="single" w:sz="24" w:space="8" w:color="C82823"/>
         </w:pBdr>
       </w:pPr>
-      <w:bookmarkStart w:id="100020" w:name="_Toc100020"/>
+      <w:bookmarkStart w:id="100021" w:name="_Toc100021"/>
       <w:r>
         <w:rPr>
           <w:rFonts w:ascii="Century Gothic" w:hAnsi="Century Gothic"/>
@@ -3945,7 +4183,7 @@
           <w:color w:val="000000"/>
           <w:sz w:val="30"/>
         </w:rPr>
-        <w:t xml:space="preserve">16. </w:t>
+        <w:t xml:space="preserve">17. </w:t>
       </w:r>
       <w:r>
         <w:rPr>
@@ -3957,17 +4195,17 @@
         </w:rPr>
         <w:t>WORKFLOWS</w:t>
       </w:r>
-      <w:bookmarkEnd w:id="100020"/>
+      <w:bookmarkEnd w:id="100021"/>
     </w:p>
     <w:p>
       <w:pPr>
         <w:pStyle w:val="Heading2"/>
       </w:pPr>
-      <w:bookmarkStart w:id="100021" w:name="_Toc100021"/>
+      <w:bookmarkStart w:id="100022" w:name="_Toc100022"/>
       <w:r>
         <w:t>One color from the start of the day</w:t>
       </w:r>
-      <w:bookmarkEnd w:id="100021"/>
+      <w:bookmarkEnd w:id="100022"/>
     </w:p>
     <w:p>
       <w:r>
@@ -3984,30 +4222,9 @@
       <w:pPr>
         <w:pStyle w:val="Heading2"/>
       </w:pPr>
-      <w:bookmarkStart w:id="100022" w:name="_Toc100022"/>
+      <w:bookmarkStart w:id="100023" w:name="_Toc100023"/>
       <w:r>
         <w:t>Switching between projects</w:t>
-      </w:r>
-      <w:bookmarkEnd w:id="100022"/>
-    </w:p>
-    <w:p>
-      <w:r>
-        <w:rPr>
-          <w:rFonts w:ascii="Arial" w:hAnsi="Arial"/>
-          <w:i w:val="0"/>
-          <w:color w:val="1A1A1A"/>
-          <w:sz w:val="19"/>
-        </w:rPr>
-        <w:t>Set up one profile per project and switch them in the Profiles panel with a single click. From the tray a profile launches right away, without the launcher window.</w:t>
-      </w:r>
-    </w:p>
-    <w:p>
-      <w:pPr>
-        <w:pStyle w:val="Heading2"/>
-      </w:pPr>
-      <w:bookmarkStart w:id="100023" w:name="_Toc100023"/>
-      <w:r>
-        <w:t>Open a project file without leaving the task</w:t>
       </w:r>
       <w:bookmarkEnd w:id="100023"/>
     </w:p>
@@ -4019,7 +4236,7 @@
           <w:color w:val="1A1A1A"/>
           <w:sz w:val="19"/>
         </w:rPr>
-        <w:t>Projects panel → root → click the file. Name search finds files deep inside folders.</w:t>
+        <w:t>Set up one profile per project and switch them in the Profiles panel with a single click. From the tray a profile launches right away, without the launcher window. The fullscreen dashboard (Ctrl+Alt+F) shows the config, applications and project files on one screen.</w:t>
       </w:r>
     </w:p>
     <w:p>
@@ -4028,9 +4245,30 @@
       </w:pPr>
       <w:bookmarkStart w:id="100024" w:name="_Toc100024"/>
       <w:r>
+        <w:t>Open a project file without leaving the task</w:t>
+      </w:r>
+      <w:bookmarkEnd w:id="100024"/>
+    </w:p>
+    <w:p>
+      <w:r>
+        <w:rPr>
+          <w:rFonts w:ascii="Arial" w:hAnsi="Arial"/>
+          <w:i w:val="0"/>
+          <w:color w:val="1A1A1A"/>
+          <w:sz w:val="19"/>
+        </w:rPr>
+        <w:t>Projects panel → root → click the file. Name search finds files deep inside folders. The file opens in the right application — extension routing works in the dashboard too.</w:t>
+      </w:r>
+    </w:p>
+    <w:p>
+      <w:pPr>
+        <w:pStyle w:val="Heading2"/>
+      </w:pPr>
+      <w:bookmarkStart w:id="100025" w:name="_Toc100025"/>
+      <w:r>
         <w:t>Textures: what opens and where</w:t>
       </w:r>
-      <w:bookmarkEnd w:id="100024"/>
+      <w:bookmarkEnd w:id="100025"/>
     </w:p>
     <w:p>
       <w:r>
@@ -4047,11 +4285,11 @@
       <w:pPr>
         <w:pStyle w:val="Heading2"/>
       </w:pPr>
-      <w:bookmarkStart w:id="100025" w:name="_Toc100025"/>
+      <w:bookmarkStart w:id="100026" w:name="_Toc100026"/>
       <w:r>
         <w:t>Background render from a batch file</w:t>
       </w:r>
-      <w:bookmarkEnd w:id="100025"/>
+      <w:bookmarkEnd w:id="100026"/>
     </w:p>
     <w:p>
       <w:r>
@@ -4068,11 +4306,11 @@
       <w:pPr>
         <w:pStyle w:val="Heading2"/>
       </w:pPr>
-      <w:bookmarkStart w:id="100026" w:name="_Toc100026"/>
+      <w:bookmarkStart w:id="100027" w:name="_Toc100027"/>
       <w:r>
         <w:t>Several versions of one application</w:t>
       </w:r>
-      <w:bookmarkEnd w:id="100026"/>
+      <w:bookmarkEnd w:id="100027"/>
     </w:p>
     <w:p>
       <w:r>
@@ -4092,7 +4330,7 @@
           <w:left w:val="single" w:sz="24" w:space="8" w:color="C82823"/>
         </w:pBdr>
       </w:pPr>
-      <w:bookmarkStart w:id="100027" w:name="_Toc100027"/>
+      <w:bookmarkStart w:id="100028" w:name="_Toc100028"/>
       <w:r>
         <w:rPr>
           <w:rFonts w:ascii="Century Gothic" w:hAnsi="Century Gothic"/>
@@ -4100,7 +4338,7 @@
           <w:color w:val="000000"/>
           <w:sz w:val="30"/>
         </w:rPr>
-        <w:t xml:space="preserve">17. </w:t>
+        <w:t xml:space="preserve">18. </w:t>
       </w:r>
       <w:r>
         <w:rPr>
@@ -4112,7 +4350,7 @@
         </w:rPr>
         <w:t>TROUBLESHOOTING</w:t>
       </w:r>
-      <w:bookmarkEnd w:id="100027"/>
+      <w:bookmarkEnd w:id="100028"/>
     </w:p>
     <w:tbl>
       <w:tblPr>
@@ -4356,6 +4594,80 @@
                 <w:sz w:val="18"/>
               </w:rPr>
               <w:t>check for a warn line in the log; free the combination or toggle the Global hotkey checkbox off and on</w:t>
+            </w:r>
+          </w:p>
+        </w:tc>
+      </w:tr>
+      <w:tr>
+        <w:trPr>
+          <w:cantSplit/>
+        </w:trPr>
+        <w:tc>
+          <w:tcPr>
+            <w:tcW w:type="dxa" w:w="2608"/>
+            <w:vAlign w:val="top"/>
+            <w:tcBorders>
+              <w:bottom w:val="single" w:sz="4" w:space="4" w:color="E0E0E0"/>
+            </w:tcBorders>
+          </w:tcPr>
+          <w:p>
+            <w:pPr>
+              <w:spacing w:before="40" w:after="40" w:line="264" w:lineRule="auto"/>
+            </w:pPr>
+            <w:r>
+              <w:rPr>
+                <w:rFonts w:ascii="Arial" w:hAnsi="Arial"/>
+                <w:b/>
+                <w:color w:val="1A1A1A"/>
+                <w:sz w:val="18"/>
+              </w:rPr>
+              <w:t>The dashboard opened on the wrong monitor</w:t>
+            </w:r>
+          </w:p>
+        </w:tc>
+        <w:tc>
+          <w:tcPr>
+            <w:tcW w:type="dxa" w:w="3061"/>
+            <w:vAlign w:val="top"/>
+            <w:tcBorders>
+              <w:bottom w:val="single" w:sz="4" w:space="4" w:color="E0E0E0"/>
+            </w:tcBorders>
+          </w:tcPr>
+          <w:p>
+            <w:pPr>
+              <w:spacing w:before="40" w:after="40" w:line="264" w:lineRule="auto"/>
+            </w:pPr>
+            <w:r>
+              <w:rPr>
+                <w:rFonts w:ascii="Arial" w:hAnsi="Arial"/>
+                <w:b w:val="0"/>
+                <w:color w:val="1A1A1A"/>
+                <w:sz w:val="18"/>
+              </w:rPr>
+              <w:t>monitor memory is updated when the dashboard closes</w:t>
+            </w:r>
+          </w:p>
+        </w:tc>
+        <w:tc>
+          <w:tcPr>
+            <w:tcW w:type="dxa" w:w="3969"/>
+            <w:vAlign w:val="top"/>
+            <w:tcBorders>
+              <w:bottom w:val="single" w:sz="4" w:space="4" w:color="E0E0E0"/>
+            </w:tcBorders>
+          </w:tcPr>
+          <w:p>
+            <w:pPr>
+              <w:spacing w:before="40" w:after="40" w:line="264" w:lineRule="auto"/>
+            </w:pPr>
+            <w:r>
+              <w:rPr>
+                <w:rFonts w:ascii="Arial" w:hAnsi="Arial"/>
+                <w:b w:val="0"/>
+                <w:color w:val="1A1A1A"/>
+                <w:sz w:val="18"/>
+              </w:rPr>
+              <w:t>drag the dashboard by its header to the monitor you need — it will be remembered</w:t>
             </w:r>
           </w:p>
         </w:tc>
@@ -4813,7 +5125,7 @@
             <w:tcW w:type="dxa" w:w="2608"/>
             <w:vAlign w:val="top"/>
             <w:tcBorders>
-              <w:bottom w:val="single" w:sz="4" w:space="4" w:color="E0E0E0"/>
+              <w:bottom w:val="single" w:sz="8" w:space="4" w:color="000000"/>
             </w:tcBorders>
           </w:tcPr>
           <w:p>
@@ -4836,7 +5148,7 @@
             <w:tcW w:type="dxa" w:w="3061"/>
             <w:vAlign w:val="top"/>
             <w:tcBorders>
-              <w:bottom w:val="single" w:sz="4" w:space="4" w:color="E0E0E0"/>
+              <w:bottom w:val="single" w:sz="8" w:space="4" w:color="000000"/>
             </w:tcBorders>
           </w:tcPr>
           <w:p>
@@ -4859,7 +5171,7 @@
             <w:tcW w:type="dxa" w:w="3969"/>
             <w:vAlign w:val="top"/>
             <w:tcBorders>
-              <w:bottom w:val="single" w:sz="4" w:space="4" w:color="E0E0E0"/>
+              <w:bottom w:val="single" w:sz="8" w:space="4" w:color="000000"/>
             </w:tcBorders>
           </w:tcPr>
           <w:p>
@@ -4874,154 +5186,6 @@
                 <w:sz w:val="18"/>
               </w:rPr>
               <w:t>look in %APPDATA%\FLOMASTER\ - updates never touch them</w:t>
-            </w:r>
-          </w:p>
-        </w:tc>
-      </w:tr>
-      <w:tr>
-        <w:trPr>
-          <w:cantSplit/>
-        </w:trPr>
-        <w:tc>
-          <w:tcPr>
-            <w:tcW w:type="dxa" w:w="2608"/>
-            <w:vAlign w:val="top"/>
-            <w:tcBorders>
-              <w:bottom w:val="single" w:sz="4" w:space="4" w:color="E0E0E0"/>
-            </w:tcBorders>
-          </w:tcPr>
-          <w:p>
-            <w:pPr>
-              <w:spacing w:before="40" w:after="40" w:line="264" w:lineRule="auto"/>
-            </w:pPr>
-            <w:r>
-              <w:rPr>
-                <w:rFonts w:ascii="Arial" w:hAnsi="Arial"/>
-                <w:b/>
-                <w:color w:val="1A1A1A"/>
-                <w:sz w:val="18"/>
-              </w:rPr>
-              <w:t>After moving settings the presets point to wrong places</w:t>
-            </w:r>
-          </w:p>
-        </w:tc>
-        <w:tc>
-          <w:tcPr>
-            <w:tcW w:type="dxa" w:w="3061"/>
-            <w:vAlign w:val="top"/>
-            <w:tcBorders>
-              <w:bottom w:val="single" w:sz="4" w:space="4" w:color="E0E0E0"/>
-            </w:tcBorders>
-          </w:tcPr>
-          <w:p>
-            <w:pPr>
-              <w:spacing w:before="40" w:after="40" w:line="264" w:lineRule="auto"/>
-            </w:pPr>
-            <w:r>
-              <w:rPr>
-                <w:rFonts w:ascii="Arial" w:hAnsi="Arial"/>
-                <w:b w:val="0"/>
-                <w:color w:val="1A1A1A"/>
-                <w:sz w:val="18"/>
-              </w:rPr>
-              <w:t>exe paths are machine-specific and are not exported</w:t>
-            </w:r>
-          </w:p>
-        </w:tc>
-        <w:tc>
-          <w:tcPr>
-            <w:tcW w:type="dxa" w:w="3969"/>
-            <w:vAlign w:val="top"/>
-            <w:tcBorders>
-              <w:bottom w:val="single" w:sz="4" w:space="4" w:color="E0E0E0"/>
-            </w:tcBorders>
-          </w:tcPr>
-          <w:p>
-            <w:pPr>
-              <w:spacing w:before="40" w:after="40" w:line="264" w:lineRule="auto"/>
-            </w:pPr>
-            <w:r>
-              <w:rPr>
-                <w:rFonts w:ascii="Arial" w:hAnsi="Arial"/>
-                <w:b w:val="0"/>
-                <w:color w:val="1A1A1A"/>
-                <w:sz w:val="18"/>
-              </w:rPr>
-              <w:t>run Rescan on the new machine — presets will be found in the registry</w:t>
-            </w:r>
-          </w:p>
-        </w:tc>
-      </w:tr>
-      <w:tr>
-        <w:trPr>
-          <w:cantSplit/>
-        </w:trPr>
-        <w:tc>
-          <w:tcPr>
-            <w:tcW w:type="dxa" w:w="2608"/>
-            <w:vAlign w:val="top"/>
-            <w:tcBorders>
-              <w:bottom w:val="single" w:sz="8" w:space="4" w:color="000000"/>
-            </w:tcBorders>
-          </w:tcPr>
-          <w:p>
-            <w:pPr>
-              <w:spacing w:before="40" w:after="40" w:line="264" w:lineRule="auto"/>
-            </w:pPr>
-            <w:r>
-              <w:rPr>
-                <w:rFonts w:ascii="Arial" w:hAnsi="Arial"/>
-                <w:b/>
-                <w:color w:val="1A1A1A"/>
-                <w:sz w:val="18"/>
-              </w:rPr>
-              <w:t>The Restart and install button never appears</w:t>
-            </w:r>
-          </w:p>
-        </w:tc>
-        <w:tc>
-          <w:tcPr>
-            <w:tcW w:type="dxa" w:w="3061"/>
-            <w:vAlign w:val="top"/>
-            <w:tcBorders>
-              <w:bottom w:val="single" w:sz="8" w:space="4" w:color="000000"/>
-            </w:tcBorders>
-          </w:tcPr>
-          <w:p>
-            <w:pPr>
-              <w:spacing w:before="40" w:after="40" w:line="264" w:lineRule="auto"/>
-            </w:pPr>
-            <w:r>
-              <w:rPr>
-                <w:rFonts w:ascii="Arial" w:hAnsi="Arial"/>
-                <w:b w:val="0"/>
-                <w:color w:val="1A1A1A"/>
-                <w:sz w:val="18"/>
-              </w:rPr>
-              <w:t>the version is already current, the check is disabled, or the download is still running</w:t>
-            </w:r>
-          </w:p>
-        </w:tc>
-        <w:tc>
-          <w:tcPr>
-            <w:tcW w:type="dxa" w:w="3969"/>
-            <w:vAlign w:val="top"/>
-            <w:tcBorders>
-              <w:bottom w:val="single" w:sz="8" w:space="4" w:color="000000"/>
-            </w:tcBorders>
-          </w:tcPr>
-          <w:p>
-            <w:pPr>
-              <w:spacing w:before="40" w:after="40" w:line="264" w:lineRule="auto"/>
-            </w:pPr>
-            <w:r>
-              <w:rPr>
-                <w:rFonts w:ascii="Arial" w:hAnsi="Arial"/>
-                <w:b w:val="0"/>
-                <w:color w:val="1A1A1A"/>
-                <w:sz w:val="18"/>
-              </w:rPr>
-              <w:t>look for Update lines in the log: Up to date means the version is fresh; the Check for updates on start checkbox turns the check on</w:t>
             </w:r>
           </w:p>
         </w:tc>

</xml_diff>

<commit_message>
docs: v2.5.5 - What's New (EN+RU, deduped), manuals, roadmap, gif scenario
</commit_message>
<xml_diff>
--- a/docs/FLOMASTER_Manual_EN.docx
+++ b/docs/FLOMASTER_Manual_EN.docx
@@ -104,7 +104,7 @@
                 <w:sz w:val="18"/>
                 <w:spacing w:val="60"/>
               </w:rPr>
-              <w:t>V2.5  -  WINDOWS 10/11</w:t>
+              <w:t>V2.5.5  -  WINDOWS 10/11</w:t>
             </w:r>
           </w:p>
           <w:p>
@@ -364,7 +364,7 @@
         <w:tab/>
       </w:r>
       <w:r>
-        <w:t>5</w:t>
+        <w:t>6</w:t>
       </w:r>
     </w:p>
     <w:p>
@@ -454,7 +454,7 @@
         <w:tab/>
       </w:r>
       <w:r>
-        <w:t>7</w:t>
+        <w:t>8</w:t>
       </w:r>
     </w:p>
     <w:p>
@@ -508,7 +508,7 @@
         <w:tab/>
       </w:r>
       <w:r>
-        <w:t>8</w:t>
+        <w:t>9</w:t>
       </w:r>
     </w:p>
     <w:p>
@@ -1611,7 +1611,7 @@
           <w:color w:val="1A1A1A"/>
           <w:sz w:val="19"/>
         </w:rPr>
-        <w:t>Ctrl+Alt+F opens the launcher over every window: color config, applications, projects, profiles, roles and recent files — on one screen. Ctrl+Alt+F again or Esc closes the dashboard.</w:t>
+        <w:t>Ctrl+Alt+F opens the launcher over every window: color config, applications, projects, profiles, roles, recent files and settings — on one screen. Ctrl+Alt+F again or Esc closes the dashboard. The dashboard carries the full launcher functionality: configs, applications, profiles, project folders and settings are managed right here.</w:t>
       </w:r>
     </w:p>
     <w:p>
@@ -1625,7 +1625,7 @@
           <w:color w:val="1A1A1A"/>
           <w:sz w:val="19"/>
         </w:rPr>
-        <w:t>COLOR CONFIG: click a chip to switch the config for all subsequent launches;</w:t>
+        <w:t>COLOR CONFIG: click a chip to switch the config; + and − in the section header add and remove configs;</w:t>
       </w:r>
     </w:p>
     <w:p>
@@ -1639,7 +1639,7 @@
           <w:color w:val="1A1A1A"/>
           <w:sz w:val="19"/>
         </w:rPr>
-        <w:t>APPLICATIONS: tiles with real exe icons, click = launch;</w:t>
+        <w:t>APPLICATIONS: tiles with real exe icons, click = launch; right-click a tile to launch with a command preset (clean start, background render, etc.) or to save a profile; + and rescan in the section header;</w:t>
       </w:r>
     </w:p>
     <w:p>
@@ -1653,7 +1653,7 @@
           <w:color w:val="1A1A1A"/>
           <w:sz w:val="19"/>
         </w:rPr>
-        <w:t>PROJECTS: root chips and project files, a click opens the file in the matching application;</w:t>
+        <w:t>PROJECTS: root chips and project files, a click opens the file in the matching application; + adds a folder, right-click a root chip removes it;</w:t>
       </w:r>
     </w:p>
     <w:p>
@@ -1667,7 +1667,7 @@
           <w:color w:val="1A1A1A"/>
           <w:sz w:val="19"/>
         </w:rPr>
-        <w:t>PROFILES: a click applies the profile and launches the application;</w:t>
+        <w:t>RUNNING: chips of live DCC instances next to the search; click brings the app forward, right-click offers focus and restart;</w:t>
       </w:r>
     </w:p>
     <w:p>
@@ -1681,7 +1681,7 @@
           <w:color w:val="1A1A1A"/>
           <w:sz w:val="19"/>
         </w:rPr>
-        <w:t>OCIO ROLES: clicking a role opens the colorspace picker, Reset returns the config values;</w:t>
+        <w:t>PROFILES: a click applies the profile and launches the application; "Save current as profile" in the section header;</w:t>
       </w:r>
     </w:p>
     <w:p>
@@ -1695,7 +1695,7 @@
           <w:color w:val="1A1A1A"/>
           <w:sz w:val="19"/>
         </w:rPr>
-        <w:t>RECENT FILES: recent files, a click reopens them;</w:t>
+        <w:t>OCIO ROLES: clicking a role slides in a right-hand drawer with a family-grouped colorspace tree and search, Reset returns the config values;</w:t>
       </w:r>
     </w:p>
     <w:p>
@@ -1709,7 +1709,7 @@
           <w:color w:val="1A1A1A"/>
           <w:sz w:val="19"/>
         </w:rPr>
-        <w:t>ARGUMENTS: arguments applied to launches (including from the dashboard);</w:t>
+        <w:t>RECENT FILES: recent files, a click reopens them; Clear empties the list;</w:t>
       </w:r>
     </w:p>
     <w:p>
@@ -1723,7 +1723,7 @@
           <w:color w:val="1A1A1A"/>
           <w:sz w:val="19"/>
         </w:rPr>
-        <w:t>SETTINGS: theme, always-on-top mode and the hotkey.</w:t>
+        <w:t>SETTINGS (footer): THEME (theme, default config), BEHAVIOUR (hotkey, startup and always-on-top modes), MAINTENANCE (rescan, scan paths, SYNC, shortcuts, log).</w:t>
       </w:r>
     </w:p>
     <w:p>
@@ -1734,7 +1734,18 @@
           <w:color w:val="1A1A1A"/>
           <w:sz w:val="19"/>
         </w:rPr>
-        <w:t>The dashboard opens on the monitor where it was last closed (remembered in the settings) and can be dragged between monitors by its header — sizes adapt to each monitor. If you do not need it above other windows — untick Overlay on top in the dashboard settings.</w:t>
+        <w:t>The search box filters everything on the fly: Enter launches the first match, the Up/Down arrows walk the visible tiles. The Log chip pulls up a log drawer at the bottom (last 200 entries, text is copyable).</w:t>
+      </w:r>
+    </w:p>
+    <w:p>
+      <w:r>
+        <w:rPr>
+          <w:rFonts w:ascii="Arial" w:hAnsi="Arial"/>
+          <w:i w:val="0"/>
+          <w:color w:val="1A1A1A"/>
+          <w:sz w:val="19"/>
+        </w:rPr>
+        <w:t>The dashboard opens on the monitor where it was last closed (remembered in the settings) and can be dragged between monitors by its header — sizes adapt to each monitor. If you do not need it above other windows — untick Dashboard on top. The Start with dashboard toggle makes the launcher open with the fullscreen dashboard.</w:t>
       </w:r>
     </w:p>
     <w:p>
@@ -1828,7 +1839,7 @@
           <w:color w:val="1A1A1A"/>
           <w:sz w:val="19"/>
         </w:rPr>
-        <w:t>clicking a role row opens the picker: colorspaces grouped by family, like the Color Space menu in Blender, with search;</w:t>
+        <w:t>clicking a role row slides in a right-hand drawer: colorspaces as a family-grouped tree, like the Color Space menu in Blender, with search; a query switches the list to flat matches;</w:t>
       </w:r>
     </w:p>
     <w:p>
@@ -2835,6 +2846,17 @@
       </w:r>
       <w:bookmarkEnd w:id="100016"/>
     </w:p>
+    <w:p>
+      <w:r>
+        <w:rPr>
+          <w:rFonts w:ascii="Arial" w:hAnsi="Arial"/>
+          <w:i w:val="0"/>
+          <w:color w:val="1A1A1A"/>
+          <w:sz w:val="19"/>
+        </w:rPr>
+        <w:t>The small window collects settings in the Settings panel; the dashboard footer groups them into three blocks: THEME (theme and the default config), BEHAVIOUR (hotkey, startup and always-on-top modes), MAINTENANCE (rescan, scan paths, SYNC, shortcuts, log).</w:t>
+      </w:r>
+    </w:p>
     <w:tbl>
       <w:tblPr>
         <w:tblW w:type="auto" w:w="0"/>
@@ -3055,7 +3077,58 @@
                 <w:color w:val="1A1A1A"/>
                 <w:sz w:val="18"/>
               </w:rPr>
-              <w:t>auto-start minimized to tray with Windows</w:t>
+              <w:t>auto-start with Windows</w:t>
+            </w:r>
+          </w:p>
+        </w:tc>
+      </w:tr>
+      <w:tr>
+        <w:trPr>
+          <w:cantSplit/>
+        </w:trPr>
+        <w:tc>
+          <w:tcPr>
+            <w:tcW w:type="dxa" w:w="3402"/>
+            <w:vAlign w:val="top"/>
+            <w:tcBorders>
+              <w:bottom w:val="single" w:sz="4" w:space="4" w:color="E0E0E0"/>
+            </w:tcBorders>
+          </w:tcPr>
+          <w:p>
+            <w:pPr>
+              <w:spacing w:before="40" w:after="40" w:line="264" w:lineRule="auto"/>
+            </w:pPr>
+            <w:r>
+              <w:rPr>
+                <w:rFonts w:ascii="Arial" w:hAnsi="Arial"/>
+                <w:b/>
+                <w:color w:val="1A1A1A"/>
+                <w:sz w:val="18"/>
+              </w:rPr>
+              <w:t>Start with dashboard</w:t>
+            </w:r>
+          </w:p>
+        </w:tc>
+        <w:tc>
+          <w:tcPr>
+            <w:tcW w:type="dxa" w:w="6236"/>
+            <w:vAlign w:val="top"/>
+            <w:tcBorders>
+              <w:bottom w:val="single" w:sz="4" w:space="4" w:color="E0E0E0"/>
+            </w:tcBorders>
+          </w:tcPr>
+          <w:p>
+            <w:pPr>
+              <w:spacing w:before="40" w:after="40" w:line="264" w:lineRule="auto"/>
+            </w:pPr>
+            <w:r>
+              <w:rPr>
+                <w:rFonts w:ascii="Arial" w:hAnsi="Arial"/>
+                <w:b w:val="0"/>
+                <w:color w:val="1A1A1A"/>
+                <w:sz w:val="18"/>
+              </w:rPr>
+              <w:t>open with the fullscreen dashboard at startup</w:t>
             </w:r>
           </w:p>
         </w:tc>
@@ -3106,7 +3179,7 @@
                 <w:color w:val="1A1A1A"/>
                 <w:sz w:val="18"/>
               </w:rPr>
-              <w:t>window above all others</w:t>
+              <w:t>the small launcher window above all others</w:t>
             </w:r>
           </w:p>
         </w:tc>
@@ -3134,7 +3207,7 @@
                 <w:color w:val="1A1A1A"/>
                 <w:sz w:val="18"/>
               </w:rPr>
-              <w:t>Overlay on top</w:t>
+              <w:t>Dashboard on top</w:t>
             </w:r>
           </w:p>
         </w:tc>
@@ -3236,7 +3309,58 @@
                 <w:color w:val="1A1A1A"/>
                 <w:sz w:val="18"/>
               </w:rPr>
-              <w:t>Smooth animation</w:t>
+              <w:t>Hotkey opens dashboard</w:t>
+            </w:r>
+          </w:p>
+        </w:tc>
+        <w:tc>
+          <w:tcPr>
+            <w:tcW w:type="dxa" w:w="6236"/>
+            <w:vAlign w:val="top"/>
+            <w:tcBorders>
+              <w:bottom w:val="single" w:sz="4" w:space="4" w:color="E0E0E0"/>
+            </w:tcBorders>
+          </w:tcPr>
+          <w:p>
+            <w:pPr>
+              <w:spacing w:before="40" w:after="40" w:line="264" w:lineRule="auto"/>
+            </w:pPr>
+            <w:r>
+              <w:rPr>
+                <w:rFonts w:ascii="Arial" w:hAnsi="Arial"/>
+                <w:b w:val="0"/>
+                <w:color w:val="1A1A1A"/>
+                <w:sz w:val="18"/>
+              </w:rPr>
+              <w:t>what the hotkey opens: the dashboard or the small window</w:t>
+            </w:r>
+          </w:p>
+        </w:tc>
+      </w:tr>
+      <w:tr>
+        <w:trPr>
+          <w:cantSplit/>
+        </w:trPr>
+        <w:tc>
+          <w:tcPr>
+            <w:tcW w:type="dxa" w:w="3402"/>
+            <w:vAlign w:val="top"/>
+            <w:tcBorders>
+              <w:bottom w:val="single" w:sz="4" w:space="4" w:color="E0E0E0"/>
+            </w:tcBorders>
+          </w:tcPr>
+          <w:p>
+            <w:pPr>
+              <w:spacing w:before="40" w:after="40" w:line="264" w:lineRule="auto"/>
+            </w:pPr>
+            <w:r>
+              <w:rPr>
+                <w:rFonts w:ascii="Arial" w:hAnsi="Arial"/>
+                <w:b/>
+                <w:color w:val="1A1A1A"/>
+                <w:sz w:val="18"/>
+              </w:rPr>
+              <w:t>Launcher animation</w:t>
             </w:r>
           </w:p>
         </w:tc>
@@ -3511,7 +3635,7 @@
           <w:color w:val="1A1A1A"/>
           <w:sz w:val="19"/>
         </w:rPr>
-        <w:t>Closing the window minimizes the launcher to the system tray - it keeps running. The tray menu offers quick launch of presets, a PROFILES section (one-click profile launches) and the window itself.</w:t>
+        <w:t>Closing the window minimizes the launcher to the system tray - it keeps running. The tray menu offers quick launch of presets, a PROFILES section (one-click profile launches) and the window itself. Quit — in the tray menu.</w:t>
       </w:r>
     </w:p>
     <w:p>
@@ -3522,7 +3646,7 @@
           <w:color w:val="1A1A1A"/>
           <w:sz w:val="19"/>
         </w:rPr>
-        <w:t>The Log button opens the log window beside the launcher (same height, to the left or right - wherever it fits). Every launch is logged: timestamp, user, application, OCIO config, exit code. A "Set OCIO=..." line marks that the config was actually passed. The log file lives at %APPDATA%\FLOMASTER\flomaster.log.</w:t>
+        <w:t>In the dashboard the Log chip pulls up a log drawer (last 200 entries, copyable text). In the small window the Log button opens the log window beside the launcher. Every launch is logged: timestamp, user, application, OCIO config, exit code. A "Set OCIO=..." line marks that the config was actually passed. The log file lives at %APPDATA%\FLOMASTER\flomaster.log.</w:t>
       </w:r>
     </w:p>
     <w:p>

</xml_diff>

<commit_message>
manual v2.6.1: NukeX flag and native icon, Nuke OCIO note
</commit_message>
<xml_diff>
--- a/docs/FLOMASTER_Manual_EN.docx
+++ b/docs/FLOMASTER_Manual_EN.docx
@@ -104,7 +104,7 @@
                 <w:sz w:val="18"/>
                 <w:spacing w:val="60"/>
               </w:rPr>
-              <w:t>V2.5.5  -  WINDOWS 10/11</w:t>
+              <w:t>V2.6.1  -  WINDOWS 10/11</w:t>
             </w:r>
           </w:p>
           <w:p>
@@ -292,7 +292,7 @@
         <w:tab/>
       </w:r>
       <w:r>
-        <w:t>4</w:t>
+        <w:t>5</w:t>
       </w:r>
     </w:p>
     <w:p>
@@ -328,7 +328,7 @@
         <w:tab/>
       </w:r>
       <w:r>
-        <w:t>5</w:t>
+        <w:t>6</w:t>
       </w:r>
     </w:p>
     <w:p>
@@ -346,7 +346,7 @@
         <w:tab/>
       </w:r>
       <w:r>
-        <w:t>5</w:t>
+        <w:t>6</w:t>
       </w:r>
     </w:p>
     <w:p>
@@ -400,7 +400,7 @@
         <w:tab/>
       </w:r>
       <w:r>
-        <w:t>6</w:t>
+        <w:t>7</w:t>
       </w:r>
     </w:p>
     <w:p>
@@ -436,7 +436,7 @@
         <w:tab/>
       </w:r>
       <w:r>
-        <w:t>7</w:t>
+        <w:t>8</w:t>
       </w:r>
     </w:p>
     <w:p>
@@ -490,7 +490,7 @@
         <w:tab/>
       </w:r>
       <w:r>
-        <w:t>8</w:t>
+        <w:t>9</w:t>
       </w:r>
     </w:p>
     <w:p>
@@ -577,7 +577,7 @@
           <w:color w:val="1A1A1A"/>
           <w:sz w:val="19"/>
         </w:rPr>
-        <w:t>auto-scan of installed applications from the Windows registry, Epic Games manifests and file search — Blender, K-Cycles, Maya, Houdini, Nuke, DaVinci Resolve, Unreal Engine, Substance Painter;</w:t>
+        <w:t>auto-scan of installed applications from the Windows registry, Epic Games manifests and file search — Blender, K-Cycles, Maya, Houdini, Nuke and NukeX, DaVinci Resolve, Unreal Engine, Substance Painter;</w:t>
       </w:r>
     </w:p>
     <w:p>
@@ -977,6 +977,112 @@
                 <w:color w:val="1A1A1A"/>
                 <w:sz w:val="18"/>
               </w:rPr>
+              <w:t>Update banner</w:t>
+            </w:r>
+          </w:p>
+        </w:tc>
+        <w:tc>
+          <w:tcPr>
+            <w:tcW w:type="dxa" w:w="6803"/>
+            <w:vAlign w:val="top"/>
+            <w:tcBorders>
+              <w:bottom w:val="single" w:sz="4" w:space="4" w:color="E0E0E0"/>
+            </w:tcBorders>
+          </w:tcPr>
+          <w:p>
+            <w:pPr>
+              <w:keepNext/>
+              <w:spacing w:before="40" w:after="40" w:line="264" w:lineRule="auto"/>
+            </w:pPr>
+            <w:r>
+              <w:rPr>
+                <w:rFonts w:ascii="Arial" w:hAnsi="Arial"/>
+                <w:b w:val="0"/>
+                <w:color w:val="1A1A1A"/>
+                <w:sz w:val="18"/>
+              </w:rPr>
+              <w:t>an accent banner in the header of both windows appears as soon as an update is found: live progress with percent and a What's new button</w:t>
+            </w:r>
+          </w:p>
+        </w:tc>
+      </w:tr>
+      <w:tr>
+        <w:trPr>
+          <w:cantSplit/>
+        </w:trPr>
+        <w:tc>
+          <w:tcPr>
+            <w:tcW w:type="dxa" w:w="2835"/>
+            <w:vAlign w:val="top"/>
+            <w:tcBorders>
+              <w:bottom w:val="single" w:sz="4" w:space="4" w:color="E0E0E0"/>
+            </w:tcBorders>
+          </w:tcPr>
+          <w:p>
+            <w:pPr>
+              <w:keepNext/>
+              <w:spacing w:before="40" w:after="40" w:line="264" w:lineRule="auto"/>
+            </w:pPr>
+            <w:r>
+              <w:rPr>
+                <w:rFonts w:ascii="Arial" w:hAnsi="Arial"/>
+                <w:b/>
+                <w:color w:val="1A1A1A"/>
+                <w:sz w:val="18"/>
+              </w:rPr>
+              <w:t>Release notes</w:t>
+            </w:r>
+          </w:p>
+        </w:tc>
+        <w:tc>
+          <w:tcPr>
+            <w:tcW w:type="dxa" w:w="6803"/>
+            <w:vAlign w:val="top"/>
+            <w:tcBorders>
+              <w:bottom w:val="single" w:sz="4" w:space="4" w:color="E0E0E0"/>
+            </w:tcBorders>
+          </w:tcPr>
+          <w:p>
+            <w:pPr>
+              <w:keepNext/>
+              <w:spacing w:before="40" w:after="40" w:line="264" w:lineRule="auto"/>
+            </w:pPr>
+            <w:r>
+              <w:rPr>
+                <w:rFonts w:ascii="Arial" w:hAnsi="Arial"/>
+                <w:b w:val="0"/>
+                <w:color w:val="1A1A1A"/>
+                <w:sz w:val="18"/>
+              </w:rPr>
+              <w:t>What's new reveals the update description: on wide screens a dedicated panel in the free space on the left (full-height text, progress inside), on narrow ones an in-banner expansion; Full notes on GitHub opens the release page</w:t>
+            </w:r>
+          </w:p>
+        </w:tc>
+      </w:tr>
+      <w:tr>
+        <w:trPr>
+          <w:cantSplit/>
+        </w:trPr>
+        <w:tc>
+          <w:tcPr>
+            <w:tcW w:type="dxa" w:w="2835"/>
+            <w:vAlign w:val="top"/>
+            <w:tcBorders>
+              <w:bottom w:val="single" w:sz="4" w:space="4" w:color="E0E0E0"/>
+            </w:tcBorders>
+          </w:tcPr>
+          <w:p>
+            <w:pPr>
+              <w:keepNext/>
+              <w:spacing w:before="40" w:after="40" w:line="264" w:lineRule="auto"/>
+            </w:pPr>
+            <w:r>
+              <w:rPr>
+                <w:rFonts w:ascii="Arial" w:hAnsi="Arial"/>
+                <w:b/>
+                <w:color w:val="1A1A1A"/>
+                <w:sz w:val="18"/>
+              </w:rPr>
               <w:t>Background download</w:t>
             </w:r>
           </w:p>
@@ -1001,7 +1107,7 @@
                 <w:color w:val="1A1A1A"/>
                 <w:sz w:val="18"/>
               </w:rPr>
-              <w:t>the new exe is downloaded to a temp folder, progress is visible in Settings</w:t>
+              <w:t>the update downloads in full (exe + the ocio folder) into a temp folder</w:t>
             </w:r>
           </w:p>
         </w:tc>
@@ -1124,7 +1230,7 @@
           <w:color w:val="1A1A1A"/>
           <w:sz w:val="19"/>
         </w:rPr>
-        <w:t>Only the exe is updated: settings, profiles and the log in %APPDATA% stay exactly as they were. Nothing is installed until you press the button — the download is a background operation with no side effects.</w:t>
+        <w:t>The whole package is updated: the exe and the ocio folder. Settings, profiles and the log in %APPDATA% stay exactly as they were. Nothing is installed until you press the button — the download is a background operation with no side effects.</w:t>
       </w:r>
     </w:p>
     <w:p>
@@ -1571,6 +1677,20 @@
           <w:color w:val="1A1A1A"/>
           <w:sz w:val="19"/>
         </w:rPr>
+        <w:t>the A-Z / Date / Apps chips in the section header sort the list; clicking the active Apps chip again rotates the app groups — all .spp files (or any other family) jump to the top in one click, groups with no files do not waste clicks;</w:t>
+      </w:r>
+    </w:p>
+    <w:p>
+      <w:pPr>
+        <w:pStyle w:val="ListBullet"/>
+      </w:pPr>
+      <w:r>
+        <w:rPr>
+          <w:rFonts w:ascii="Arial" w:hAnsi="Arial"/>
+          <w:i w:val="0"/>
+          <w:color w:val="1A1A1A"/>
+          <w:sz w:val="19"/>
+        </w:rPr>
         <w:t>Recent — the same rule: recent files reopen in their applications.</w:t>
       </w:r>
     </w:p>
@@ -1626,6 +1746,20 @@
           <w:sz w:val="19"/>
         </w:rPr>
         <w:t>COLOR CONFIG: click a chip to switch the config; + and − in the section header add and remove configs;</w:t>
+      </w:r>
+    </w:p>
+    <w:p>
+      <w:pPr>
+        <w:pStyle w:val="ListBullet"/>
+      </w:pPr>
+      <w:r>
+        <w:rPr>
+          <w:rFonts w:ascii="Arial" w:hAnsi="Arial"/>
+          <w:i w:val="0"/>
+          <w:color w:val="1A1A1A"/>
+          <w:sz w:val="19"/>
+        </w:rPr>
+        <w:t>the NO OCIO chip (first in the list) launches applications in their default color management, without OCIO; pin it in a profile or make it the default config;</w:t>
       </w:r>
     </w:p>
     <w:p>
@@ -1723,7 +1857,21 @@
           <w:color w:val="1A1A1A"/>
           <w:sz w:val="19"/>
         </w:rPr>
-        <w:t>SETTINGS (footer): THEME (theme, default config), BEHAVIOUR (hotkey, startup and always-on-top modes), MAINTENANCE (rescan, scan paths, SYNC, shortcuts, log).</w:t>
+        <w:t>SETTINGS (footer): THEME (theme, default config), BEHAVIOUR (hotkey, startup and always-on-top modes), MAINTENANCE (rescan, scan paths, SYNC, sync folder, shortcuts, log);</w:t>
+      </w:r>
+    </w:p>
+    <w:p>
+      <w:pPr>
+        <w:pStyle w:val="ListBullet"/>
+      </w:pPr>
+      <w:r>
+        <w:rPr>
+          <w:rFonts w:ascii="Arial" w:hAnsi="Arial"/>
+          <w:i w:val="0"/>
+          <w:color w:val="1A1A1A"/>
+          <w:sz w:val="19"/>
+        </w:rPr>
+        <w:t>the header switcher (the icon left of "minimize") swaps the fullscreen dashboard and the small window — the same item lives in the tray; Ctrl+Alt+F always toggles what you see;</w:t>
       </w:r>
     </w:p>
     <w:p>
@@ -1734,7 +1882,7 @@
           <w:color w:val="1A1A1A"/>
           <w:sz w:val="19"/>
         </w:rPr>
-        <w:t>The search box filters everything on the fly: Enter launches the first match, the Up/Down arrows walk the visible tiles. The Log chip pulls up a log drawer at the bottom (last 200 entries, text is copyable).</w:t>
+        <w:t>The search box filters everything on the fly: Enter launches the first match, the Up/Down arrows walk the visible tiles. The Log chip pulls up a log drawer at the bottom (last 200 entries, text is copyable). The drawers - log, roles and the update panel - slide in smoothly; the Launcher animation toggle restores instant appearance.</w:t>
       </w:r>
     </w:p>
     <w:p>
@@ -2104,6 +2252,17 @@
       <w:pPr>
         <w:spacing w:after="80" w:line="240" w:lineRule="auto"/>
       </w:pPr>
+    </w:p>
+    <w:p>
+      <w:r>
+        <w:rPr>
+          <w:rFonts w:ascii="Arial" w:hAnsi="Arial"/>
+          <w:i w:val="0"/>
+          <w:color w:val="1A1A1A"/>
+          <w:sz w:val="19"/>
+        </w:rPr>
+        <w:t>Nuke: the variable provides and locks the config - Nuke shows "OCIO environment variable is set" and disables switching configs from inside. The project color-management mode lives in the script itself: in a new .nk set Project Settings → Color → color management to OCIO once. Since Nuke 16, Nuke, NukeX and Studio ship as one binary - the launcher shows both tiles; NukeX runs via the --nukex flag and carries its native icon.</w:t>
+      </w:r>
     </w:p>
     <w:p>
       <w:r>
@@ -4015,7 +4174,18 @@
           <w:color w:val="1A1A1A"/>
           <w:sz w:val="19"/>
         </w:rPr>
-        <w:t>Settings travel as a file: Settings → SYNC → Export settings saves profiles, project roots, theme and options into a flomaster_setup_date.flomaster file. On another machine: install the launcher, press Import settings and pick the file.</w:t>
+        <w:t>Manual transfer: Settings → SYNC → Export settings saves profiles, project roots, theme and options into a flomaster_setup_date.flomaster file. On another machine: install the launcher, press Import settings and pick the file.</w:t>
+      </w:r>
+    </w:p>
+    <w:p>
+      <w:r>
+        <w:rPr>
+          <w:rFonts w:ascii="Arial" w:hAnsi="Arial"/>
+          <w:i w:val="0"/>
+          <w:color w:val="1A1A1A"/>
+          <w:sz w:val="19"/>
+        </w:rPr>
+        <w:t>The sync folder transfers settings hands-free. In MAINTENANCE press Sync folder and pick any folder your Dropbox/OneDrive/NAS keeps in sync across machines. Your own FLOMASTER_&lt;pc-name&gt;.flomaster file is written there automatically whenever settings change; other machines' files are offered as an Import chip and apply only on your click. Profiles, project roots, theme and behaviour flags travel; exe and OCIO paths stay machine-local.</w:t>
       </w:r>
     </w:p>
     <w:p>

</xml_diff>

<commit_message>
manual v2.6.2: EN layout option row, version bump
</commit_message>
<xml_diff>
--- a/docs/FLOMASTER_Manual_EN.docx
+++ b/docs/FLOMASTER_Manual_EN.docx
@@ -104,7 +104,7 @@
                 <w:sz w:val="18"/>
                 <w:spacing w:val="60"/>
               </w:rPr>
-              <w:t>V2.6.1  -  WINDOWS 10/11</w:t>
+              <w:t>V2.6.2  -  WINDOWS 10/11</w:t>
             </w:r>
           </w:p>
           <w:p>
@@ -418,7 +418,7 @@
         <w:tab/>
       </w:r>
       <w:r>
-        <w:t>7</w:t>
+        <w:t>8</w:t>
       </w:r>
     </w:p>
     <w:p>
@@ -472,7 +472,7 @@
         <w:tab/>
       </w:r>
       <w:r>
-        <w:t>8</w:t>
+        <w:t>9</w:t>
       </w:r>
     </w:p>
     <w:p>
@@ -3468,6 +3468,57 @@
                 <w:color w:val="1A1A1A"/>
                 <w:sz w:val="18"/>
               </w:rPr>
+              <w:t>Auto EN keyboard layout (Houdini, Maya)</w:t>
+            </w:r>
+          </w:p>
+        </w:tc>
+        <w:tc>
+          <w:tcPr>
+            <w:tcW w:type="dxa" w:w="6236"/>
+            <w:vAlign w:val="top"/>
+            <w:tcBorders>
+              <w:bottom w:val="single" w:sz="4" w:space="4" w:color="E0E0E0"/>
+            </w:tcBorders>
+          </w:tcPr>
+          <w:p>
+            <w:pPr>
+              <w:spacing w:before="40" w:after="40" w:line="264" w:lineRule="auto"/>
+            </w:pPr>
+            <w:r>
+              <w:rPr>
+                <w:rFonts w:ascii="Arial" w:hAnsi="Arial"/>
+                <w:b w:val="0"/>
+                <w:color w:val="1A1A1A"/>
+                <w:sz w:val="18"/>
+              </w:rPr>
+              <w:t>switches the keyboard to English automatically when entering Houdini/Maya (a Russian layout breaks DCC hotkeys); Alt+Shift inside the app still works</w:t>
+            </w:r>
+          </w:p>
+        </w:tc>
+      </w:tr>
+      <w:tr>
+        <w:trPr>
+          <w:cantSplit/>
+        </w:trPr>
+        <w:tc>
+          <w:tcPr>
+            <w:tcW w:type="dxa" w:w="3402"/>
+            <w:vAlign w:val="top"/>
+            <w:tcBorders>
+              <w:bottom w:val="single" w:sz="4" w:space="4" w:color="E0E0E0"/>
+            </w:tcBorders>
+          </w:tcPr>
+          <w:p>
+            <w:pPr>
+              <w:spacing w:before="40" w:after="40" w:line="264" w:lineRule="auto"/>
+            </w:pPr>
+            <w:r>
+              <w:rPr>
+                <w:rFonts w:ascii="Arial" w:hAnsi="Arial"/>
+                <w:b/>
+                <w:color w:val="1A1A1A"/>
+                <w:sz w:val="18"/>
+              </w:rPr>
               <w:t>Hotkey opens dashboard</w:t>
             </w:r>
           </w:p>

</xml_diff>